<commit_message>
updated CV for paper under reviews
</commit_message>
<xml_diff>
--- a/CV_baishen_liang.docx
+++ b/CV_baishen_liang.docx
@@ -2366,15 +2366,33 @@
           <w:sz w:val="22"/>
           <w:szCs w:val="22"/>
         </w:rPr>
-        <w:t xml:space="preserve">a TMS experiment, </w:t>
-      </w:r>
-      <w:r>
-        <w:rPr>
-          <w:rFonts w:ascii="Arial" w:hAnsi="Arial" w:cs="Arial"/>
-          <w:sz w:val="22"/>
-          <w:szCs w:val="22"/>
-        </w:rPr>
-        <w:t xml:space="preserve">and </w:t>
+        <w:t xml:space="preserve">a TMS </w:t>
+      </w:r>
+      <w:proofErr w:type="gramStart"/>
+      <w:r>
+        <w:rPr>
+          <w:rFonts w:ascii="Arial" w:hAnsi="Arial" w:cs="Arial" w:hint="eastAsia"/>
+          <w:sz w:val="22"/>
+          <w:szCs w:val="22"/>
+        </w:rPr>
+        <w:t xml:space="preserve">experiment, </w:t>
+      </w:r>
+      <w:r>
+        <w:rPr>
+          <w:rFonts w:ascii="Arial" w:hAnsi="Arial" w:cs="Arial"/>
+          <w:sz w:val="22"/>
+          <w:szCs w:val="22"/>
+        </w:rPr>
+        <w:t>and</w:t>
+      </w:r>
+      <w:proofErr w:type="gramEnd"/>
+      <w:r>
+        <w:rPr>
+          <w:rFonts w:ascii="Arial" w:hAnsi="Arial" w:cs="Arial"/>
+          <w:sz w:val="22"/>
+          <w:szCs w:val="22"/>
+        </w:rPr>
+        <w:t xml:space="preserve"> </w:t>
       </w:r>
       <w:r>
         <w:rPr>
@@ -2844,6 +2862,7 @@
         </w:rPr>
         <w:t>comprehension</w:t>
       </w:r>
+      <w:proofErr w:type="gramStart"/>
       <w:r>
         <w:rPr>
           <w:rFonts w:ascii="Arial" w:eastAsiaTheme="minorEastAsia" w:hAnsi="Arial" w:cs="Arial" w:hint="eastAsia"/>
@@ -2851,6 +2870,7 @@
         </w:rPr>
         <w:t>.</w:t>
       </w:r>
+      <w:proofErr w:type="gramEnd"/>
     </w:p>
     <w:p>
       <w:pPr>
@@ -2978,33 +2998,33 @@
           <w:bCs/>
           <w:szCs w:val="21"/>
         </w:rPr>
-        <w:t xml:space="preserve">Baishen Liang, </w:t>
-      </w:r>
-      <w:proofErr w:type="spellStart"/>
-      <w:r>
-        <w:rPr>
-          <w:rFonts w:ascii="Arial" w:hAnsi="Arial" w:cs="Arial"/>
-          <w:szCs w:val="21"/>
-        </w:rPr>
-        <w:t>Yanchang</w:t>
-      </w:r>
-      <w:proofErr w:type="spellEnd"/>
-      <w:r>
-        <w:rPr>
-          <w:rFonts w:ascii="Arial" w:hAnsi="Arial" w:cs="Arial"/>
-          <w:szCs w:val="21"/>
-        </w:rPr>
-        <w:t xml:space="preserve"> Li, </w:t>
-      </w:r>
-      <w:proofErr w:type="spellStart"/>
-      <w:r>
-        <w:rPr>
-          <w:rFonts w:ascii="Arial" w:hAnsi="Arial" w:cs="Arial"/>
-          <w:szCs w:val="21"/>
-        </w:rPr>
-        <w:t>Wanying</w:t>
-      </w:r>
-      <w:proofErr w:type="spellEnd"/>
+        <w:t>Liang,</w:t>
+      </w:r>
+      <w:r>
+        <w:rPr>
+          <w:rFonts w:ascii="Arial" w:eastAsiaTheme="minorEastAsia" w:hAnsi="Arial" w:cs="Arial" w:hint="eastAsia"/>
+          <w:b/>
+          <w:bCs/>
+          <w:szCs w:val="21"/>
+          <w:lang w:eastAsia="zh-CN"/>
+        </w:rPr>
+        <w:t xml:space="preserve"> B., </w:t>
+      </w:r>
+      <w:r>
+        <w:rPr>
+          <w:rFonts w:ascii="Arial" w:hAnsi="Arial" w:cs="Arial"/>
+          <w:szCs w:val="21"/>
+        </w:rPr>
+        <w:t>Li,</w:t>
+      </w:r>
+      <w:r>
+        <w:rPr>
+          <w:rFonts w:ascii="Arial" w:eastAsiaTheme="minorEastAsia" w:hAnsi="Arial" w:cs="Arial" w:hint="eastAsia"/>
+          <w:szCs w:val="21"/>
+          <w:lang w:eastAsia="zh-CN"/>
+        </w:rPr>
+        <w:t xml:space="preserve"> Y.,</w:t>
+      </w:r>
       <w:r>
         <w:rPr>
           <w:rFonts w:ascii="Arial" w:hAnsi="Arial" w:cs="Arial"/>
@@ -3014,43 +3034,72 @@
       </w:r>
       <w:r>
         <w:rPr>
-          <w:rFonts w:ascii="Arial" w:hAnsi="Arial" w:cs="Arial"/>
-          <w:b/>
+          <w:rFonts w:ascii="Arial" w:eastAsiaTheme="minorEastAsia" w:hAnsi="Arial" w:cs="Arial" w:hint="eastAsia"/>
+          <w:szCs w:val="21"/>
+          <w:lang w:eastAsia="zh-CN"/>
+        </w:rPr>
+        <w:t xml:space="preserve"> W., </w:t>
+      </w:r>
+      <w:r>
+        <w:rPr>
+          <w:rFonts w:ascii="Arial" w:hAnsi="Arial" w:cs="Arial"/>
           <w:bCs/>
           <w:szCs w:val="21"/>
         </w:rPr>
+        <w:t>Du</w:t>
+      </w:r>
+      <w:r>
+        <w:rPr>
+          <w:rFonts w:ascii="Arial" w:eastAsiaTheme="minorEastAsia" w:hAnsi="Arial" w:cs="Arial" w:hint="eastAsia"/>
+          <w:bCs/>
+          <w:szCs w:val="21"/>
+          <w:lang w:eastAsia="zh-CN"/>
+        </w:rPr>
+        <w:t>, Y.</w:t>
+      </w:r>
+      <w:r>
+        <w:rPr>
+          <w:rFonts w:ascii="Arial" w:hAnsi="Arial" w:cs="Arial"/>
+          <w:bCs/>
+          <w:szCs w:val="21"/>
+        </w:rPr>
+        <w:t>*</w:t>
+      </w:r>
+      <w:r>
+        <w:rPr>
+          <w:rFonts w:ascii="Arial" w:eastAsiaTheme="minorEastAsia" w:hAnsi="Arial" w:cs="Arial" w:hint="eastAsia"/>
+          <w:bCs/>
+          <w:szCs w:val="21"/>
+          <w:lang w:eastAsia="zh-CN"/>
+        </w:rPr>
+        <w:t xml:space="preserve"> (2023).</w:t>
+      </w:r>
+      <w:r>
+        <w:rPr>
+          <w:rFonts w:ascii="Arial" w:hAnsi="Arial" w:cs="Arial"/>
+          <w:szCs w:val="21"/>
+        </w:rPr>
         <w:t xml:space="preserve"> </w:t>
       </w:r>
       <w:r>
         <w:rPr>
           <w:rFonts w:ascii="Arial" w:hAnsi="Arial" w:cs="Arial"/>
-          <w:bCs/>
-          <w:szCs w:val="21"/>
-        </w:rPr>
-        <w:t>Yi Du</w:t>
-      </w:r>
-      <w:r>
-        <w:rPr>
-          <w:rFonts w:ascii="Arial" w:hAnsi="Arial" w:cs="Arial"/>
-          <w:bCs/>
-          <w:szCs w:val="21"/>
-        </w:rPr>
-        <w:t>*</w:t>
-      </w:r>
-      <w:r>
-        <w:rPr>
-          <w:rFonts w:ascii="Arial" w:hAnsi="Arial" w:cs="Arial"/>
-          <w:b/>
-          <w:bCs/>
-          <w:szCs w:val="21"/>
+        </w:rPr>
+        <w:t xml:space="preserve">Bilateral human laryngeal motor cortex in perceptual decision of lexical tone and voicing of </w:t>
+      </w:r>
+      <w:proofErr w:type="gramStart"/>
+      <w:r>
+        <w:rPr>
+          <w:rFonts w:ascii="Arial" w:hAnsi="Arial" w:cs="Arial"/>
+        </w:rPr>
+        <w:t>consonant</w:t>
+      </w:r>
+      <w:proofErr w:type="gramEnd"/>
+      <w:r>
+        <w:rPr>
+          <w:rFonts w:ascii="Arial" w:hAnsi="Arial" w:cs="Arial"/>
         </w:rPr>
         <w:t xml:space="preserve">. </w:t>
-      </w:r>
-      <w:r>
-        <w:rPr>
-          <w:rFonts w:ascii="Arial" w:hAnsi="Arial" w:cs="Arial"/>
-        </w:rPr>
-        <w:t xml:space="preserve">Bilateral human laryngeal motor cortex in perceptual decision of lexical tone and voicing of consonant. </w:t>
       </w:r>
       <w:r>
         <w:rPr>
@@ -3066,14 +3115,43 @@
         <w:rPr>
           <w:rFonts w:ascii="Arial" w:hAnsi="Arial" w:cs="Arial"/>
         </w:rPr>
-        <w:t xml:space="preserve">, 2023, 14, 4710. </w:t>
-      </w:r>
-      <w:r>
-        <w:rPr>
-          <w:rFonts w:ascii="Arial" w:hAnsi="Arial" w:cs="Arial"/>
-          <w:szCs w:val="21"/>
-        </w:rPr>
-        <w:t>(First author)</w:t>
+        <w:t>,</w:t>
+      </w:r>
+      <w:r>
+        <w:rPr>
+          <w:rFonts w:ascii="Arial" w:eastAsiaTheme="minorEastAsia" w:hAnsi="Arial" w:cs="Arial" w:hint="eastAsia"/>
+          <w:lang w:eastAsia="zh-CN"/>
+        </w:rPr>
+        <w:t xml:space="preserve"> </w:t>
+      </w:r>
+      <w:r>
+        <w:rPr>
+          <w:rFonts w:ascii="Arial" w:hAnsi="Arial" w:cs="Arial"/>
+        </w:rPr>
+        <w:t xml:space="preserve">14, 4710. </w:t>
+      </w:r>
+      <w:r>
+        <w:rPr>
+          <w:rFonts w:ascii="Arial" w:eastAsiaTheme="minorEastAsia" w:hAnsi="Arial" w:cs="Arial" w:hint="eastAsia"/>
+          <w:szCs w:val="21"/>
+          <w:lang w:eastAsia="zh-CN"/>
+        </w:rPr>
+        <w:t>[</w:t>
+      </w:r>
+      <w:r>
+        <w:rPr>
+          <w:rFonts w:ascii="Arial" w:hAnsi="Arial" w:cs="Arial"/>
+          <w:szCs w:val="21"/>
+        </w:rPr>
+        <w:t>First author</w:t>
+      </w:r>
+      <w:r>
+        <w:rPr>
+          <w:rFonts w:ascii="Arial" w:eastAsiaTheme="minorEastAsia" w:hAnsi="Arial" w:cs="Arial" w:hint="eastAsia"/>
+          <w:szCs w:val="21"/>
+          <w:lang w:eastAsia="zh-CN"/>
+        </w:rPr>
+        <w:t>]</w:t>
       </w:r>
     </w:p>
     <w:p>
@@ -3097,7 +3175,26 @@
           <w:bCs/>
           <w:szCs w:val="21"/>
         </w:rPr>
-        <w:t xml:space="preserve">Baishen Liang </w:t>
+        <w:t>Liang</w:t>
+      </w:r>
+      <w:r>
+        <w:rPr>
+          <w:rFonts w:ascii="Arial" w:eastAsiaTheme="minorEastAsia" w:hAnsi="Arial" w:cs="Arial" w:hint="eastAsia"/>
+          <w:b/>
+          <w:bCs/>
+          <w:szCs w:val="21"/>
+          <w:lang w:eastAsia="zh-CN"/>
+        </w:rPr>
+        <w:t>, B.</w:t>
+      </w:r>
+      <w:r>
+        <w:rPr>
+          <w:rFonts w:ascii="Arial" w:hAnsi="Arial" w:cs="Arial"/>
+          <w:b/>
+          <w:bCs/>
+          <w:szCs w:val="21"/>
+        </w:rPr>
+        <w:t xml:space="preserve"> </w:t>
       </w:r>
       <w:r>
         <w:rPr>
@@ -3121,22 +3218,40 @@
           <w:bCs/>
           <w:szCs w:val="21"/>
         </w:rPr>
-        <w:t>Yi Du</w:t>
-      </w:r>
-      <w:r>
-        <w:rPr>
-          <w:rFonts w:ascii="Arial" w:hAnsi="Arial" w:cs="Arial"/>
+        <w:t>Du</w:t>
+      </w:r>
+      <w:r>
+        <w:rPr>
+          <w:rFonts w:ascii="Arial" w:eastAsiaTheme="minorEastAsia" w:hAnsi="Arial" w:cs="Arial" w:hint="eastAsia"/>
           <w:bCs/>
           <w:szCs w:val="21"/>
+          <w:lang w:eastAsia="zh-CN"/>
+        </w:rPr>
+        <w:t>, Y.</w:t>
+      </w:r>
+      <w:r>
+        <w:rPr>
+          <w:rFonts w:ascii="Arial" w:hAnsi="Arial" w:cs="Arial"/>
+          <w:bCs/>
+          <w:szCs w:val="21"/>
         </w:rPr>
         <w:t>*</w:t>
       </w:r>
       <w:r>
         <w:rPr>
-          <w:rFonts w:ascii="Arial" w:hAnsi="Arial" w:cs="Arial"/>
-          <w:szCs w:val="21"/>
-        </w:rPr>
-        <w:t xml:space="preserve">. The functional neuroanatomy of lexical tone perception: an activation likelihood estimation meta-analysis. </w:t>
+          <w:rFonts w:ascii="Arial" w:eastAsiaTheme="minorEastAsia" w:hAnsi="Arial" w:cs="Arial" w:hint="eastAsia"/>
+          <w:bCs/>
+          <w:szCs w:val="21"/>
+          <w:lang w:eastAsia="zh-CN"/>
+        </w:rPr>
+        <w:t xml:space="preserve"> (2018).</w:t>
+      </w:r>
+      <w:r>
+        <w:rPr>
+          <w:rFonts w:ascii="Arial" w:hAnsi="Arial" w:cs="Arial"/>
+          <w:szCs w:val="21"/>
+        </w:rPr>
+        <w:t xml:space="preserve"> The functional neuroanatomy of lexical tone perception: an activation likelihood estimation meta-analysis. </w:t>
       </w:r>
       <w:r>
         <w:rPr>
@@ -3154,7 +3269,30 @@
           <w:rFonts w:ascii="Arial" w:hAnsi="Arial" w:cs="Arial"/>
           <w:szCs w:val="21"/>
         </w:rPr>
-        <w:t>, 2018, 12, 495. (First author)</w:t>
+        <w:t xml:space="preserve">, 12, 495. </w:t>
+      </w:r>
+      <w:r>
+        <w:rPr>
+          <w:rFonts w:ascii="Arial" w:eastAsiaTheme="minorEastAsia" w:hAnsi="Arial" w:cs="Arial" w:hint="eastAsia"/>
+          <w:szCs w:val="21"/>
+          <w:lang w:eastAsia="zh-CN"/>
+        </w:rPr>
+        <w:t>[</w:t>
+      </w:r>
+      <w:r>
+        <w:rPr>
+          <w:rFonts w:ascii="Arial" w:hAnsi="Arial" w:cs="Arial"/>
+          <w:szCs w:val="21"/>
+        </w:rPr>
+        <w:t>First author</w:t>
+      </w:r>
+      <w:r>
+        <w:rPr>
+          <w:rFonts w:ascii="Arial" w:eastAsiaTheme="minorEastAsia" w:hAnsi="Arial" w:cs="Arial" w:hint="eastAsia"/>
+          <w:szCs w:val="21"/>
+          <w:lang w:eastAsia="zh-CN"/>
+        </w:rPr>
+        <w:t>]</w:t>
       </w:r>
     </w:p>
     <w:p>
@@ -3178,7 +3316,26 @@
           <w:bCs/>
           <w:szCs w:val="21"/>
         </w:rPr>
-        <w:t xml:space="preserve">Baishen Liang </w:t>
+        <w:t>Liang</w:t>
+      </w:r>
+      <w:r>
+        <w:rPr>
+          <w:rFonts w:ascii="Arial" w:eastAsia="KaiTi" w:hAnsi="Arial" w:cs="Arial" w:hint="eastAsia"/>
+          <w:b/>
+          <w:bCs/>
+          <w:szCs w:val="21"/>
+          <w:lang w:eastAsia="zh-CN"/>
+        </w:rPr>
+        <w:t>, B.</w:t>
+      </w:r>
+      <w:r>
+        <w:rPr>
+          <w:rFonts w:ascii="Arial" w:eastAsia="KaiTi" w:hAnsi="Arial" w:cs="Arial"/>
+          <w:b/>
+          <w:bCs/>
+          <w:szCs w:val="21"/>
+        </w:rPr>
+        <w:t xml:space="preserve"> </w:t>
       </w:r>
       <w:r>
         <w:rPr>
@@ -3202,7 +3359,16 @@
           <w:bCs/>
           <w:szCs w:val="21"/>
         </w:rPr>
-        <w:t>Yi Du</w:t>
+        <w:t>Du</w:t>
+      </w:r>
+      <w:r>
+        <w:rPr>
+          <w:rFonts w:ascii="Arial" w:eastAsia="KaiTi" w:hAnsi="Arial" w:cs="Arial" w:hint="eastAsia"/>
+          <w:bCs/>
+          <w:szCs w:val="21"/>
+          <w:lang w:eastAsia="zh-CN"/>
+        </w:rPr>
+        <w:t>, Y.</w:t>
       </w:r>
       <w:r>
         <w:rPr>
@@ -3214,10 +3380,19 @@
       </w:r>
       <w:r>
         <w:rPr>
+          <w:rFonts w:ascii="Arial" w:eastAsia="KaiTi" w:hAnsi="Arial" w:cs="Arial" w:hint="eastAsia"/>
+          <w:bCs/>
+          <w:szCs w:val="21"/>
+          <w:lang w:eastAsia="zh-CN"/>
+        </w:rPr>
+        <w:t xml:space="preserve"> (2017).</w:t>
+      </w:r>
+      <w:r>
+        <w:rPr>
           <w:rFonts w:ascii="Arial" w:eastAsia="KaiTi" w:hAnsi="Arial" w:cs="Arial"/>
           <w:szCs w:val="21"/>
         </w:rPr>
-        <w:t>. Mechanisms of sensorimotor integration in speech perception [</w:t>
+        <w:t xml:space="preserve"> Mechanisms of sensorimotor integration in speech perception [</w:t>
       </w:r>
       <w:proofErr w:type="spellStart"/>
       <w:r>
@@ -3278,14 +3453,30 @@
           <w:rFonts w:ascii="Arial" w:eastAsia="KaiTi" w:hAnsi="Arial" w:cs="Arial"/>
           <w:szCs w:val="21"/>
         </w:rPr>
-        <w:t xml:space="preserve">, 2017, 35(19):21-28. </w:t>
-      </w:r>
-      <w:r>
-        <w:rPr>
-          <w:rFonts w:ascii="Arial" w:hAnsi="Arial" w:cs="Arial"/>
-          <w:szCs w:val="21"/>
-        </w:rPr>
-        <w:t>(First author)</w:t>
+        <w:t xml:space="preserve">, 35(19):21-28. </w:t>
+      </w:r>
+      <w:r>
+        <w:rPr>
+          <w:rFonts w:ascii="Arial" w:eastAsiaTheme="minorEastAsia" w:hAnsi="Arial" w:cs="Arial" w:hint="eastAsia"/>
+          <w:szCs w:val="21"/>
+          <w:lang w:eastAsia="zh-CN"/>
+        </w:rPr>
+        <w:t>[</w:t>
+      </w:r>
+      <w:r>
+        <w:rPr>
+          <w:rFonts w:ascii="Arial" w:hAnsi="Arial" w:cs="Arial"/>
+          <w:szCs w:val="21"/>
+        </w:rPr>
+        <w:t>First author</w:t>
+      </w:r>
+      <w:r>
+        <w:rPr>
+          <w:rFonts w:ascii="Arial" w:eastAsiaTheme="minorEastAsia" w:hAnsi="Arial" w:cs="Arial" w:hint="eastAsia"/>
+          <w:szCs w:val="21"/>
+          <w:lang w:eastAsia="zh-CN"/>
+        </w:rPr>
+        <w:t>]</w:t>
       </w:r>
     </w:p>
     <w:p>
@@ -3320,7 +3511,16 @@
           <w:sz w:val="22"/>
           <w:szCs w:val="22"/>
         </w:rPr>
-        <w:t xml:space="preserve">ANUSCRIPTS IN </w:t>
+        <w:t xml:space="preserve">ANUSCRIPTS </w:t>
+      </w:r>
+      <w:r>
+        <w:rPr>
+          <w:rFonts w:ascii="Arial" w:hAnsi="Arial" w:cs="Arial"/>
+          <w:b/>
+          <w:sz w:val="22"/>
+          <w:szCs w:val="22"/>
+        </w:rPr>
+        <w:t xml:space="preserve">UNDER </w:t>
       </w:r>
       <w:r>
         <w:rPr>
@@ -3329,16 +3529,16 @@
           <w:sz w:val="28"/>
           <w:szCs w:val="28"/>
         </w:rPr>
-        <w:t>P</w:t>
-      </w:r>
-      <w:r>
-        <w:rPr>
-          <w:rFonts w:ascii="Arial" w:hAnsi="Arial" w:cs="Arial" w:hint="eastAsia"/>
-          <w:b/>
-          <w:sz w:val="22"/>
-          <w:szCs w:val="22"/>
-        </w:rPr>
-        <w:t>ROGRESS</w:t>
+        <w:t>R</w:t>
+      </w:r>
+      <w:r>
+        <w:rPr>
+          <w:rFonts w:ascii="Arial" w:hAnsi="Arial" w:cs="Arial"/>
+          <w:b/>
+          <w:sz w:val="22"/>
+          <w:szCs w:val="22"/>
+        </w:rPr>
+        <w:t>EVIEW</w:t>
       </w:r>
     </w:p>
     <w:p>
@@ -3346,99 +3546,342 @@
         <w:pStyle w:val="ListParagraph"/>
         <w:numPr>
           <w:ilvl w:val="0"/>
-          <w:numId w:val="55"/>
+          <w:numId w:val="57"/>
         </w:numPr>
         <w:spacing w:before="120" w:after="120"/>
         <w:contextualSpacing w:val="0"/>
         <w:rPr>
-          <w:rFonts w:ascii="Arial" w:hAnsi="Arial" w:cs="Arial"/>
-          <w:szCs w:val="21"/>
-        </w:rPr>
-      </w:pPr>
+          <w:rFonts w:ascii="Arial" w:hAnsi="Arial" w:cs="Arial" w:hint="eastAsia"/>
+          <w:szCs w:val="21"/>
+        </w:rPr>
+      </w:pPr>
+      <w:r>
+        <w:rPr>
+          <w:rFonts w:ascii="Arial" w:hAnsi="Arial" w:cs="Arial"/>
+          <w:szCs w:val="21"/>
+        </w:rPr>
+        <w:t>Hu</w:t>
+      </w:r>
+      <w:r>
+        <w:rPr>
+          <w:rFonts w:ascii="Arial" w:eastAsiaTheme="minorEastAsia" w:hAnsi="Arial" w:cs="Arial" w:hint="eastAsia"/>
+          <w:szCs w:val="21"/>
+          <w:lang w:eastAsia="zh-CN"/>
+        </w:rPr>
+        <w:t xml:space="preserve">, </w:t>
+      </w:r>
+      <w:proofErr w:type="gramStart"/>
+      <w:r>
+        <w:rPr>
+          <w:rFonts w:ascii="Arial" w:eastAsiaTheme="minorEastAsia" w:hAnsi="Arial" w:cs="Arial" w:hint="eastAsia"/>
+          <w:szCs w:val="21"/>
+          <w:lang w:eastAsia="zh-CN"/>
+        </w:rPr>
+        <w:t>W.</w:t>
+      </w:r>
+      <w:r>
+        <w:rPr>
+          <w:rFonts w:ascii="Arial" w:hAnsi="Arial" w:cs="Arial"/>
+          <w:szCs w:val="21"/>
+          <w:vertAlign w:val="superscript"/>
+        </w:rPr>
+        <w:t>#</w:t>
+      </w:r>
+      <w:proofErr w:type="gramEnd"/>
+      <w:r>
+        <w:rPr>
+          <w:rFonts w:ascii="Arial" w:hAnsi="Arial" w:cs="Arial"/>
+          <w:szCs w:val="21"/>
+        </w:rPr>
+        <w:t xml:space="preserve">, </w:t>
+      </w:r>
+      <w:r>
+        <w:rPr>
+          <w:rFonts w:ascii="Arial" w:hAnsi="Arial" w:cs="Arial"/>
+          <w:b/>
+          <w:bCs/>
+          <w:szCs w:val="21"/>
+        </w:rPr>
+        <w:t>Liang</w:t>
+      </w:r>
+      <w:r>
+        <w:rPr>
+          <w:rFonts w:ascii="Arial" w:eastAsiaTheme="minorEastAsia" w:hAnsi="Arial" w:cs="Arial" w:hint="eastAsia"/>
+          <w:b/>
+          <w:bCs/>
+          <w:szCs w:val="21"/>
+          <w:lang w:eastAsia="zh-CN"/>
+        </w:rPr>
+        <w:t xml:space="preserve">, </w:t>
+      </w:r>
+      <w:proofErr w:type="gramStart"/>
+      <w:r>
+        <w:rPr>
+          <w:rFonts w:ascii="Arial" w:eastAsiaTheme="minorEastAsia" w:hAnsi="Arial" w:cs="Arial" w:hint="eastAsia"/>
+          <w:b/>
+          <w:bCs/>
+          <w:szCs w:val="21"/>
+          <w:lang w:eastAsia="zh-CN"/>
+        </w:rPr>
+        <w:t>B.</w:t>
+      </w:r>
+      <w:r>
+        <w:rPr>
+          <w:rFonts w:ascii="Arial" w:hAnsi="Arial" w:cs="Arial"/>
+          <w:b/>
+          <w:bCs/>
+          <w:szCs w:val="21"/>
+          <w:vertAlign w:val="superscript"/>
+        </w:rPr>
+        <w:t>#</w:t>
+      </w:r>
+      <w:proofErr w:type="gramEnd"/>
+      <w:r>
+        <w:rPr>
+          <w:rFonts w:ascii="Arial" w:hAnsi="Arial" w:cs="Arial"/>
+          <w:szCs w:val="21"/>
+        </w:rPr>
+        <w:t>,</w:t>
+      </w:r>
+      <w:r>
+        <w:rPr>
+          <w:rFonts w:ascii="Arial" w:eastAsiaTheme="minorEastAsia" w:hAnsi="Arial" w:cs="Arial" w:hint="eastAsia"/>
+          <w:szCs w:val="21"/>
+          <w:lang w:eastAsia="zh-CN"/>
+        </w:rPr>
+        <w:t xml:space="preserve"> </w:t>
+      </w:r>
+      <w:r>
+        <w:rPr>
+          <w:rFonts w:ascii="Arial" w:hAnsi="Arial" w:cs="Arial"/>
+          <w:szCs w:val="21"/>
+        </w:rPr>
+        <w:t>Du</w:t>
+      </w:r>
+      <w:r>
+        <w:rPr>
+          <w:rFonts w:ascii="Arial" w:eastAsiaTheme="minorEastAsia" w:hAnsi="Arial" w:cs="Arial" w:hint="eastAsia"/>
+          <w:szCs w:val="21"/>
+          <w:lang w:eastAsia="zh-CN"/>
+        </w:rPr>
+        <w:t>, Y.</w:t>
+      </w:r>
+      <w:r>
+        <w:rPr>
+          <w:rFonts w:ascii="Arial" w:eastAsiaTheme="minorEastAsia" w:hAnsi="Arial" w:cs="Arial" w:hint="eastAsia"/>
+          <w:szCs w:val="21"/>
+          <w:lang w:eastAsia="zh-CN"/>
+        </w:rPr>
+        <w:t>*</w:t>
+      </w:r>
+      <w:r>
+        <w:rPr>
+          <w:rFonts w:ascii="Arial" w:eastAsiaTheme="minorEastAsia" w:hAnsi="Arial" w:cs="Arial" w:hint="eastAsia"/>
+          <w:szCs w:val="21"/>
+          <w:lang w:eastAsia="zh-CN"/>
+        </w:rPr>
+        <w:t xml:space="preserve"> (2026).</w:t>
+      </w:r>
+      <w:r>
+        <w:rPr>
+          <w:rFonts w:ascii="Arial" w:hAnsi="Arial" w:cs="Arial" w:hint="eastAsia"/>
+          <w:szCs w:val="21"/>
+        </w:rPr>
+        <w:t xml:space="preserve"> </w:t>
+      </w:r>
+      <w:bookmarkStart w:id="0" w:name="OLE_LINK521"/>
+      <w:bookmarkStart w:id="1" w:name="OLE_LINK520"/>
+      <w:r>
+        <w:rPr>
+          <w:rFonts w:ascii="Arial" w:hAnsi="Arial" w:cs="Arial" w:hint="eastAsia"/>
+          <w:szCs w:val="21"/>
+        </w:rPr>
+        <w:t>Singing e</w:t>
+      </w:r>
+      <w:r>
+        <w:rPr>
+          <w:rFonts w:ascii="Arial" w:hAnsi="Arial" w:cs="Arial"/>
+          <w:szCs w:val="21"/>
+        </w:rPr>
+        <w:t>nhanc</w:t>
+      </w:r>
+      <w:r>
+        <w:rPr>
+          <w:rFonts w:ascii="Arial" w:hAnsi="Arial" w:cs="Arial" w:hint="eastAsia"/>
+          <w:szCs w:val="21"/>
+        </w:rPr>
+        <w:t>es</w:t>
+      </w:r>
+      <w:r>
+        <w:rPr>
+          <w:rFonts w:ascii="Arial" w:hAnsi="Arial" w:cs="Arial"/>
+          <w:szCs w:val="21"/>
+        </w:rPr>
+        <w:t xml:space="preserve"> </w:t>
+      </w:r>
+      <w:r>
+        <w:rPr>
+          <w:rFonts w:ascii="Arial" w:hAnsi="Arial" w:cs="Arial" w:hint="eastAsia"/>
+          <w:szCs w:val="21"/>
+        </w:rPr>
+        <w:t>p</w:t>
+      </w:r>
+      <w:r>
+        <w:rPr>
+          <w:rFonts w:ascii="Arial" w:hAnsi="Arial" w:cs="Arial"/>
+          <w:szCs w:val="21"/>
+        </w:rPr>
+        <w:t xml:space="preserve">oetry </w:t>
+      </w:r>
+      <w:r>
+        <w:rPr>
+          <w:rFonts w:ascii="Arial" w:hAnsi="Arial" w:cs="Arial" w:hint="eastAsia"/>
+          <w:szCs w:val="21"/>
+        </w:rPr>
+        <w:t>learning and m</w:t>
+      </w:r>
+      <w:r>
+        <w:rPr>
+          <w:rFonts w:ascii="Arial" w:hAnsi="Arial" w:cs="Arial"/>
+          <w:szCs w:val="21"/>
+        </w:rPr>
+        <w:t>emor</w:t>
+      </w:r>
+      <w:r>
+        <w:rPr>
+          <w:rFonts w:ascii="Arial" w:hAnsi="Arial" w:cs="Arial" w:hint="eastAsia"/>
+          <w:szCs w:val="21"/>
+        </w:rPr>
+        <w:t>ization</w:t>
+      </w:r>
+      <w:r>
+        <w:rPr>
+          <w:rFonts w:ascii="Arial" w:hAnsi="Arial" w:cs="Arial"/>
+          <w:szCs w:val="21"/>
+        </w:rPr>
+        <w:t xml:space="preserve"> in </w:t>
+      </w:r>
+      <w:r>
+        <w:rPr>
+          <w:rFonts w:ascii="Arial" w:hAnsi="Arial" w:cs="Arial" w:hint="eastAsia"/>
+          <w:szCs w:val="21"/>
+        </w:rPr>
+        <w:t>preschool</w:t>
+      </w:r>
+      <w:r>
+        <w:rPr>
+          <w:rFonts w:ascii="Arial" w:hAnsi="Arial" w:cs="Arial"/>
+          <w:szCs w:val="21"/>
+        </w:rPr>
+        <w:t xml:space="preserve"> </w:t>
+      </w:r>
+      <w:r>
+        <w:rPr>
+          <w:rFonts w:ascii="Arial" w:hAnsi="Arial" w:cs="Arial" w:hint="eastAsia"/>
+          <w:szCs w:val="21"/>
+        </w:rPr>
+        <w:t>c</w:t>
+      </w:r>
+      <w:r>
+        <w:rPr>
+          <w:rFonts w:ascii="Arial" w:hAnsi="Arial" w:cs="Arial"/>
+          <w:szCs w:val="21"/>
+        </w:rPr>
+        <w:t>hildren</w:t>
+      </w:r>
+      <w:bookmarkEnd w:id="0"/>
+      <w:bookmarkEnd w:id="1"/>
+      <w:r>
+        <w:rPr>
+          <w:rFonts w:ascii="Arial" w:eastAsiaTheme="minorEastAsia" w:hAnsi="Arial" w:cs="Arial" w:hint="eastAsia"/>
+          <w:szCs w:val="21"/>
+          <w:lang w:eastAsia="zh-CN"/>
+        </w:rPr>
+        <w:t xml:space="preserve">. </w:t>
+      </w:r>
+      <w:bookmarkStart w:id="2" w:name="_Hlk211158962"/>
       <w:r>
         <w:rPr>
           <w:rFonts w:ascii="Arial" w:eastAsiaTheme="minorEastAsia" w:hAnsi="Arial" w:cs="Arial"/>
           <w:b/>
           <w:bCs/>
-          <w:szCs w:val="21"/>
-        </w:rPr>
-        <w:t>Baishen Liang</w:t>
-      </w:r>
+          <w:i/>
+          <w:iCs/>
+          <w:szCs w:val="21"/>
+          <w:lang w:eastAsia="zh-CN"/>
+        </w:rPr>
+        <w:t>Annals of the New York Academy of Sciences</w:t>
+      </w:r>
+      <w:r>
+        <w:rPr>
+          <w:rFonts w:ascii="Arial" w:eastAsiaTheme="minorEastAsia" w:hAnsi="Arial" w:cs="Arial" w:hint="eastAsia"/>
+          <w:szCs w:val="21"/>
+          <w:lang w:eastAsia="zh-CN"/>
+        </w:rPr>
+        <w:t xml:space="preserve"> </w:t>
+      </w:r>
+      <w:r>
+        <w:rPr>
+          <w:rFonts w:ascii="Arial" w:eastAsiaTheme="minorEastAsia" w:hAnsi="Arial" w:cs="Arial" w:hint="eastAsia"/>
+          <w:b/>
+          <w:bCs/>
+          <w:szCs w:val="21"/>
+          <w:lang w:eastAsia="zh-CN"/>
+        </w:rPr>
+        <w:t>(</w:t>
+      </w:r>
+      <w:bookmarkEnd w:id="2"/>
       <w:r>
         <w:rPr>
           <w:rFonts w:ascii="Arial" w:eastAsiaTheme="minorEastAsia" w:hAnsi="Arial" w:cs="Arial"/>
-          <w:szCs w:val="21"/>
-        </w:rPr>
-        <w:t xml:space="preserve">, A. M. Earle-Richardson, G. Grant, M. Zafar, B. </w:t>
-      </w:r>
-      <w:proofErr w:type="spellStart"/>
-      <w:r>
-        <w:rPr>
-          <w:rFonts w:ascii="Arial" w:eastAsiaTheme="minorEastAsia" w:hAnsi="Arial" w:cs="Arial"/>
-          <w:szCs w:val="21"/>
-        </w:rPr>
-        <w:t>Frauscher</w:t>
-      </w:r>
-      <w:proofErr w:type="spellEnd"/>
-      <w:r>
-        <w:rPr>
-          <w:rFonts w:ascii="Arial" w:eastAsiaTheme="minorEastAsia" w:hAnsi="Arial" w:cs="Arial"/>
-          <w:szCs w:val="21"/>
-        </w:rPr>
-        <w:t>, D. Southwell, G. Hickok, G. B. Cogan</w:t>
-      </w:r>
-      <w:r>
-        <w:rPr>
-          <w:rFonts w:ascii="Arial" w:eastAsiaTheme="minorEastAsia" w:hAnsi="Arial" w:cs="Arial" w:hint="eastAsia"/>
-          <w:szCs w:val="21"/>
-        </w:rPr>
-        <w:t xml:space="preserve">* </w:t>
-      </w:r>
-      <w:r>
-        <w:rPr>
-          <w:rFonts w:ascii="Arial" w:eastAsiaTheme="minorEastAsia" w:hAnsi="Arial" w:cs="Arial"/>
-          <w:szCs w:val="21"/>
-        </w:rPr>
-        <w:t>Sensory-motor mechanisms for verbal working memory</w:t>
-      </w:r>
-      <w:r>
-        <w:rPr>
-          <w:rFonts w:ascii="Arial" w:eastAsiaTheme="minorEastAsia" w:hAnsi="Arial" w:cs="Arial" w:hint="eastAsia"/>
-          <w:szCs w:val="21"/>
+          <w:b/>
+          <w:bCs/>
+          <w:szCs w:val="21"/>
+          <w:lang w:eastAsia="zh-CN"/>
+        </w:rPr>
+        <w:t>Revised and Resubmitted</w:t>
+      </w:r>
+      <w:r>
+        <w:rPr>
+          <w:rFonts w:ascii="Arial" w:eastAsiaTheme="minorEastAsia" w:hAnsi="Arial" w:cs="Arial" w:hint="eastAsia"/>
+          <w:b/>
+          <w:bCs/>
+          <w:szCs w:val="21"/>
+          <w:lang w:eastAsia="zh-CN"/>
+        </w:rPr>
+        <w:t>)</w:t>
+      </w:r>
+      <w:r>
+        <w:rPr>
+          <w:rFonts w:ascii="Arial" w:eastAsiaTheme="minorEastAsia" w:hAnsi="Arial" w:cs="Arial" w:hint="eastAsia"/>
+          <w:szCs w:val="21"/>
+          <w:lang w:eastAsia="zh-CN"/>
         </w:rPr>
         <w:t xml:space="preserve">. </w:t>
       </w:r>
       <w:r>
         <w:rPr>
-          <w:rFonts w:ascii="Arial" w:eastAsiaTheme="minorEastAsia" w:hAnsi="Arial" w:cs="Arial"/>
-          <w:szCs w:val="21"/>
-          <w:lang w:eastAsia="zh-CN"/>
-        </w:rPr>
-        <w:t>In preparation</w:t>
-      </w:r>
-      <w:r>
-        <w:rPr>
-          <w:rFonts w:ascii="Arial" w:eastAsiaTheme="minorEastAsia" w:hAnsi="Arial" w:cs="Arial" w:hint="eastAsia"/>
-          <w:szCs w:val="21"/>
-          <w:lang w:eastAsia="zh-CN"/>
-        </w:rPr>
-        <w:t>. (</w:t>
-      </w:r>
-      <w:r>
-        <w:rPr>
-          <w:rFonts w:ascii="Arial" w:eastAsiaTheme="minorEastAsia" w:hAnsi="Arial" w:cs="Arial"/>
-          <w:szCs w:val="21"/>
-          <w:lang w:eastAsia="zh-CN"/>
-        </w:rPr>
-        <w:t>First</w:t>
-      </w:r>
-      <w:r>
-        <w:rPr>
-          <w:rFonts w:ascii="Arial" w:eastAsiaTheme="minorEastAsia" w:hAnsi="Arial" w:cs="Arial" w:hint="eastAsia"/>
-          <w:szCs w:val="21"/>
-          <w:lang w:eastAsia="zh-CN"/>
-        </w:rPr>
-        <w:t xml:space="preserve"> author)</w:t>
+          <w:rFonts w:ascii="Arial" w:eastAsiaTheme="minorEastAsia" w:hAnsi="Arial" w:cs="Arial" w:hint="eastAsia"/>
+          <w:szCs w:val="21"/>
+          <w:lang w:eastAsia="zh-CN"/>
+        </w:rPr>
+        <w:t>[</w:t>
+      </w:r>
+      <w:r>
+        <w:rPr>
+          <w:rFonts w:ascii="Arial" w:eastAsiaTheme="minorEastAsia" w:hAnsi="Arial" w:cs="Arial" w:hint="eastAsia"/>
+          <w:szCs w:val="21"/>
+          <w:lang w:eastAsia="zh-CN"/>
+        </w:rPr>
+        <w:t>Co-first author</w:t>
+      </w:r>
+      <w:r>
+        <w:rPr>
+          <w:rFonts w:ascii="Arial" w:eastAsiaTheme="minorEastAsia" w:hAnsi="Arial" w:cs="Arial" w:hint="eastAsia"/>
+          <w:szCs w:val="21"/>
+          <w:lang w:eastAsia="zh-CN"/>
+        </w:rPr>
+        <w:t>]</w:t>
       </w:r>
     </w:p>
     <w:p>
@@ -3446,7 +3889,7 @@
         <w:pStyle w:val="ListParagraph"/>
         <w:numPr>
           <w:ilvl w:val="0"/>
-          <w:numId w:val="55"/>
+          <w:numId w:val="57"/>
         </w:numPr>
         <w:spacing w:before="120" w:after="120"/>
         <w:contextualSpacing w:val="0"/>
@@ -3460,7 +3903,15 @@
           <w:rFonts w:ascii="Arial" w:hAnsi="Arial" w:cs="Arial"/>
           <w:szCs w:val="21"/>
         </w:rPr>
-        <w:t>Jiali Liu</w:t>
+        <w:t>Liu</w:t>
+      </w:r>
+      <w:r>
+        <w:rPr>
+          <w:rFonts w:ascii="Arial" w:eastAsiaTheme="minorEastAsia" w:hAnsi="Arial" w:cs="Arial" w:hint="eastAsia"/>
+          <w:szCs w:val="21"/>
+          <w:lang w:eastAsia="zh-CN"/>
+        </w:rPr>
+        <w:t>, J.</w:t>
       </w:r>
       <w:r>
         <w:rPr>
@@ -3475,23 +3926,15 @@
           <w:rFonts w:ascii="Arial" w:hAnsi="Arial" w:cs="Arial"/>
           <w:szCs w:val="21"/>
         </w:rPr>
-        <w:t xml:space="preserve">, </w:t>
-      </w:r>
-      <w:proofErr w:type="spellStart"/>
-      <w:r>
-        <w:rPr>
-          <w:rFonts w:ascii="Arial" w:hAnsi="Arial" w:cs="Arial"/>
-          <w:szCs w:val="21"/>
-        </w:rPr>
-        <w:t>Yixiang</w:t>
-      </w:r>
-      <w:proofErr w:type="spellEnd"/>
-      <w:r>
-        <w:rPr>
-          <w:rFonts w:ascii="Arial" w:hAnsi="Arial" w:cs="Arial"/>
-          <w:szCs w:val="21"/>
-        </w:rPr>
-        <w:t xml:space="preserve"> Wang</w:t>
+        <w:t>, Wang</w:t>
+      </w:r>
+      <w:r>
+        <w:rPr>
+          <w:rFonts w:ascii="Arial" w:eastAsiaTheme="minorEastAsia" w:hAnsi="Arial" w:cs="Arial" w:hint="eastAsia"/>
+          <w:szCs w:val="21"/>
+          <w:lang w:eastAsia="zh-CN"/>
+        </w:rPr>
+        <w:t>, Y.</w:t>
       </w:r>
       <w:r>
         <w:rPr>
@@ -3506,7 +3949,15 @@
           <w:rFonts w:ascii="Arial" w:hAnsi="Arial" w:cs="Arial"/>
           <w:szCs w:val="21"/>
         </w:rPr>
-        <w:t>, Jiayu Feng</w:t>
+        <w:t>, Feng</w:t>
+      </w:r>
+      <w:r>
+        <w:rPr>
+          <w:rFonts w:ascii="Arial" w:eastAsiaTheme="minorEastAsia" w:hAnsi="Arial" w:cs="Arial" w:hint="eastAsia"/>
+          <w:szCs w:val="21"/>
+          <w:lang w:eastAsia="zh-CN"/>
+        </w:rPr>
+        <w:t>, J.</w:t>
       </w:r>
       <w:r>
         <w:rPr>
@@ -3521,23 +3972,30 @@
           <w:rFonts w:ascii="Arial" w:hAnsi="Arial" w:cs="Arial"/>
           <w:szCs w:val="21"/>
         </w:rPr>
-        <w:t xml:space="preserve">, </w:t>
-      </w:r>
-      <w:proofErr w:type="spellStart"/>
-      <w:r>
-        <w:rPr>
-          <w:rFonts w:ascii="Arial" w:hAnsi="Arial" w:cs="Arial"/>
-          <w:szCs w:val="21"/>
-        </w:rPr>
-        <w:t>Haichao</w:t>
-      </w:r>
-      <w:proofErr w:type="spellEnd"/>
-      <w:r>
-        <w:rPr>
-          <w:rFonts w:ascii="Arial" w:hAnsi="Arial" w:cs="Arial"/>
-          <w:szCs w:val="21"/>
-        </w:rPr>
-        <w:t xml:space="preserve"> Zhao, Qinghua He</w:t>
+        <w:t>, Zhao</w:t>
+      </w:r>
+      <w:r>
+        <w:rPr>
+          <w:rFonts w:ascii="Arial" w:eastAsiaTheme="minorEastAsia" w:hAnsi="Arial" w:cs="Arial" w:hint="eastAsia"/>
+          <w:szCs w:val="21"/>
+          <w:lang w:eastAsia="zh-CN"/>
+        </w:rPr>
+        <w:t>, H.</w:t>
+      </w:r>
+      <w:r>
+        <w:rPr>
+          <w:rFonts w:ascii="Arial" w:hAnsi="Arial" w:cs="Arial"/>
+          <w:szCs w:val="21"/>
+        </w:rPr>
+        <w:t>, He</w:t>
+      </w:r>
+      <w:r>
+        <w:rPr>
+          <w:rFonts w:ascii="Arial" w:eastAsiaTheme="minorEastAsia" w:hAnsi="Arial" w:cs="Arial" w:hint="eastAsia"/>
+          <w:szCs w:val="21"/>
+          <w:lang w:eastAsia="zh-CN"/>
+        </w:rPr>
+        <w:t>, Q.</w:t>
       </w:r>
       <w:r>
         <w:rPr>
@@ -3552,7 +4010,22 @@
           <w:rFonts w:ascii="Arial" w:hAnsi="Arial" w:cs="Arial"/>
           <w:szCs w:val="21"/>
         </w:rPr>
-        <w:t xml:space="preserve"> Xuefeng Yang*, </w:t>
+        <w:t xml:space="preserve"> Yang</w:t>
+      </w:r>
+      <w:r>
+        <w:rPr>
+          <w:rFonts w:ascii="Arial" w:eastAsiaTheme="minorEastAsia" w:hAnsi="Arial" w:cs="Arial" w:hint="eastAsia"/>
+          <w:szCs w:val="21"/>
+          <w:lang w:eastAsia="zh-CN"/>
+        </w:rPr>
+        <w:t>, X.</w:t>
+      </w:r>
+      <w:r>
+        <w:rPr>
+          <w:rFonts w:ascii="Arial" w:hAnsi="Arial" w:cs="Arial"/>
+          <w:szCs w:val="21"/>
+        </w:rPr>
+        <w:t xml:space="preserve">*, </w:t>
       </w:r>
       <w:r>
         <w:rPr>
@@ -3561,7 +4034,7 @@
           <w:bCs/>
           <w:szCs w:val="21"/>
         </w:rPr>
-        <w:t>Baishen Liang*</w:t>
+        <w:t>Liang</w:t>
       </w:r>
       <w:r>
         <w:rPr>
@@ -3571,6 +4044,59 @@
           <w:szCs w:val="21"/>
           <w:lang w:eastAsia="zh-CN"/>
         </w:rPr>
+        <w:t>, B.</w:t>
+      </w:r>
+      <w:r>
+        <w:rPr>
+          <w:rFonts w:ascii="Arial" w:hAnsi="Arial" w:cs="Arial"/>
+          <w:b/>
+          <w:bCs/>
+          <w:szCs w:val="21"/>
+        </w:rPr>
+        <w:t>*</w:t>
+      </w:r>
+      <w:r>
+        <w:rPr>
+          <w:rFonts w:ascii="Arial" w:eastAsiaTheme="minorEastAsia" w:hAnsi="Arial" w:cs="Arial" w:hint="eastAsia"/>
+          <w:szCs w:val="21"/>
+          <w:lang w:eastAsia="zh-CN"/>
+        </w:rPr>
+        <w:t xml:space="preserve"> </w:t>
+      </w:r>
+      <w:r>
+        <w:rPr>
+          <w:rFonts w:ascii="Arial" w:eastAsiaTheme="minorEastAsia" w:hAnsi="Arial" w:cs="Arial"/>
+          <w:szCs w:val="21"/>
+          <w:lang w:eastAsia="zh-CN"/>
+        </w:rPr>
+        <w:t>Successor representation supports structural learning of syllable sequences</w:t>
+      </w:r>
+      <w:r>
+        <w:rPr>
+          <w:rFonts w:ascii="Arial" w:eastAsiaTheme="minorEastAsia" w:hAnsi="Arial" w:cs="Arial" w:hint="eastAsia"/>
+          <w:szCs w:val="21"/>
+          <w:lang w:eastAsia="zh-CN"/>
+        </w:rPr>
+        <w:t xml:space="preserve">. </w:t>
+      </w:r>
+      <w:r>
+        <w:rPr>
+          <w:rFonts w:ascii="Arial" w:eastAsiaTheme="minorEastAsia" w:hAnsi="Arial" w:cs="Arial" w:hint="eastAsia"/>
+          <w:b/>
+          <w:bCs/>
+          <w:szCs w:val="21"/>
+          <w:lang w:eastAsia="zh-CN"/>
+        </w:rPr>
+        <w:t>Under review</w:t>
+      </w:r>
+      <w:r>
+        <w:rPr>
+          <w:rFonts w:ascii="Arial" w:eastAsiaTheme="minorEastAsia" w:hAnsi="Arial" w:cs="Arial" w:hint="eastAsia"/>
+          <w:b/>
+          <w:bCs/>
+          <w:szCs w:val="21"/>
+          <w:lang w:eastAsia="zh-CN"/>
+        </w:rPr>
         <w:t>.</w:t>
       </w:r>
       <w:r>
@@ -3583,35 +4109,27 @@
       </w:r>
       <w:r>
         <w:rPr>
-          <w:rFonts w:ascii="Arial" w:eastAsiaTheme="minorEastAsia" w:hAnsi="Arial" w:cs="Arial"/>
-          <w:szCs w:val="21"/>
-          <w:lang w:eastAsia="zh-CN"/>
-        </w:rPr>
-        <w:t>Structural learning of syllable sequences</w:t>
-      </w:r>
-      <w:r>
-        <w:rPr>
-          <w:rFonts w:ascii="Arial" w:eastAsiaTheme="minorEastAsia" w:hAnsi="Arial" w:cs="Arial" w:hint="eastAsia"/>
-          <w:szCs w:val="21"/>
-          <w:lang w:eastAsia="zh-CN"/>
-        </w:rPr>
-        <w:t xml:space="preserve">. </w:t>
-      </w:r>
-      <w:r>
-        <w:rPr>
-          <w:rFonts w:ascii="Arial" w:eastAsiaTheme="minorEastAsia" w:hAnsi="Arial" w:cs="Arial"/>
-          <w:szCs w:val="21"/>
-          <w:lang w:eastAsia="zh-CN"/>
-        </w:rPr>
-        <w:t>Submitted</w:t>
-      </w:r>
-      <w:r>
-        <w:rPr>
-          <w:rFonts w:ascii="Arial" w:eastAsiaTheme="minorEastAsia" w:hAnsi="Arial" w:cs="Arial" w:hint="eastAsia"/>
-          <w:szCs w:val="21"/>
-          <w:lang w:eastAsia="zh-CN"/>
-        </w:rPr>
-        <w:t>. (Co-corresponding author)</w:t>
+          <w:rFonts w:ascii="Arial" w:eastAsiaTheme="minorEastAsia" w:hAnsi="Arial" w:cs="Arial" w:hint="eastAsia"/>
+          <w:szCs w:val="21"/>
+          <w:lang w:eastAsia="zh-CN"/>
+        </w:rPr>
+        <w:t>[</w:t>
+      </w:r>
+      <w:r>
+        <w:rPr>
+          <w:rFonts w:ascii="Arial" w:eastAsiaTheme="minorEastAsia" w:hAnsi="Arial" w:cs="Arial" w:hint="eastAsia"/>
+          <w:szCs w:val="21"/>
+          <w:lang w:eastAsia="zh-CN"/>
+        </w:rPr>
+        <w:t>Co-corresponding author</w:t>
+      </w:r>
+      <w:r>
+        <w:rPr>
+          <w:rFonts w:ascii="Arial" w:eastAsiaTheme="minorEastAsia" w:hAnsi="Arial" w:cs="Arial" w:hint="eastAsia"/>
+          <w:szCs w:val="21"/>
+          <w:lang w:eastAsia="zh-CN"/>
+        </w:rPr>
+        <w:t>]</w:t>
       </w:r>
     </w:p>
     <w:p>
@@ -3619,7 +4137,7 @@
         <w:pStyle w:val="ListParagraph"/>
         <w:numPr>
           <w:ilvl w:val="0"/>
-          <w:numId w:val="55"/>
+          <w:numId w:val="57"/>
         </w:numPr>
         <w:spacing w:before="120" w:after="120"/>
         <w:contextualSpacing w:val="0"/>
@@ -3633,7 +4151,15 @@
           <w:rFonts w:ascii="Arial" w:hAnsi="Arial" w:cs="Arial"/>
           <w:szCs w:val="21"/>
         </w:rPr>
-        <w:t>Yaxuan Wang</w:t>
+        <w:t>Wang</w:t>
+      </w:r>
+      <w:r>
+        <w:rPr>
+          <w:rFonts w:ascii="Arial" w:eastAsiaTheme="minorEastAsia" w:hAnsi="Arial" w:cs="Arial" w:hint="eastAsia"/>
+          <w:szCs w:val="21"/>
+          <w:lang w:eastAsia="zh-CN"/>
+        </w:rPr>
+        <w:t>, Y.</w:t>
       </w:r>
       <w:r>
         <w:rPr>
@@ -3657,7 +4183,15 @@
           <w:szCs w:val="21"/>
           <w:lang w:eastAsia="zh-CN"/>
         </w:rPr>
-        <w:t>Keke Yu</w:t>
+        <w:t>Yu</w:t>
+      </w:r>
+      <w:r>
+        <w:rPr>
+          <w:rFonts w:ascii="Arial" w:eastAsiaTheme="minorEastAsia" w:hAnsi="Arial" w:cs="Arial" w:hint="eastAsia"/>
+          <w:szCs w:val="21"/>
+          <w:lang w:eastAsia="zh-CN"/>
+        </w:rPr>
+        <w:t>, K.</w:t>
       </w:r>
       <w:r>
         <w:rPr>
@@ -3676,13 +4210,114 @@
         </w:rPr>
         <w:t xml:space="preserve">, </w:t>
       </w:r>
+      <w:r>
+        <w:rPr>
+          <w:rFonts w:ascii="Arial" w:hAnsi="Arial" w:cs="Arial"/>
+          <w:szCs w:val="21"/>
+        </w:rPr>
+        <w:t>Yin</w:t>
+      </w:r>
+      <w:r>
+        <w:rPr>
+          <w:rFonts w:ascii="Arial" w:eastAsiaTheme="minorEastAsia" w:hAnsi="Arial" w:cs="Arial" w:hint="eastAsia"/>
+          <w:szCs w:val="21"/>
+          <w:lang w:eastAsia="zh-CN"/>
+        </w:rPr>
+        <w:t>, S.</w:t>
+      </w:r>
+      <w:r>
+        <w:rPr>
+          <w:rFonts w:ascii="Arial" w:hAnsi="Arial" w:cs="Arial"/>
+          <w:szCs w:val="21"/>
+        </w:rPr>
+        <w:t xml:space="preserve">, </w:t>
+      </w:r>
+      <w:r>
+        <w:rPr>
+          <w:rFonts w:ascii="Arial" w:hAnsi="Arial" w:cs="Arial"/>
+          <w:b/>
+          <w:bCs/>
+          <w:szCs w:val="21"/>
+        </w:rPr>
+        <w:t>Liang</w:t>
+      </w:r>
+      <w:r>
+        <w:rPr>
+          <w:rFonts w:ascii="Arial" w:eastAsiaTheme="minorEastAsia" w:hAnsi="Arial" w:cs="Arial" w:hint="eastAsia"/>
+          <w:b/>
+          <w:bCs/>
+          <w:szCs w:val="21"/>
+          <w:lang w:eastAsia="zh-CN"/>
+        </w:rPr>
+        <w:t>, B.</w:t>
+      </w:r>
+      <w:r>
+        <w:rPr>
+          <w:rFonts w:ascii="Arial" w:hAnsi="Arial" w:cs="Arial"/>
+          <w:szCs w:val="21"/>
+        </w:rPr>
+        <w:t>*</w:t>
+      </w:r>
+      <w:r>
+        <w:rPr>
+          <w:rFonts w:ascii="Arial" w:hAnsi="Arial" w:cs="Arial"/>
+          <w:szCs w:val="21"/>
+        </w:rPr>
+        <w:t>,</w:t>
+      </w:r>
+      <w:r>
+        <w:rPr>
+          <w:rFonts w:ascii="Arial" w:eastAsiaTheme="minorEastAsia" w:hAnsi="Arial" w:cs="Arial" w:hint="eastAsia"/>
+          <w:szCs w:val="21"/>
+          <w:lang w:eastAsia="zh-CN"/>
+        </w:rPr>
+        <w:t xml:space="preserve"> </w:t>
+      </w:r>
+      <w:r>
+        <w:rPr>
+          <w:rFonts w:ascii="Arial" w:eastAsiaTheme="minorEastAsia" w:hAnsi="Arial" w:cs="Arial" w:hint="eastAsia"/>
+          <w:szCs w:val="21"/>
+          <w:lang w:eastAsia="zh-CN"/>
+        </w:rPr>
+        <w:t>Wang</w:t>
+      </w:r>
+      <w:r>
+        <w:rPr>
+          <w:rFonts w:ascii="Arial" w:eastAsiaTheme="minorEastAsia" w:hAnsi="Arial" w:cs="Arial" w:hint="eastAsia"/>
+          <w:szCs w:val="21"/>
+          <w:lang w:eastAsia="zh-CN"/>
+        </w:rPr>
+        <w:t>, R.</w:t>
+      </w:r>
+      <w:r>
+        <w:rPr>
+          <w:rFonts w:ascii="Arial" w:hAnsi="Arial" w:cs="Arial"/>
+          <w:bCs/>
+          <w:szCs w:val="21"/>
+        </w:rPr>
+        <w:t>*</w:t>
+      </w:r>
+      <w:r>
+        <w:rPr>
+          <w:rFonts w:ascii="Arial" w:hAnsi="Arial" w:cs="Arial"/>
+          <w:szCs w:val="21"/>
+        </w:rPr>
+        <w:t xml:space="preserve"> </w:t>
+      </w:r>
+      <w:r>
+        <w:rPr>
+          <w:rFonts w:ascii="Arial" w:hAnsi="Arial" w:cs="Arial"/>
+          <w:szCs w:val="21"/>
+        </w:rPr>
+        <w:t>Theta and gamma transcranial alternating current stimulation (</w:t>
+      </w:r>
       <w:proofErr w:type="spellStart"/>
       <w:r>
         <w:rPr>
           <w:rFonts w:ascii="Arial" w:hAnsi="Arial" w:cs="Arial"/>
           <w:szCs w:val="21"/>
         </w:rPr>
-        <w:t>Shuqi</w:t>
+        <w:t>tACS</w:t>
       </w:r>
       <w:proofErr w:type="spellEnd"/>
       <w:r>
@@ -3690,91 +4325,95 @@
           <w:rFonts w:ascii="Arial" w:hAnsi="Arial" w:cs="Arial"/>
           <w:szCs w:val="21"/>
         </w:rPr>
-        <w:t xml:space="preserve"> Yin, </w:t>
-      </w:r>
-      <w:r>
-        <w:rPr>
-          <w:rFonts w:ascii="Arial" w:hAnsi="Arial" w:cs="Arial"/>
+        <w:t>) modulate Mandarin consonant and lexical tone perception</w:t>
+      </w:r>
+      <w:r>
+        <w:rPr>
+          <w:rFonts w:ascii="Arial" w:hAnsi="Arial" w:cs="Arial"/>
+          <w:szCs w:val="21"/>
+        </w:rPr>
+        <w:t>.</w:t>
+      </w:r>
+      <w:r>
+        <w:rPr>
+          <w:rFonts w:ascii="Arial" w:hAnsi="Arial" w:cs="Arial"/>
+          <w:szCs w:val="21"/>
+        </w:rPr>
+        <w:t xml:space="preserve"> </w:t>
+      </w:r>
+      <w:r>
+        <w:rPr>
+          <w:rFonts w:ascii="Arial" w:eastAsiaTheme="minorEastAsia" w:hAnsi="Arial" w:cs="Arial"/>
           <w:b/>
           <w:bCs/>
           <w:szCs w:val="21"/>
-        </w:rPr>
-        <w:t>Baishen Liang</w:t>
-      </w:r>
-      <w:r>
-        <w:rPr>
-          <w:rFonts w:ascii="Arial" w:hAnsi="Arial" w:cs="Arial"/>
-          <w:szCs w:val="21"/>
-        </w:rPr>
-        <w:t>*</w:t>
-      </w:r>
-      <w:r>
-        <w:rPr>
-          <w:rFonts w:ascii="Arial" w:hAnsi="Arial" w:cs="Arial"/>
-          <w:szCs w:val="21"/>
-        </w:rPr>
-        <w:t xml:space="preserve">, </w:t>
-      </w:r>
-      <w:proofErr w:type="spellStart"/>
-      <w:r>
-        <w:rPr>
-          <w:rFonts w:ascii="Arial" w:eastAsiaTheme="minorEastAsia" w:hAnsi="Arial" w:cs="Arial" w:hint="eastAsia"/>
-          <w:szCs w:val="21"/>
-          <w:lang w:eastAsia="zh-CN"/>
-        </w:rPr>
-        <w:t>Ruiming</w:t>
-      </w:r>
-      <w:proofErr w:type="spellEnd"/>
-      <w:r>
-        <w:rPr>
-          <w:rFonts w:ascii="Arial" w:eastAsiaTheme="minorEastAsia" w:hAnsi="Arial" w:cs="Arial" w:hint="eastAsia"/>
-          <w:szCs w:val="21"/>
-          <w:lang w:eastAsia="zh-CN"/>
-        </w:rPr>
-        <w:t xml:space="preserve"> Wang</w:t>
-      </w:r>
-      <w:r>
-        <w:rPr>
-          <w:rFonts w:ascii="Arial" w:hAnsi="Arial" w:cs="Arial"/>
+          <w:lang w:eastAsia="zh-CN"/>
+        </w:rPr>
+        <w:t>U</w:t>
+      </w:r>
+      <w:r>
+        <w:rPr>
+          <w:rFonts w:ascii="Arial" w:eastAsiaTheme="minorEastAsia" w:hAnsi="Arial" w:cs="Arial" w:hint="eastAsia"/>
+          <w:b/>
           <w:bCs/>
           <w:szCs w:val="21"/>
-        </w:rPr>
-        <w:t>*</w:t>
-      </w:r>
-      <w:r>
-        <w:rPr>
-          <w:rFonts w:ascii="Arial" w:hAnsi="Arial" w:cs="Arial"/>
-          <w:szCs w:val="21"/>
-        </w:rPr>
-        <w:t xml:space="preserve">. </w:t>
-      </w:r>
-      <w:r>
-        <w:rPr>
-          <w:rFonts w:ascii="Arial" w:hAnsi="Arial" w:cs="Arial"/>
-          <w:szCs w:val="21"/>
-        </w:rPr>
-        <w:t>Theta and gamma transcranial alternating current stimulation modulate Mandarin consonant and lexical tone perception</w:t>
-      </w:r>
-      <w:r>
-        <w:rPr>
-          <w:rFonts w:ascii="Arial" w:hAnsi="Arial" w:cs="Arial"/>
-          <w:szCs w:val="21"/>
-        </w:rPr>
-        <w:t xml:space="preserve">. </w:t>
-      </w:r>
-      <w:proofErr w:type="spellStart"/>
-      <w:r>
-        <w:rPr>
-          <w:rFonts w:ascii="Arial" w:hAnsi="Arial" w:cs="Arial"/>
+          <w:lang w:eastAsia="zh-CN"/>
+        </w:rPr>
+        <w:t>nder review</w:t>
+      </w:r>
+      <w:r>
+        <w:rPr>
+          <w:rFonts w:ascii="Arial" w:eastAsiaTheme="minorEastAsia" w:hAnsi="Arial" w:cs="Arial" w:hint="eastAsia"/>
+          <w:b/>
+          <w:bCs/>
+          <w:szCs w:val="21"/>
+          <w:lang w:eastAsia="zh-CN"/>
+        </w:rPr>
+        <w:t xml:space="preserve"> </w:t>
+      </w:r>
+      <w:r>
+        <w:rPr>
+          <w:rFonts w:ascii="Arial" w:eastAsiaTheme="minorEastAsia" w:hAnsi="Arial" w:cs="Arial" w:hint="eastAsia"/>
+          <w:szCs w:val="21"/>
+          <w:lang w:eastAsia="zh-CN"/>
+        </w:rPr>
+        <w:t>(</w:t>
+      </w:r>
+      <w:r>
+        <w:rPr>
+          <w:rFonts w:ascii="Arial" w:eastAsiaTheme="minorEastAsia" w:hAnsi="Arial" w:cs="Arial"/>
+          <w:szCs w:val="21"/>
+          <w:lang w:eastAsia="zh-CN"/>
+        </w:rPr>
+        <w:t xml:space="preserve">Preprint available on </w:t>
+      </w:r>
+      <w:r>
+        <w:rPr>
+          <w:rFonts w:ascii="Arial" w:eastAsiaTheme="minorEastAsia" w:hAnsi="Arial" w:cs="Arial"/>
           <w:b/>
           <w:bCs/>
           <w:i/>
           <w:iCs/>
           <w:szCs w:val="21"/>
+          <w:lang w:eastAsia="zh-CN"/>
         </w:rPr>
         <w:t>bioRxiv</w:t>
       </w:r>
-      <w:proofErr w:type="spellEnd"/>
+      <w:r>
+        <w:rPr>
+          <w:rFonts w:ascii="Arial" w:eastAsiaTheme="minorEastAsia" w:hAnsi="Arial" w:cs="Arial" w:hint="eastAsia"/>
+          <w:szCs w:val="21"/>
+          <w:lang w:eastAsia="zh-CN"/>
+        </w:rPr>
+        <w:t xml:space="preserve">: </w:t>
+      </w:r>
+      <w:r>
+        <w:rPr>
+          <w:rFonts w:ascii="Arial" w:hAnsi="Arial" w:cs="Arial"/>
+          <w:szCs w:val="21"/>
+        </w:rPr>
+        <w:t>2025</w:t>
+      </w:r>
       <w:r>
         <w:rPr>
           <w:rFonts w:ascii="Arial" w:eastAsiaTheme="minorEastAsia" w:hAnsi="Arial" w:cs="Arial" w:hint="eastAsia"/>
@@ -3788,68 +4427,116 @@
           <w:rFonts w:ascii="Arial" w:hAnsi="Arial" w:cs="Arial"/>
           <w:szCs w:val="21"/>
         </w:rPr>
-        <w:t>2025</w:t>
-      </w:r>
-      <w:r>
-        <w:rPr>
-          <w:rFonts w:ascii="Arial" w:eastAsiaTheme="minorEastAsia" w:hAnsi="Arial" w:cs="Arial" w:hint="eastAsia"/>
-          <w:szCs w:val="21"/>
-          <w:lang w:eastAsia="zh-CN"/>
-        </w:rPr>
-        <w:t xml:space="preserve">, </w:t>
-      </w:r>
-      <w:r>
-        <w:rPr>
-          <w:rFonts w:ascii="Arial" w:hAnsi="Arial" w:cs="Arial"/>
-          <w:szCs w:val="21"/>
-        </w:rPr>
         <w:t>679546</w:t>
       </w:r>
       <w:r>
         <w:rPr>
-          <w:rFonts w:asciiTheme="minorEastAsia" w:eastAsiaTheme="minorEastAsia" w:hAnsiTheme="minorEastAsia" w:cs="MS Gothic" w:hint="eastAsia"/>
-          <w:szCs w:val="21"/>
-          <w:lang w:eastAsia="zh-CN"/>
-        </w:rPr>
-        <w:t>;</w:t>
-      </w:r>
-      <w:r>
-        <w:rPr>
-          <w:rFonts w:ascii="Arial" w:hAnsi="Arial" w:cs="Arial"/>
-          <w:szCs w:val="21"/>
+          <w:rFonts w:ascii="Arial" w:eastAsiaTheme="minorEastAsia" w:hAnsi="Arial" w:cs="Arial" w:hint="eastAsia"/>
+          <w:szCs w:val="21"/>
+          <w:lang w:eastAsia="zh-CN"/>
+        </w:rPr>
+        <w:t>)</w:t>
+      </w:r>
+      <w:r>
+        <w:rPr>
+          <w:rFonts w:ascii="Arial" w:hAnsi="Arial" w:cs="Arial"/>
+          <w:szCs w:val="21"/>
+        </w:rPr>
+        <w:t>.</w:t>
+      </w:r>
+      <w:r>
+        <w:rPr>
+          <w:rFonts w:ascii="Arial" w:eastAsiaTheme="minorEastAsia" w:hAnsi="Arial" w:cs="Arial" w:hint="eastAsia"/>
+          <w:szCs w:val="21"/>
+          <w:lang w:eastAsia="zh-CN"/>
         </w:rPr>
         <w:t xml:space="preserve"> </w:t>
       </w:r>
       <w:r>
         <w:rPr>
-          <w:rFonts w:ascii="Arial" w:eastAsiaTheme="minorEastAsia" w:hAnsi="Arial" w:cs="Arial"/>
-          <w:szCs w:val="21"/>
-          <w:lang w:eastAsia="zh-CN"/>
-        </w:rPr>
-        <w:t>U</w:t>
-      </w:r>
-      <w:r>
-        <w:rPr>
-          <w:rFonts w:ascii="Arial" w:eastAsiaTheme="minorEastAsia" w:hAnsi="Arial" w:cs="Arial" w:hint="eastAsia"/>
-          <w:szCs w:val="21"/>
-          <w:lang w:eastAsia="zh-CN"/>
-        </w:rPr>
-        <w:t>nder review</w:t>
-      </w:r>
-      <w:r>
-        <w:rPr>
-          <w:rFonts w:ascii="Arial" w:hAnsi="Arial" w:cs="Arial"/>
-          <w:szCs w:val="21"/>
-        </w:rPr>
-        <w:t>.</w:t>
-      </w:r>
-      <w:r>
-        <w:rPr>
-          <w:rFonts w:ascii="Arial" w:eastAsiaTheme="minorEastAsia" w:hAnsi="Arial" w:cs="Arial" w:hint="eastAsia"/>
-          <w:szCs w:val="21"/>
-          <w:lang w:eastAsia="zh-CN"/>
-        </w:rPr>
-        <w:t xml:space="preserve"> (Co-corresponding author)</w:t>
+          <w:rFonts w:ascii="Arial" w:eastAsiaTheme="minorEastAsia" w:hAnsi="Arial" w:cs="Arial" w:hint="eastAsia"/>
+          <w:szCs w:val="21"/>
+          <w:lang w:eastAsia="zh-CN"/>
+        </w:rPr>
+        <w:t>[</w:t>
+      </w:r>
+      <w:r>
+        <w:rPr>
+          <w:rFonts w:ascii="Arial" w:eastAsiaTheme="minorEastAsia" w:hAnsi="Arial" w:cs="Arial" w:hint="eastAsia"/>
+          <w:szCs w:val="21"/>
+          <w:lang w:eastAsia="zh-CN"/>
+        </w:rPr>
+        <w:t>Co-corresponding author</w:t>
+      </w:r>
+      <w:r>
+        <w:rPr>
+          <w:rFonts w:ascii="Arial" w:eastAsiaTheme="minorEastAsia" w:hAnsi="Arial" w:cs="Arial" w:hint="eastAsia"/>
+          <w:szCs w:val="21"/>
+          <w:lang w:eastAsia="zh-CN"/>
+        </w:rPr>
+        <w:t>]</w:t>
+      </w:r>
+    </w:p>
+    <w:p>
+      <w:pPr>
+        <w:pBdr>
+          <w:bottom w:val="single" w:sz="12" w:space="1" w:color="auto"/>
+        </w:pBdr>
+        <w:tabs>
+          <w:tab w:val="left" w:pos="0"/>
+        </w:tabs>
+        <w:jc w:val="both"/>
+        <w:rPr>
+          <w:rFonts w:ascii="Arial" w:hAnsi="Arial" w:cs="Arial"/>
+          <w:b/>
+          <w:sz w:val="22"/>
+          <w:szCs w:val="22"/>
+        </w:rPr>
+      </w:pPr>
+      <w:r>
+        <w:rPr>
+          <w:rFonts w:ascii="Arial" w:hAnsi="Arial" w:cs="Arial"/>
+          <w:b/>
+          <w:sz w:val="28"/>
+          <w:szCs w:val="28"/>
+        </w:rPr>
+        <w:t>M</w:t>
+      </w:r>
+      <w:r>
+        <w:rPr>
+          <w:rFonts w:ascii="Arial" w:hAnsi="Arial" w:cs="Arial"/>
+          <w:b/>
+          <w:sz w:val="22"/>
+          <w:szCs w:val="22"/>
+        </w:rPr>
+        <w:t xml:space="preserve">ANUSCRIPTS </w:t>
+      </w:r>
+      <w:r>
+        <w:rPr>
+          <w:rFonts w:ascii="Arial" w:hAnsi="Arial" w:cs="Arial"/>
+          <w:b/>
+          <w:sz w:val="22"/>
+          <w:szCs w:val="22"/>
+        </w:rPr>
+        <w:t xml:space="preserve">IN </w:t>
+      </w:r>
+      <w:r>
+        <w:rPr>
+          <w:rFonts w:ascii="Arial" w:hAnsi="Arial" w:cs="Arial"/>
+          <w:b/>
+          <w:sz w:val="28"/>
+          <w:szCs w:val="28"/>
+        </w:rPr>
+        <w:t>P</w:t>
+      </w:r>
+      <w:r>
+        <w:rPr>
+          <w:rFonts w:ascii="Arial" w:hAnsi="Arial" w:cs="Arial"/>
+          <w:b/>
+          <w:sz w:val="22"/>
+          <w:szCs w:val="22"/>
+        </w:rPr>
+        <w:t>REPARATION</w:t>
       </w:r>
     </w:p>
     <w:p>
@@ -3857,7 +4544,7 @@
         <w:pStyle w:val="ListParagraph"/>
         <w:numPr>
           <w:ilvl w:val="0"/>
-          <w:numId w:val="55"/>
+          <w:numId w:val="56"/>
         </w:numPr>
         <w:spacing w:before="120" w:after="120"/>
         <w:contextualSpacing w:val="0"/>
@@ -3866,205 +4553,127 @@
           <w:szCs w:val="21"/>
         </w:rPr>
       </w:pPr>
+      <w:r>
+        <w:rPr>
+          <w:rFonts w:ascii="Arial" w:hAnsi="Arial" w:cs="Arial"/>
+          <w:b/>
+          <w:bCs/>
+        </w:rPr>
+        <w:t xml:space="preserve">Liang, B., </w:t>
+      </w:r>
+      <w:r>
+        <w:rPr>
+          <w:rFonts w:ascii="Arial" w:hAnsi="Arial" w:cs="Arial"/>
+        </w:rPr>
+        <w:t xml:space="preserve">Earle-Richardson, A. M., Grant, G., Zafar, M., </w:t>
+      </w:r>
       <w:proofErr w:type="spellStart"/>
       <w:r>
         <w:rPr>
           <w:rFonts w:ascii="Arial" w:hAnsi="Arial" w:cs="Arial"/>
-          <w:szCs w:val="21"/>
-        </w:rPr>
-        <w:t>Weijin</w:t>
+        </w:rPr>
+        <w:t>Frauscher</w:t>
       </w:r>
       <w:proofErr w:type="spellEnd"/>
       <w:r>
         <w:rPr>
           <w:rFonts w:ascii="Arial" w:hAnsi="Arial" w:cs="Arial"/>
-          <w:szCs w:val="21"/>
-        </w:rPr>
-        <w:t xml:space="preserve"> Hu</w:t>
-      </w:r>
-      <w:r>
-        <w:rPr>
-          <w:rFonts w:ascii="Arial" w:hAnsi="Arial" w:cs="Arial"/>
-          <w:szCs w:val="21"/>
-          <w:vertAlign w:val="superscript"/>
-        </w:rPr>
-        <w:t>#</w:t>
-      </w:r>
-      <w:r>
-        <w:rPr>
-          <w:rFonts w:ascii="Arial" w:hAnsi="Arial" w:cs="Arial"/>
-          <w:szCs w:val="21"/>
+        </w:rPr>
+        <w:t>, B., Southwell, D., Hickok, G.</w:t>
+      </w:r>
+      <w:r>
+        <w:rPr>
+          <w:rFonts w:ascii="Arial" w:eastAsiaTheme="minorEastAsia" w:hAnsi="Arial" w:cs="Arial" w:hint="eastAsia"/>
+          <w:lang w:eastAsia="zh-CN"/>
         </w:rPr>
         <w:t xml:space="preserve">, </w:t>
       </w:r>
       <w:r>
         <w:rPr>
           <w:rFonts w:ascii="Arial" w:hAnsi="Arial" w:cs="Arial"/>
+        </w:rPr>
+        <w:t>Cogan, G. B.</w:t>
+      </w:r>
+      <w:r>
+        <w:rPr>
+          <w:rFonts w:ascii="Arial" w:eastAsiaTheme="minorEastAsia" w:hAnsi="Arial" w:cs="Arial" w:hint="eastAsia"/>
+          <w:szCs w:val="21"/>
+        </w:rPr>
+        <w:t xml:space="preserve">* </w:t>
+      </w:r>
+      <w:r>
+        <w:rPr>
+          <w:rFonts w:ascii="Arial" w:eastAsiaTheme="minorEastAsia" w:hAnsi="Arial" w:cs="Arial"/>
+          <w:szCs w:val="21"/>
+        </w:rPr>
+        <w:t>Sensory-motor mechanisms for verbal working memory</w:t>
+      </w:r>
+      <w:r>
+        <w:rPr>
+          <w:rFonts w:ascii="Arial" w:eastAsiaTheme="minorEastAsia" w:hAnsi="Arial" w:cs="Arial" w:hint="eastAsia"/>
+          <w:szCs w:val="21"/>
+        </w:rPr>
+        <w:t xml:space="preserve">. </w:t>
+      </w:r>
+      <w:r>
+        <w:rPr>
+          <w:rFonts w:ascii="Arial" w:eastAsiaTheme="minorEastAsia" w:hAnsi="Arial" w:cs="Arial"/>
           <w:b/>
           <w:bCs/>
           <w:szCs w:val="21"/>
-        </w:rPr>
-        <w:t>Baishen Liang</w:t>
-      </w:r>
-      <w:r>
-        <w:rPr>
-          <w:rFonts w:ascii="Arial" w:hAnsi="Arial" w:cs="Arial"/>
+          <w:lang w:eastAsia="zh-CN"/>
+        </w:rPr>
+        <w:t>In preparation</w:t>
+      </w:r>
+      <w:r>
+        <w:rPr>
+          <w:rFonts w:ascii="Arial" w:eastAsiaTheme="minorEastAsia" w:hAnsi="Arial" w:cs="Arial" w:hint="eastAsia"/>
           <w:b/>
           <w:bCs/>
           <w:szCs w:val="21"/>
-          <w:vertAlign w:val="superscript"/>
-        </w:rPr>
-        <w:t>#</w:t>
-      </w:r>
-      <w:r>
-        <w:rPr>
-          <w:rFonts w:ascii="Arial" w:hAnsi="Arial" w:cs="Arial"/>
-          <w:szCs w:val="21"/>
-        </w:rPr>
-        <w:t>, Yi Du</w:t>
-      </w:r>
-      <w:r>
-        <w:rPr>
-          <w:rFonts w:ascii="Arial" w:eastAsiaTheme="minorEastAsia" w:hAnsi="Arial" w:cs="Arial" w:hint="eastAsia"/>
-          <w:szCs w:val="21"/>
-          <w:lang w:eastAsia="zh-CN"/>
-        </w:rPr>
-        <w:t>*</w:t>
-      </w:r>
-      <w:r>
-        <w:rPr>
-          <w:rFonts w:ascii="Arial" w:hAnsi="Arial" w:cs="Arial" w:hint="eastAsia"/>
-          <w:szCs w:val="21"/>
-        </w:rPr>
-        <w:t xml:space="preserve">, </w:t>
-      </w:r>
-      <w:bookmarkStart w:id="0" w:name="OLE_LINK521"/>
-      <w:bookmarkStart w:id="1" w:name="OLE_LINK520"/>
-      <w:r>
-        <w:rPr>
-          <w:rFonts w:ascii="Arial" w:hAnsi="Arial" w:cs="Arial" w:hint="eastAsia"/>
-          <w:szCs w:val="21"/>
-        </w:rPr>
-        <w:t>Singing e</w:t>
-      </w:r>
-      <w:r>
-        <w:rPr>
-          <w:rFonts w:ascii="Arial" w:hAnsi="Arial" w:cs="Arial"/>
-          <w:szCs w:val="21"/>
-        </w:rPr>
-        <w:t>nhanc</w:t>
-      </w:r>
-      <w:r>
-        <w:rPr>
-          <w:rFonts w:ascii="Arial" w:hAnsi="Arial" w:cs="Arial" w:hint="eastAsia"/>
-          <w:szCs w:val="21"/>
-        </w:rPr>
-        <w:t>es</w:t>
-      </w:r>
-      <w:r>
-        <w:rPr>
-          <w:rFonts w:ascii="Arial" w:hAnsi="Arial" w:cs="Arial"/>
-          <w:szCs w:val="21"/>
+          <w:lang w:eastAsia="zh-CN"/>
+        </w:rPr>
+        <w:t>.</w:t>
+      </w:r>
+      <w:r>
+        <w:rPr>
+          <w:rFonts w:ascii="Arial" w:eastAsiaTheme="minorEastAsia" w:hAnsi="Arial" w:cs="Arial" w:hint="eastAsia"/>
+          <w:szCs w:val="21"/>
+          <w:lang w:eastAsia="zh-CN"/>
         </w:rPr>
         <w:t xml:space="preserve"> </w:t>
       </w:r>
       <w:r>
         <w:rPr>
-          <w:rFonts w:ascii="Arial" w:hAnsi="Arial" w:cs="Arial" w:hint="eastAsia"/>
-          <w:szCs w:val="21"/>
-        </w:rPr>
-        <w:t>p</w:t>
-      </w:r>
-      <w:r>
-        <w:rPr>
-          <w:rFonts w:ascii="Arial" w:hAnsi="Arial" w:cs="Arial"/>
-          <w:szCs w:val="21"/>
-        </w:rPr>
-        <w:t xml:space="preserve">oetry </w:t>
-      </w:r>
-      <w:r>
-        <w:rPr>
-          <w:rFonts w:ascii="Arial" w:hAnsi="Arial" w:cs="Arial" w:hint="eastAsia"/>
-          <w:szCs w:val="21"/>
-        </w:rPr>
-        <w:t>learning and m</w:t>
-      </w:r>
-      <w:r>
-        <w:rPr>
-          <w:rFonts w:ascii="Arial" w:hAnsi="Arial" w:cs="Arial"/>
-          <w:szCs w:val="21"/>
-        </w:rPr>
-        <w:t>emor</w:t>
-      </w:r>
-      <w:r>
-        <w:rPr>
-          <w:rFonts w:ascii="Arial" w:hAnsi="Arial" w:cs="Arial" w:hint="eastAsia"/>
-          <w:szCs w:val="21"/>
-        </w:rPr>
-        <w:t>ization</w:t>
-      </w:r>
-      <w:r>
-        <w:rPr>
-          <w:rFonts w:ascii="Arial" w:hAnsi="Arial" w:cs="Arial"/>
-          <w:szCs w:val="21"/>
-        </w:rPr>
-        <w:t xml:space="preserve"> in </w:t>
-      </w:r>
-      <w:r>
-        <w:rPr>
-          <w:rFonts w:ascii="Arial" w:hAnsi="Arial" w:cs="Arial" w:hint="eastAsia"/>
-          <w:szCs w:val="21"/>
-        </w:rPr>
-        <w:t>preschool</w:t>
-      </w:r>
-      <w:r>
-        <w:rPr>
-          <w:rFonts w:ascii="Arial" w:hAnsi="Arial" w:cs="Arial"/>
-          <w:szCs w:val="21"/>
-        </w:rPr>
-        <w:t xml:space="preserve"> </w:t>
-      </w:r>
-      <w:r>
-        <w:rPr>
-          <w:rFonts w:ascii="Arial" w:hAnsi="Arial" w:cs="Arial" w:hint="eastAsia"/>
-          <w:szCs w:val="21"/>
-        </w:rPr>
-        <w:t>c</w:t>
-      </w:r>
-      <w:r>
-        <w:rPr>
-          <w:rFonts w:ascii="Arial" w:hAnsi="Arial" w:cs="Arial"/>
-          <w:szCs w:val="21"/>
-        </w:rPr>
-        <w:t>hildren</w:t>
-      </w:r>
-      <w:bookmarkEnd w:id="0"/>
-      <w:bookmarkEnd w:id="1"/>
-      <w:r>
-        <w:rPr>
-          <w:rFonts w:ascii="Arial" w:eastAsiaTheme="minorEastAsia" w:hAnsi="Arial" w:cs="Arial" w:hint="eastAsia"/>
-          <w:szCs w:val="21"/>
-          <w:lang w:eastAsia="zh-CN"/>
-        </w:rPr>
-        <w:t xml:space="preserve">. </w:t>
-      </w:r>
-      <w:bookmarkStart w:id="2" w:name="_Hlk211158962"/>
-      <w:r>
-        <w:rPr>
-          <w:rFonts w:ascii="Arial" w:eastAsiaTheme="minorEastAsia" w:hAnsi="Arial" w:cs="Arial" w:hint="eastAsia"/>
-          <w:szCs w:val="21"/>
-          <w:lang w:eastAsia="zh-CN"/>
-        </w:rPr>
-        <w:t>Under review</w:t>
-      </w:r>
-      <w:bookmarkEnd w:id="2"/>
-      <w:r>
-        <w:rPr>
-          <w:rFonts w:ascii="Arial" w:eastAsiaTheme="minorEastAsia" w:hAnsi="Arial" w:cs="Arial" w:hint="eastAsia"/>
-          <w:szCs w:val="21"/>
-          <w:lang w:eastAsia="zh-CN"/>
-        </w:rPr>
-        <w:t>. (Co-first author)</w:t>
+          <w:rFonts w:ascii="Arial" w:eastAsiaTheme="minorEastAsia" w:hAnsi="Arial" w:cs="Arial" w:hint="eastAsia"/>
+          <w:szCs w:val="21"/>
+          <w:lang w:eastAsia="zh-CN"/>
+        </w:rPr>
+        <w:t>[</w:t>
+      </w:r>
+      <w:r>
+        <w:rPr>
+          <w:rFonts w:ascii="Arial" w:eastAsiaTheme="minorEastAsia" w:hAnsi="Arial" w:cs="Arial"/>
+          <w:szCs w:val="21"/>
+          <w:lang w:eastAsia="zh-CN"/>
+        </w:rPr>
+        <w:t>First</w:t>
+      </w:r>
+      <w:r>
+        <w:rPr>
+          <w:rFonts w:ascii="Arial" w:eastAsiaTheme="minorEastAsia" w:hAnsi="Arial" w:cs="Arial" w:hint="eastAsia"/>
+          <w:szCs w:val="21"/>
+          <w:lang w:eastAsia="zh-CN"/>
+        </w:rPr>
+        <w:t xml:space="preserve"> author</w:t>
+      </w:r>
+      <w:r>
+        <w:rPr>
+          <w:rFonts w:ascii="Arial" w:eastAsiaTheme="minorEastAsia" w:hAnsi="Arial" w:cs="Arial" w:hint="eastAsia"/>
+          <w:szCs w:val="21"/>
+          <w:lang w:eastAsia="zh-CN"/>
+        </w:rPr>
+        <w:t>]</w:t>
       </w:r>
     </w:p>
     <w:p>
@@ -4530,12 +5139,16 @@
           <w:rFonts w:ascii="Arial" w:hAnsi="Arial" w:cs="Arial"/>
           <w:b/>
           <w:bCs/>
+          <w:sz w:val="22"/>
+          <w:szCs w:val="22"/>
         </w:rPr>
         <w:t xml:space="preserve">Liang, B., </w:t>
       </w:r>
       <w:r>
         <w:rPr>
           <w:rFonts w:ascii="Arial" w:hAnsi="Arial" w:cs="Arial"/>
+          <w:sz w:val="22"/>
+          <w:szCs w:val="22"/>
         </w:rPr>
         <w:t xml:space="preserve">Earle-Richardson, A. M., Grant, G., Zafar, M., </w:t>
       </w:r>
@@ -4543,6 +5156,8 @@
       <w:r>
         <w:rPr>
           <w:rFonts w:ascii="Arial" w:hAnsi="Arial" w:cs="Arial"/>
+          <w:sz w:val="22"/>
+          <w:szCs w:val="22"/>
         </w:rPr>
         <w:t>Frauscher</w:t>
       </w:r>
@@ -4550,24 +5165,48 @@
       <w:r>
         <w:rPr>
           <w:rFonts w:ascii="Arial" w:hAnsi="Arial" w:cs="Arial"/>
-        </w:rPr>
-        <w:t>, B., Southwell, D., Hickok, G. &amp; Cogan, G. B.</w:t>
-      </w:r>
-      <w:r>
-        <w:rPr>
-          <w:rFonts w:ascii="Arial" w:hAnsi="Arial" w:cs="Arial" w:hint="eastAsia"/>
+          <w:sz w:val="22"/>
+          <w:szCs w:val="22"/>
+        </w:rPr>
+        <w:t>, B., Southwell, D., Hickok, G.</w:t>
+      </w:r>
+      <w:r>
+        <w:rPr>
+          <w:rFonts w:ascii="Arial" w:hAnsi="Arial" w:cs="Arial" w:hint="eastAsia"/>
+          <w:sz w:val="22"/>
+          <w:szCs w:val="22"/>
+        </w:rPr>
+        <w:t xml:space="preserve">, </w:t>
+      </w:r>
+      <w:r>
+        <w:rPr>
+          <w:rFonts w:ascii="Arial" w:hAnsi="Arial" w:cs="Arial"/>
+          <w:sz w:val="22"/>
+          <w:szCs w:val="22"/>
+        </w:rPr>
+        <w:t>Cogan, G. B.</w:t>
+      </w:r>
+      <w:r>
+        <w:rPr>
+          <w:rFonts w:ascii="Arial" w:hAnsi="Arial" w:cs="Arial" w:hint="eastAsia"/>
+          <w:sz w:val="22"/>
+          <w:szCs w:val="22"/>
         </w:rPr>
         <w:t xml:space="preserve">* </w:t>
       </w:r>
       <w:r>
         <w:rPr>
           <w:rFonts w:ascii="Arial" w:hAnsi="Arial" w:cs="Arial"/>
+          <w:sz w:val="22"/>
+          <w:szCs w:val="22"/>
         </w:rPr>
         <w:t>Sensory-motor mechanisms for verbal working memory</w:t>
       </w:r>
       <w:r>
         <w:rPr>
           <w:rFonts w:ascii="Arial" w:hAnsi="Arial" w:cs="Arial" w:hint="eastAsia"/>
+          <w:sz w:val="22"/>
+          <w:szCs w:val="22"/>
         </w:rPr>
         <w:t xml:space="preserve">. </w:t>
       </w:r>
@@ -4706,6 +5345,7 @@
           <w:i/>
           <w:iCs/>
         </w:rPr>
+        <w:lastRenderedPageBreak/>
         <w:t>Advances and Perspectives in Auditory Neuroscience</w:t>
       </w:r>
       <w:r>
@@ -4787,7 +5427,6 @@
           <w:i/>
           <w:iCs/>
         </w:rPr>
-        <w:lastRenderedPageBreak/>
         <w:t>Society for the Neurobiology of Language</w:t>
       </w:r>
       <w:r>
@@ -5831,7 +6470,8 @@
         <w:jc w:val="both"/>
         <w:rPr>
           <w:rFonts w:ascii="Arial" w:eastAsia="KaiTi" w:hAnsi="Arial" w:cs="Arial"/>
-          <w:szCs w:val="21"/>
+          <w:sz w:val="22"/>
+          <w:szCs w:val="22"/>
         </w:rPr>
       </w:pPr>
       <w:r>
@@ -5883,28 +6523,32 @@
       <w:r>
         <w:rPr>
           <w:rFonts w:ascii="Arial" w:eastAsia="KaiTi" w:hAnsi="Arial" w:cs="Arial"/>
-          <w:szCs w:val="21"/>
+          <w:sz w:val="22"/>
+          <w:szCs w:val="22"/>
         </w:rPr>
         <w:t>[</w:t>
       </w:r>
       <w:r>
         <w:rPr>
           <w:rFonts w:ascii="Arial" w:eastAsia="KaiTi" w:hAnsi="Arial" w:cs="Arial" w:hint="eastAsia"/>
-          <w:szCs w:val="21"/>
+          <w:sz w:val="22"/>
+          <w:szCs w:val="22"/>
         </w:rPr>
         <w:t>心理学报</w:t>
       </w:r>
       <w:r>
         <w:rPr>
           <w:rFonts w:ascii="Arial" w:eastAsia="KaiTi" w:hAnsi="Arial" w:cs="Arial"/>
-          <w:szCs w:val="21"/>
+          <w:sz w:val="22"/>
+          <w:szCs w:val="22"/>
         </w:rPr>
         <w:t>]</w:t>
       </w:r>
       <w:r>
         <w:rPr>
           <w:rFonts w:ascii="Arial" w:eastAsia="KaiTi" w:hAnsi="Arial" w:cs="Arial" w:hint="eastAsia"/>
-          <w:szCs w:val="21"/>
+          <w:sz w:val="22"/>
+          <w:szCs w:val="22"/>
         </w:rPr>
         <w:t>, 2024</w:t>
       </w:r>
@@ -6308,6 +6952,7 @@
         <w:rPr>
           <w:rFonts w:ascii="Arial" w:hAnsi="Arial" w:cs="Arial"/>
         </w:rPr>
+        <w:lastRenderedPageBreak/>
         <w:t xml:space="preserve">Transcranial </w:t>
       </w:r>
       <w:r>
@@ -7311,6 +7956,120 @@
     </w:lvl>
   </w:abstractNum>
   <w:abstractNum w:abstractNumId="5" w15:restartNumberingAfterBreak="0">
+    <w:nsid w:val="071B4117"/>
+    <w:multiLevelType w:val="hybridMultilevel"/>
+    <w:tmpl w:val="6A081A38"/>
+    <w:lvl w:ilvl="0" w:tplc="FFFFFFFF">
+      <w:start w:val="1"/>
+      <w:numFmt w:val="decimal"/>
+      <w:lvlText w:val="%1."/>
+      <w:lvlJc w:val="left"/>
+      <w:pPr>
+        <w:ind w:left="720" w:hanging="360"/>
+      </w:pPr>
+      <w:rPr>
+        <w:rFonts w:ascii="Arial" w:eastAsia="SimSun" w:hAnsi="Arial" w:cs="Arial"/>
+        <w:b/>
+      </w:rPr>
+    </w:lvl>
+    <w:lvl w:ilvl="1" w:tplc="FFFFFFFF">
+      <w:start w:val="1"/>
+      <w:numFmt w:val="bullet"/>
+      <w:lvlText w:val="o"/>
+      <w:lvlJc w:val="left"/>
+      <w:pPr>
+        <w:ind w:left="1440" w:hanging="360"/>
+      </w:pPr>
+      <w:rPr>
+        <w:rFonts w:ascii="Courier New" w:hAnsi="Courier New" w:cs="Courier New" w:hint="default"/>
+      </w:rPr>
+    </w:lvl>
+    <w:lvl w:ilvl="2" w:tplc="FFFFFFFF" w:tentative="1">
+      <w:start w:val="1"/>
+      <w:numFmt w:val="bullet"/>
+      <w:lvlText w:val=""/>
+      <w:lvlJc w:val="left"/>
+      <w:pPr>
+        <w:ind w:left="2160" w:hanging="360"/>
+      </w:pPr>
+      <w:rPr>
+        <w:rFonts w:ascii="Wingdings" w:hAnsi="Wingdings" w:hint="default"/>
+      </w:rPr>
+    </w:lvl>
+    <w:lvl w:ilvl="3" w:tplc="FFFFFFFF" w:tentative="1">
+      <w:start w:val="1"/>
+      <w:numFmt w:val="bullet"/>
+      <w:lvlText w:val=""/>
+      <w:lvlJc w:val="left"/>
+      <w:pPr>
+        <w:ind w:left="2880" w:hanging="360"/>
+      </w:pPr>
+      <w:rPr>
+        <w:rFonts w:ascii="Symbol" w:hAnsi="Symbol" w:hint="default"/>
+      </w:rPr>
+    </w:lvl>
+    <w:lvl w:ilvl="4" w:tplc="FFFFFFFF" w:tentative="1">
+      <w:start w:val="1"/>
+      <w:numFmt w:val="bullet"/>
+      <w:lvlText w:val="o"/>
+      <w:lvlJc w:val="left"/>
+      <w:pPr>
+        <w:ind w:left="3600" w:hanging="360"/>
+      </w:pPr>
+      <w:rPr>
+        <w:rFonts w:ascii="Courier New" w:hAnsi="Courier New" w:cs="Courier New" w:hint="default"/>
+      </w:rPr>
+    </w:lvl>
+    <w:lvl w:ilvl="5" w:tplc="FFFFFFFF" w:tentative="1">
+      <w:start w:val="1"/>
+      <w:numFmt w:val="bullet"/>
+      <w:lvlText w:val=""/>
+      <w:lvlJc w:val="left"/>
+      <w:pPr>
+        <w:ind w:left="4320" w:hanging="360"/>
+      </w:pPr>
+      <w:rPr>
+        <w:rFonts w:ascii="Wingdings" w:hAnsi="Wingdings" w:hint="default"/>
+      </w:rPr>
+    </w:lvl>
+    <w:lvl w:ilvl="6" w:tplc="FFFFFFFF" w:tentative="1">
+      <w:start w:val="1"/>
+      <w:numFmt w:val="bullet"/>
+      <w:lvlText w:val=""/>
+      <w:lvlJc w:val="left"/>
+      <w:pPr>
+        <w:ind w:left="5040" w:hanging="360"/>
+      </w:pPr>
+      <w:rPr>
+        <w:rFonts w:ascii="Symbol" w:hAnsi="Symbol" w:hint="default"/>
+      </w:rPr>
+    </w:lvl>
+    <w:lvl w:ilvl="7" w:tplc="FFFFFFFF" w:tentative="1">
+      <w:start w:val="1"/>
+      <w:numFmt w:val="bullet"/>
+      <w:lvlText w:val="o"/>
+      <w:lvlJc w:val="left"/>
+      <w:pPr>
+        <w:ind w:left="5760" w:hanging="360"/>
+      </w:pPr>
+      <w:rPr>
+        <w:rFonts w:ascii="Courier New" w:hAnsi="Courier New" w:cs="Courier New" w:hint="default"/>
+      </w:rPr>
+    </w:lvl>
+    <w:lvl w:ilvl="8" w:tplc="FFFFFFFF" w:tentative="1">
+      <w:start w:val="1"/>
+      <w:numFmt w:val="bullet"/>
+      <w:lvlText w:val=""/>
+      <w:lvlJc w:val="left"/>
+      <w:pPr>
+        <w:ind w:left="6480" w:hanging="360"/>
+      </w:pPr>
+      <w:rPr>
+        <w:rFonts w:ascii="Wingdings" w:hAnsi="Wingdings" w:hint="default"/>
+      </w:rPr>
+    </w:lvl>
+  </w:abstractNum>
+  <w:abstractNum w:abstractNumId="6" w15:restartNumberingAfterBreak="0">
     <w:nsid w:val="076967CE"/>
     <w:multiLevelType w:val="hybridMultilevel"/>
     <w:tmpl w:val="F86A9060"/>
@@ -7423,7 +8182,7 @@
       </w:rPr>
     </w:lvl>
   </w:abstractNum>
-  <w:abstractNum w:abstractNumId="6" w15:restartNumberingAfterBreak="0">
+  <w:abstractNum w:abstractNumId="7" w15:restartNumberingAfterBreak="0">
     <w:nsid w:val="08095FA8"/>
     <w:multiLevelType w:val="multilevel"/>
     <w:tmpl w:val="E26E1D22"/>
@@ -7537,7 +8296,7 @@
       </w:rPr>
     </w:lvl>
   </w:abstractNum>
-  <w:abstractNum w:abstractNumId="7" w15:restartNumberingAfterBreak="0">
+  <w:abstractNum w:abstractNumId="8" w15:restartNumberingAfterBreak="0">
     <w:nsid w:val="088F7885"/>
     <w:multiLevelType w:val="hybridMultilevel"/>
     <w:tmpl w:val="D33C4042"/>
@@ -7651,7 +8410,7 @@
       </w:rPr>
     </w:lvl>
   </w:abstractNum>
-  <w:abstractNum w:abstractNumId="8" w15:restartNumberingAfterBreak="0">
+  <w:abstractNum w:abstractNumId="9" w15:restartNumberingAfterBreak="0">
     <w:nsid w:val="08ED0AF6"/>
     <w:multiLevelType w:val="hybridMultilevel"/>
     <w:tmpl w:val="4C781B28"/>
@@ -7764,7 +8523,7 @@
       </w:rPr>
     </w:lvl>
   </w:abstractNum>
-  <w:abstractNum w:abstractNumId="9" w15:restartNumberingAfterBreak="0">
+  <w:abstractNum w:abstractNumId="10" w15:restartNumberingAfterBreak="0">
     <w:nsid w:val="0E725CD0"/>
     <w:multiLevelType w:val="hybridMultilevel"/>
     <w:tmpl w:val="AE1E28AC"/>
@@ -7877,7 +8636,7 @@
       </w:rPr>
     </w:lvl>
   </w:abstractNum>
-  <w:abstractNum w:abstractNumId="10" w15:restartNumberingAfterBreak="0">
+  <w:abstractNum w:abstractNumId="11" w15:restartNumberingAfterBreak="0">
     <w:nsid w:val="14C1560B"/>
     <w:multiLevelType w:val="hybridMultilevel"/>
     <w:tmpl w:val="C6400F82"/>
@@ -7990,7 +8749,7 @@
       </w:rPr>
     </w:lvl>
   </w:abstractNum>
-  <w:abstractNum w:abstractNumId="11" w15:restartNumberingAfterBreak="0">
+  <w:abstractNum w:abstractNumId="12" w15:restartNumberingAfterBreak="0">
     <w:nsid w:val="19975F6F"/>
     <w:multiLevelType w:val="hybridMultilevel"/>
     <w:tmpl w:val="E99CC41E"/>
@@ -8103,7 +8862,7 @@
       </w:rPr>
     </w:lvl>
   </w:abstractNum>
-  <w:abstractNum w:abstractNumId="12" w15:restartNumberingAfterBreak="0">
+  <w:abstractNum w:abstractNumId="13" w15:restartNumberingAfterBreak="0">
     <w:nsid w:val="1D6D079D"/>
     <w:multiLevelType w:val="hybridMultilevel"/>
     <w:tmpl w:val="B5B0CB6A"/>
@@ -8194,7 +8953,7 @@
       </w:pPr>
     </w:lvl>
   </w:abstractNum>
-  <w:abstractNum w:abstractNumId="13" w15:restartNumberingAfterBreak="0">
+  <w:abstractNum w:abstractNumId="14" w15:restartNumberingAfterBreak="0">
     <w:nsid w:val="1EE5642C"/>
     <w:multiLevelType w:val="hybridMultilevel"/>
     <w:tmpl w:val="83E6760A"/>
@@ -8307,7 +9066,7 @@
       </w:rPr>
     </w:lvl>
   </w:abstractNum>
-  <w:abstractNum w:abstractNumId="14" w15:restartNumberingAfterBreak="0">
+  <w:abstractNum w:abstractNumId="15" w15:restartNumberingAfterBreak="0">
     <w:nsid w:val="25D932EC"/>
     <w:multiLevelType w:val="hybridMultilevel"/>
     <w:tmpl w:val="152E0594"/>
@@ -8447,7 +9206,7 @@
       </w:rPr>
     </w:lvl>
   </w:abstractNum>
-  <w:abstractNum w:abstractNumId="15" w15:restartNumberingAfterBreak="0">
+  <w:abstractNum w:abstractNumId="16" w15:restartNumberingAfterBreak="0">
     <w:nsid w:val="28CF43C4"/>
     <w:multiLevelType w:val="multilevel"/>
     <w:tmpl w:val="E26E1D22"/>
@@ -8561,7 +9320,7 @@
       </w:rPr>
     </w:lvl>
   </w:abstractNum>
-  <w:abstractNum w:abstractNumId="16" w15:restartNumberingAfterBreak="0">
+  <w:abstractNum w:abstractNumId="17" w15:restartNumberingAfterBreak="0">
     <w:nsid w:val="2BF20C99"/>
     <w:multiLevelType w:val="hybridMultilevel"/>
     <w:tmpl w:val="E7347AC0"/>
@@ -8674,7 +9433,7 @@
       </w:rPr>
     </w:lvl>
   </w:abstractNum>
-  <w:abstractNum w:abstractNumId="17" w15:restartNumberingAfterBreak="0">
+  <w:abstractNum w:abstractNumId="18" w15:restartNumberingAfterBreak="0">
     <w:nsid w:val="30FF5702"/>
     <w:multiLevelType w:val="hybridMultilevel"/>
     <w:tmpl w:val="4582E436"/>
@@ -8787,7 +9546,7 @@
       </w:rPr>
     </w:lvl>
   </w:abstractNum>
-  <w:abstractNum w:abstractNumId="18" w15:restartNumberingAfterBreak="0">
+  <w:abstractNum w:abstractNumId="19" w15:restartNumberingAfterBreak="0">
     <w:nsid w:val="355C3CE0"/>
     <w:multiLevelType w:val="hybridMultilevel"/>
     <w:tmpl w:val="35E617BC"/>
@@ -8901,7 +9660,7 @@
       </w:rPr>
     </w:lvl>
   </w:abstractNum>
-  <w:abstractNum w:abstractNumId="19" w15:restartNumberingAfterBreak="0">
+  <w:abstractNum w:abstractNumId="20" w15:restartNumberingAfterBreak="0">
     <w:nsid w:val="3583291C"/>
     <w:multiLevelType w:val="hybridMultilevel"/>
     <w:tmpl w:val="F990A0D0"/>
@@ -9014,7 +9773,7 @@
       </w:rPr>
     </w:lvl>
   </w:abstractNum>
-  <w:abstractNum w:abstractNumId="20" w15:restartNumberingAfterBreak="0">
+  <w:abstractNum w:abstractNumId="21" w15:restartNumberingAfterBreak="0">
     <w:nsid w:val="36C7260B"/>
     <w:multiLevelType w:val="hybridMultilevel"/>
     <w:tmpl w:val="6A081A38"/>
@@ -9128,7 +9887,7 @@
       </w:rPr>
     </w:lvl>
   </w:abstractNum>
-  <w:abstractNum w:abstractNumId="21" w15:restartNumberingAfterBreak="0">
+  <w:abstractNum w:abstractNumId="22" w15:restartNumberingAfterBreak="0">
     <w:nsid w:val="37B0089F"/>
     <w:multiLevelType w:val="hybridMultilevel"/>
     <w:tmpl w:val="CBD666B6"/>
@@ -9268,7 +10027,7 @@
       </w:rPr>
     </w:lvl>
   </w:abstractNum>
-  <w:abstractNum w:abstractNumId="22" w15:restartNumberingAfterBreak="0">
+  <w:abstractNum w:abstractNumId="23" w15:restartNumberingAfterBreak="0">
     <w:nsid w:val="37DF18BB"/>
     <w:multiLevelType w:val="hybridMultilevel"/>
     <w:tmpl w:val="589E0D8A"/>
@@ -9381,7 +10140,7 @@
       </w:rPr>
     </w:lvl>
   </w:abstractNum>
-  <w:abstractNum w:abstractNumId="23" w15:restartNumberingAfterBreak="0">
+  <w:abstractNum w:abstractNumId="24" w15:restartNumberingAfterBreak="0">
     <w:nsid w:val="380F5269"/>
     <w:multiLevelType w:val="hybridMultilevel"/>
     <w:tmpl w:val="A728315C"/>
@@ -9494,7 +10253,7 @@
       </w:pPr>
     </w:lvl>
   </w:abstractNum>
-  <w:abstractNum w:abstractNumId="24" w15:restartNumberingAfterBreak="0">
+  <w:abstractNum w:abstractNumId="25" w15:restartNumberingAfterBreak="0">
     <w:nsid w:val="38722CDF"/>
     <w:multiLevelType w:val="hybridMultilevel"/>
     <w:tmpl w:val="375AF574"/>
@@ -9607,7 +10366,7 @@
       </w:rPr>
     </w:lvl>
   </w:abstractNum>
-  <w:abstractNum w:abstractNumId="25" w15:restartNumberingAfterBreak="0">
+  <w:abstractNum w:abstractNumId="26" w15:restartNumberingAfterBreak="0">
     <w:nsid w:val="402A4D92"/>
     <w:multiLevelType w:val="hybridMultilevel"/>
     <w:tmpl w:val="1E10B8E6"/>
@@ -9747,7 +10506,7 @@
       </w:rPr>
     </w:lvl>
   </w:abstractNum>
-  <w:abstractNum w:abstractNumId="26" w15:restartNumberingAfterBreak="0">
+  <w:abstractNum w:abstractNumId="27" w15:restartNumberingAfterBreak="0">
     <w:nsid w:val="42BD1DEA"/>
     <w:multiLevelType w:val="hybridMultilevel"/>
     <w:tmpl w:val="AEA2EF36"/>
@@ -9860,7 +10619,7 @@
       </w:rPr>
     </w:lvl>
   </w:abstractNum>
-  <w:abstractNum w:abstractNumId="27" w15:restartNumberingAfterBreak="0">
+  <w:abstractNum w:abstractNumId="28" w15:restartNumberingAfterBreak="0">
     <w:nsid w:val="42E91B4D"/>
     <w:multiLevelType w:val="hybridMultilevel"/>
     <w:tmpl w:val="1E98EEF8"/>
@@ -9973,7 +10732,7 @@
       </w:rPr>
     </w:lvl>
   </w:abstractNum>
-  <w:abstractNum w:abstractNumId="28" w15:restartNumberingAfterBreak="0">
+  <w:abstractNum w:abstractNumId="29" w15:restartNumberingAfterBreak="0">
     <w:nsid w:val="45516E66"/>
     <w:multiLevelType w:val="hybridMultilevel"/>
     <w:tmpl w:val="2CE0ED3E"/>
@@ -10086,7 +10845,7 @@
       </w:rPr>
     </w:lvl>
   </w:abstractNum>
-  <w:abstractNum w:abstractNumId="29" w15:restartNumberingAfterBreak="0">
+  <w:abstractNum w:abstractNumId="30" w15:restartNumberingAfterBreak="0">
     <w:nsid w:val="45576514"/>
     <w:multiLevelType w:val="hybridMultilevel"/>
     <w:tmpl w:val="E83E2436"/>
@@ -10199,7 +10958,7 @@
       </w:rPr>
     </w:lvl>
   </w:abstractNum>
-  <w:abstractNum w:abstractNumId="30" w15:restartNumberingAfterBreak="0">
+  <w:abstractNum w:abstractNumId="31" w15:restartNumberingAfterBreak="0">
     <w:nsid w:val="47106BBB"/>
     <w:multiLevelType w:val="hybridMultilevel"/>
     <w:tmpl w:val="3CC821F2"/>
@@ -10312,7 +11071,7 @@
       </w:rPr>
     </w:lvl>
   </w:abstractNum>
-  <w:abstractNum w:abstractNumId="31" w15:restartNumberingAfterBreak="0">
+  <w:abstractNum w:abstractNumId="32" w15:restartNumberingAfterBreak="0">
     <w:nsid w:val="472060CA"/>
     <w:multiLevelType w:val="hybridMultilevel"/>
     <w:tmpl w:val="0298E494"/>
@@ -10424,7 +11183,121 @@
       </w:rPr>
     </w:lvl>
   </w:abstractNum>
-  <w:abstractNum w:abstractNumId="32" w15:restartNumberingAfterBreak="0">
+  <w:abstractNum w:abstractNumId="33" w15:restartNumberingAfterBreak="0">
+    <w:nsid w:val="48C44E36"/>
+    <w:multiLevelType w:val="hybridMultilevel"/>
+    <w:tmpl w:val="6A081A38"/>
+    <w:lvl w:ilvl="0" w:tplc="FFFFFFFF">
+      <w:start w:val="1"/>
+      <w:numFmt w:val="decimal"/>
+      <w:lvlText w:val="%1."/>
+      <w:lvlJc w:val="left"/>
+      <w:pPr>
+        <w:ind w:left="720" w:hanging="360"/>
+      </w:pPr>
+      <w:rPr>
+        <w:rFonts w:ascii="Arial" w:eastAsia="SimSun" w:hAnsi="Arial" w:cs="Arial"/>
+        <w:b/>
+      </w:rPr>
+    </w:lvl>
+    <w:lvl w:ilvl="1" w:tplc="FFFFFFFF">
+      <w:start w:val="1"/>
+      <w:numFmt w:val="bullet"/>
+      <w:lvlText w:val="o"/>
+      <w:lvlJc w:val="left"/>
+      <w:pPr>
+        <w:ind w:left="1440" w:hanging="360"/>
+      </w:pPr>
+      <w:rPr>
+        <w:rFonts w:ascii="Courier New" w:hAnsi="Courier New" w:cs="Courier New" w:hint="default"/>
+      </w:rPr>
+    </w:lvl>
+    <w:lvl w:ilvl="2" w:tplc="FFFFFFFF" w:tentative="1">
+      <w:start w:val="1"/>
+      <w:numFmt w:val="bullet"/>
+      <w:lvlText w:val=""/>
+      <w:lvlJc w:val="left"/>
+      <w:pPr>
+        <w:ind w:left="2160" w:hanging="360"/>
+      </w:pPr>
+      <w:rPr>
+        <w:rFonts w:ascii="Wingdings" w:hAnsi="Wingdings" w:hint="default"/>
+      </w:rPr>
+    </w:lvl>
+    <w:lvl w:ilvl="3" w:tplc="FFFFFFFF" w:tentative="1">
+      <w:start w:val="1"/>
+      <w:numFmt w:val="bullet"/>
+      <w:lvlText w:val=""/>
+      <w:lvlJc w:val="left"/>
+      <w:pPr>
+        <w:ind w:left="2880" w:hanging="360"/>
+      </w:pPr>
+      <w:rPr>
+        <w:rFonts w:ascii="Symbol" w:hAnsi="Symbol" w:hint="default"/>
+      </w:rPr>
+    </w:lvl>
+    <w:lvl w:ilvl="4" w:tplc="FFFFFFFF" w:tentative="1">
+      <w:start w:val="1"/>
+      <w:numFmt w:val="bullet"/>
+      <w:lvlText w:val="o"/>
+      <w:lvlJc w:val="left"/>
+      <w:pPr>
+        <w:ind w:left="3600" w:hanging="360"/>
+      </w:pPr>
+      <w:rPr>
+        <w:rFonts w:ascii="Courier New" w:hAnsi="Courier New" w:cs="Courier New" w:hint="default"/>
+      </w:rPr>
+    </w:lvl>
+    <w:lvl w:ilvl="5" w:tplc="FFFFFFFF" w:tentative="1">
+      <w:start w:val="1"/>
+      <w:numFmt w:val="bullet"/>
+      <w:lvlText w:val=""/>
+      <w:lvlJc w:val="left"/>
+      <w:pPr>
+        <w:ind w:left="4320" w:hanging="360"/>
+      </w:pPr>
+      <w:rPr>
+        <w:rFonts w:ascii="Wingdings" w:hAnsi="Wingdings" w:hint="default"/>
+      </w:rPr>
+    </w:lvl>
+    <w:lvl w:ilvl="6" w:tplc="FFFFFFFF" w:tentative="1">
+      <w:start w:val="1"/>
+      <w:numFmt w:val="bullet"/>
+      <w:lvlText w:val=""/>
+      <w:lvlJc w:val="left"/>
+      <w:pPr>
+        <w:ind w:left="5040" w:hanging="360"/>
+      </w:pPr>
+      <w:rPr>
+        <w:rFonts w:ascii="Symbol" w:hAnsi="Symbol" w:hint="default"/>
+      </w:rPr>
+    </w:lvl>
+    <w:lvl w:ilvl="7" w:tplc="FFFFFFFF" w:tentative="1">
+      <w:start w:val="1"/>
+      <w:numFmt w:val="bullet"/>
+      <w:lvlText w:val="o"/>
+      <w:lvlJc w:val="left"/>
+      <w:pPr>
+        <w:ind w:left="5760" w:hanging="360"/>
+      </w:pPr>
+      <w:rPr>
+        <w:rFonts w:ascii="Courier New" w:hAnsi="Courier New" w:cs="Courier New" w:hint="default"/>
+      </w:rPr>
+    </w:lvl>
+    <w:lvl w:ilvl="8" w:tplc="FFFFFFFF" w:tentative="1">
+      <w:start w:val="1"/>
+      <w:numFmt w:val="bullet"/>
+      <w:lvlText w:val=""/>
+      <w:lvlJc w:val="left"/>
+      <w:pPr>
+        <w:ind w:left="6480" w:hanging="360"/>
+      </w:pPr>
+      <w:rPr>
+        <w:rFonts w:ascii="Wingdings" w:hAnsi="Wingdings" w:hint="default"/>
+      </w:rPr>
+    </w:lvl>
+  </w:abstractNum>
+  <w:abstractNum w:abstractNumId="34" w15:restartNumberingAfterBreak="0">
     <w:nsid w:val="48CF747E"/>
     <w:multiLevelType w:val="hybridMultilevel"/>
     <w:tmpl w:val="4740CFC2"/>
@@ -10514,7 +11387,7 @@
       </w:pPr>
     </w:lvl>
   </w:abstractNum>
-  <w:abstractNum w:abstractNumId="33" w15:restartNumberingAfterBreak="0">
+  <w:abstractNum w:abstractNumId="35" w15:restartNumberingAfterBreak="0">
     <w:nsid w:val="545B6E29"/>
     <w:multiLevelType w:val="hybridMultilevel"/>
     <w:tmpl w:val="6A081A38"/>
@@ -10628,7 +11501,7 @@
       </w:rPr>
     </w:lvl>
   </w:abstractNum>
-  <w:abstractNum w:abstractNumId="34" w15:restartNumberingAfterBreak="0">
+  <w:abstractNum w:abstractNumId="36" w15:restartNumberingAfterBreak="0">
     <w:nsid w:val="5A0A785E"/>
     <w:multiLevelType w:val="multilevel"/>
     <w:tmpl w:val="E26E1D22"/>
@@ -10742,7 +11615,7 @@
       </w:rPr>
     </w:lvl>
   </w:abstractNum>
-  <w:abstractNum w:abstractNumId="35" w15:restartNumberingAfterBreak="0">
+  <w:abstractNum w:abstractNumId="37" w15:restartNumberingAfterBreak="0">
     <w:nsid w:val="5D34614D"/>
     <w:multiLevelType w:val="hybridMultilevel"/>
     <w:tmpl w:val="3B047FE8"/>
@@ -10855,7 +11728,7 @@
       </w:rPr>
     </w:lvl>
   </w:abstractNum>
-  <w:abstractNum w:abstractNumId="36" w15:restartNumberingAfterBreak="0">
+  <w:abstractNum w:abstractNumId="38" w15:restartNumberingAfterBreak="0">
     <w:nsid w:val="5EA940C4"/>
     <w:multiLevelType w:val="hybridMultilevel"/>
     <w:tmpl w:val="C2106C4E"/>
@@ -10998,7 +11871,7 @@
       </w:rPr>
     </w:lvl>
   </w:abstractNum>
-  <w:abstractNum w:abstractNumId="37" w15:restartNumberingAfterBreak="0">
+  <w:abstractNum w:abstractNumId="39" w15:restartNumberingAfterBreak="0">
     <w:nsid w:val="5EDF4F1A"/>
     <w:multiLevelType w:val="hybridMultilevel"/>
     <w:tmpl w:val="9D6844F2"/>
@@ -11138,7 +12011,7 @@
       </w:rPr>
     </w:lvl>
   </w:abstractNum>
-  <w:abstractNum w:abstractNumId="38" w15:restartNumberingAfterBreak="0">
+  <w:abstractNum w:abstractNumId="40" w15:restartNumberingAfterBreak="0">
     <w:nsid w:val="63870FA4"/>
     <w:multiLevelType w:val="hybridMultilevel"/>
     <w:tmpl w:val="6FE06B40"/>
@@ -11224,7 +12097,7 @@
       </w:pPr>
     </w:lvl>
   </w:abstractNum>
-  <w:abstractNum w:abstractNumId="39" w15:restartNumberingAfterBreak="0">
+  <w:abstractNum w:abstractNumId="41" w15:restartNumberingAfterBreak="0">
     <w:nsid w:val="656D64C5"/>
     <w:multiLevelType w:val="hybridMultilevel"/>
     <w:tmpl w:val="36CC76BE"/>
@@ -11337,7 +12210,7 @@
       </w:rPr>
     </w:lvl>
   </w:abstractNum>
-  <w:abstractNum w:abstractNumId="40" w15:restartNumberingAfterBreak="0">
+  <w:abstractNum w:abstractNumId="42" w15:restartNumberingAfterBreak="0">
     <w:nsid w:val="67EE6F0A"/>
     <w:multiLevelType w:val="hybridMultilevel"/>
     <w:tmpl w:val="58BC8C36"/>
@@ -11480,7 +12353,7 @@
       </w:rPr>
     </w:lvl>
   </w:abstractNum>
-  <w:abstractNum w:abstractNumId="41" w15:restartNumberingAfterBreak="0">
+  <w:abstractNum w:abstractNumId="43" w15:restartNumberingAfterBreak="0">
     <w:nsid w:val="6A2A1C2A"/>
     <w:multiLevelType w:val="hybridMultilevel"/>
     <w:tmpl w:val="6DEA068E"/>
@@ -11593,7 +12466,7 @@
       </w:rPr>
     </w:lvl>
   </w:abstractNum>
-  <w:abstractNum w:abstractNumId="42" w15:restartNumberingAfterBreak="0">
+  <w:abstractNum w:abstractNumId="44" w15:restartNumberingAfterBreak="0">
     <w:nsid w:val="6E56227E"/>
     <w:multiLevelType w:val="hybridMultilevel"/>
     <w:tmpl w:val="CD9453A2"/>
@@ -11706,7 +12579,7 @@
       </w:rPr>
     </w:lvl>
   </w:abstractNum>
-  <w:abstractNum w:abstractNumId="43" w15:restartNumberingAfterBreak="0">
+  <w:abstractNum w:abstractNumId="45" w15:restartNumberingAfterBreak="0">
     <w:nsid w:val="6F880945"/>
     <w:multiLevelType w:val="hybridMultilevel"/>
     <w:tmpl w:val="7F10E590"/>
@@ -11818,7 +12691,7 @@
       </w:rPr>
     </w:lvl>
   </w:abstractNum>
-  <w:abstractNum w:abstractNumId="44" w15:restartNumberingAfterBreak="0">
+  <w:abstractNum w:abstractNumId="46" w15:restartNumberingAfterBreak="0">
     <w:nsid w:val="70872AB2"/>
     <w:multiLevelType w:val="hybridMultilevel"/>
     <w:tmpl w:val="74D46004"/>
@@ -11931,7 +12804,7 @@
       </w:pPr>
     </w:lvl>
   </w:abstractNum>
-  <w:abstractNum w:abstractNumId="45" w15:restartNumberingAfterBreak="0">
+  <w:abstractNum w:abstractNumId="47" w15:restartNumberingAfterBreak="0">
     <w:nsid w:val="71324E07"/>
     <w:multiLevelType w:val="hybridMultilevel"/>
     <w:tmpl w:val="37E237C4"/>
@@ -12017,7 +12890,7 @@
       </w:pPr>
     </w:lvl>
   </w:abstractNum>
-  <w:abstractNum w:abstractNumId="46" w15:restartNumberingAfterBreak="0">
+  <w:abstractNum w:abstractNumId="48" w15:restartNumberingAfterBreak="0">
     <w:nsid w:val="73EB538F"/>
     <w:multiLevelType w:val="hybridMultilevel"/>
     <w:tmpl w:val="DB7E348C"/>
@@ -12130,7 +13003,7 @@
       </w:rPr>
     </w:lvl>
   </w:abstractNum>
-  <w:abstractNum w:abstractNumId="47" w15:restartNumberingAfterBreak="0">
+  <w:abstractNum w:abstractNumId="49" w15:restartNumberingAfterBreak="0">
     <w:nsid w:val="77F678D6"/>
     <w:multiLevelType w:val="hybridMultilevel"/>
     <w:tmpl w:val="3CAACC1C"/>
@@ -12243,7 +13116,7 @@
       </w:rPr>
     </w:lvl>
   </w:abstractNum>
-  <w:abstractNum w:abstractNumId="48" w15:restartNumberingAfterBreak="0">
+  <w:abstractNum w:abstractNumId="50" w15:restartNumberingAfterBreak="0">
     <w:nsid w:val="788150FD"/>
     <w:multiLevelType w:val="hybridMultilevel"/>
     <w:tmpl w:val="8C7AACFE"/>
@@ -12356,7 +13229,7 @@
       </w:rPr>
     </w:lvl>
   </w:abstractNum>
-  <w:abstractNum w:abstractNumId="49" w15:restartNumberingAfterBreak="0">
+  <w:abstractNum w:abstractNumId="51" w15:restartNumberingAfterBreak="0">
     <w:nsid w:val="799C3307"/>
     <w:multiLevelType w:val="hybridMultilevel"/>
     <w:tmpl w:val="87AE8350"/>
@@ -12442,7 +13315,7 @@
       </w:pPr>
     </w:lvl>
   </w:abstractNum>
-  <w:abstractNum w:abstractNumId="50" w15:restartNumberingAfterBreak="0">
+  <w:abstractNum w:abstractNumId="52" w15:restartNumberingAfterBreak="0">
     <w:nsid w:val="7A6A1623"/>
     <w:multiLevelType w:val="hybridMultilevel"/>
     <w:tmpl w:val="0DFCCCFA"/>
@@ -12555,7 +13428,7 @@
       </w:rPr>
     </w:lvl>
   </w:abstractNum>
-  <w:abstractNum w:abstractNumId="51" w15:restartNumberingAfterBreak="0">
+  <w:abstractNum w:abstractNumId="53" w15:restartNumberingAfterBreak="0">
     <w:nsid w:val="7BC17090"/>
     <w:multiLevelType w:val="hybridMultilevel"/>
     <w:tmpl w:val="2A242F04"/>
@@ -12668,7 +13541,7 @@
       </w:rPr>
     </w:lvl>
   </w:abstractNum>
-  <w:abstractNum w:abstractNumId="52" w15:restartNumberingAfterBreak="0">
+  <w:abstractNum w:abstractNumId="54" w15:restartNumberingAfterBreak="0">
     <w:nsid w:val="7DC008A1"/>
     <w:multiLevelType w:val="hybridMultilevel"/>
     <w:tmpl w:val="715AF998"/>
@@ -12808,7 +13681,7 @@
       </w:rPr>
     </w:lvl>
   </w:abstractNum>
-  <w:abstractNum w:abstractNumId="53" w15:restartNumberingAfterBreak="0">
+  <w:abstractNum w:abstractNumId="55" w15:restartNumberingAfterBreak="0">
     <w:nsid w:val="7EB53D3A"/>
     <w:multiLevelType w:val="multilevel"/>
     <w:tmpl w:val="E26E1D22"/>
@@ -12922,7 +13795,7 @@
       </w:rPr>
     </w:lvl>
   </w:abstractNum>
-  <w:abstractNum w:abstractNumId="54" w15:restartNumberingAfterBreak="0">
+  <w:abstractNum w:abstractNumId="56" w15:restartNumberingAfterBreak="0">
     <w:nsid w:val="7F89034F"/>
     <w:multiLevelType w:val="hybridMultilevel"/>
     <w:tmpl w:val="561C0A36"/>
@@ -13063,169 +13936,175 @@
     </w:lvl>
   </w:abstractNum>
   <w:num w:numId="1" w16cid:durableId="841891862">
-    <w:abstractNumId w:val="24"/>
+    <w:abstractNumId w:val="25"/>
   </w:num>
   <w:num w:numId="2" w16cid:durableId="1070880372">
-    <w:abstractNumId w:val="46"/>
+    <w:abstractNumId w:val="48"/>
   </w:num>
   <w:num w:numId="3" w16cid:durableId="923295658">
-    <w:abstractNumId w:val="18"/>
+    <w:abstractNumId w:val="19"/>
   </w:num>
   <w:num w:numId="4" w16cid:durableId="1910455675">
-    <w:abstractNumId w:val="7"/>
+    <w:abstractNumId w:val="8"/>
   </w:num>
   <w:num w:numId="5" w16cid:durableId="1668052413">
-    <w:abstractNumId w:val="50"/>
+    <w:abstractNumId w:val="52"/>
   </w:num>
   <w:num w:numId="6" w16cid:durableId="1665832">
+    <w:abstractNumId w:val="15"/>
+  </w:num>
+  <w:num w:numId="7" w16cid:durableId="1789083969">
+    <w:abstractNumId w:val="41"/>
+  </w:num>
+  <w:num w:numId="8" w16cid:durableId="716322071">
+    <w:abstractNumId w:val="26"/>
+  </w:num>
+  <w:num w:numId="9" w16cid:durableId="978532255">
+    <w:abstractNumId w:val="22"/>
+  </w:num>
+  <w:num w:numId="10" w16cid:durableId="1366102262">
+    <w:abstractNumId w:val="10"/>
+  </w:num>
+  <w:num w:numId="11" w16cid:durableId="1915234305">
+    <w:abstractNumId w:val="29"/>
+  </w:num>
+  <w:num w:numId="12" w16cid:durableId="1248735454">
+    <w:abstractNumId w:val="30"/>
+  </w:num>
+  <w:num w:numId="13" w16cid:durableId="9993969">
+    <w:abstractNumId w:val="39"/>
+  </w:num>
+  <w:num w:numId="14" w16cid:durableId="2081714184">
+    <w:abstractNumId w:val="12"/>
+  </w:num>
+  <w:num w:numId="15" w16cid:durableId="735321981">
     <w:abstractNumId w:val="14"/>
   </w:num>
-  <w:num w:numId="7" w16cid:durableId="1789083969">
-    <w:abstractNumId w:val="39"/>
-  </w:num>
-  <w:num w:numId="8" w16cid:durableId="716322071">
-    <w:abstractNumId w:val="25"/>
-  </w:num>
-  <w:num w:numId="9" w16cid:durableId="978532255">
-    <w:abstractNumId w:val="21"/>
-  </w:num>
-  <w:num w:numId="10" w16cid:durableId="1366102262">
-    <w:abstractNumId w:val="9"/>
-  </w:num>
-  <w:num w:numId="11" w16cid:durableId="1915234305">
-    <w:abstractNumId w:val="28"/>
-  </w:num>
-  <w:num w:numId="12" w16cid:durableId="1248735454">
-    <w:abstractNumId w:val="29"/>
-  </w:num>
-  <w:num w:numId="13" w16cid:durableId="9993969">
-    <w:abstractNumId w:val="37"/>
-  </w:num>
-  <w:num w:numId="14" w16cid:durableId="2081714184">
-    <w:abstractNumId w:val="11"/>
-  </w:num>
-  <w:num w:numId="15" w16cid:durableId="735321981">
-    <w:abstractNumId w:val="13"/>
-  </w:num>
   <w:num w:numId="16" w16cid:durableId="1953629912">
-    <w:abstractNumId w:val="38"/>
+    <w:abstractNumId w:val="40"/>
   </w:num>
   <w:num w:numId="17" w16cid:durableId="701439888">
-    <w:abstractNumId w:val="49"/>
+    <w:abstractNumId w:val="51"/>
   </w:num>
   <w:num w:numId="18" w16cid:durableId="714736673">
-    <w:abstractNumId w:val="45"/>
+    <w:abstractNumId w:val="47"/>
   </w:num>
   <w:num w:numId="19" w16cid:durableId="1461995765">
-    <w:abstractNumId w:val="42"/>
+    <w:abstractNumId w:val="44"/>
   </w:num>
   <w:num w:numId="20" w16cid:durableId="1033919205">
     <w:abstractNumId w:val="2"/>
   </w:num>
   <w:num w:numId="21" w16cid:durableId="469834722">
-    <w:abstractNumId w:val="26"/>
+    <w:abstractNumId w:val="27"/>
   </w:num>
   <w:num w:numId="22" w16cid:durableId="1600407968">
-    <w:abstractNumId w:val="22"/>
+    <w:abstractNumId w:val="23"/>
   </w:num>
   <w:num w:numId="23" w16cid:durableId="1935815916">
-    <w:abstractNumId w:val="27"/>
+    <w:abstractNumId w:val="28"/>
   </w:num>
   <w:num w:numId="24" w16cid:durableId="74136793">
-    <w:abstractNumId w:val="52"/>
+    <w:abstractNumId w:val="54"/>
   </w:num>
   <w:num w:numId="25" w16cid:durableId="99647219">
-    <w:abstractNumId w:val="44"/>
+    <w:abstractNumId w:val="46"/>
   </w:num>
   <w:num w:numId="26" w16cid:durableId="2026439725">
-    <w:abstractNumId w:val="23"/>
+    <w:abstractNumId w:val="24"/>
   </w:num>
   <w:num w:numId="27" w16cid:durableId="1685084602">
-    <w:abstractNumId w:val="36"/>
+    <w:abstractNumId w:val="38"/>
   </w:num>
   <w:num w:numId="28" w16cid:durableId="1672174000">
-    <w:abstractNumId w:val="54"/>
+    <w:abstractNumId w:val="56"/>
   </w:num>
   <w:num w:numId="29" w16cid:durableId="539167494">
-    <w:abstractNumId w:val="40"/>
+    <w:abstractNumId w:val="42"/>
   </w:num>
   <w:num w:numId="30" w16cid:durableId="883567319">
-    <w:abstractNumId w:val="17"/>
+    <w:abstractNumId w:val="18"/>
   </w:num>
   <w:num w:numId="31" w16cid:durableId="1058286328">
-    <w:abstractNumId w:val="33"/>
+    <w:abstractNumId w:val="35"/>
   </w:num>
   <w:num w:numId="32" w16cid:durableId="1568881810">
-    <w:abstractNumId w:val="19"/>
+    <w:abstractNumId w:val="20"/>
   </w:num>
   <w:num w:numId="33" w16cid:durableId="2132281442">
     <w:abstractNumId w:val="3"/>
   </w:num>
   <w:num w:numId="34" w16cid:durableId="1427075045">
-    <w:abstractNumId w:val="16"/>
+    <w:abstractNumId w:val="17"/>
   </w:num>
   <w:num w:numId="35" w16cid:durableId="984549694">
     <w:abstractNumId w:val="0"/>
   </w:num>
   <w:num w:numId="36" w16cid:durableId="1676377471">
-    <w:abstractNumId w:val="35"/>
+    <w:abstractNumId w:val="37"/>
   </w:num>
   <w:num w:numId="37" w16cid:durableId="1073308495">
-    <w:abstractNumId w:val="12"/>
+    <w:abstractNumId w:val="13"/>
   </w:num>
   <w:num w:numId="38" w16cid:durableId="2125995815">
-    <w:abstractNumId w:val="32"/>
+    <w:abstractNumId w:val="34"/>
   </w:num>
   <w:num w:numId="39" w16cid:durableId="2064138813">
-    <w:abstractNumId w:val="6"/>
+    <w:abstractNumId w:val="7"/>
   </w:num>
   <w:num w:numId="40" w16cid:durableId="285891499">
-    <w:abstractNumId w:val="34"/>
+    <w:abstractNumId w:val="36"/>
   </w:num>
   <w:num w:numId="41" w16cid:durableId="704713757">
-    <w:abstractNumId w:val="53"/>
+    <w:abstractNumId w:val="55"/>
   </w:num>
   <w:num w:numId="42" w16cid:durableId="1606501760">
-    <w:abstractNumId w:val="15"/>
+    <w:abstractNumId w:val="16"/>
   </w:num>
   <w:num w:numId="43" w16cid:durableId="2067103447">
     <w:abstractNumId w:val="4"/>
   </w:num>
   <w:num w:numId="44" w16cid:durableId="1371690012">
-    <w:abstractNumId w:val="30"/>
+    <w:abstractNumId w:val="31"/>
   </w:num>
   <w:num w:numId="45" w16cid:durableId="497770918">
-    <w:abstractNumId w:val="8"/>
+    <w:abstractNumId w:val="9"/>
   </w:num>
   <w:num w:numId="46" w16cid:durableId="1499148298">
-    <w:abstractNumId w:val="47"/>
+    <w:abstractNumId w:val="49"/>
   </w:num>
   <w:num w:numId="47" w16cid:durableId="53089275">
-    <w:abstractNumId w:val="48"/>
+    <w:abstractNumId w:val="50"/>
   </w:num>
   <w:num w:numId="48" w16cid:durableId="1632126248">
-    <w:abstractNumId w:val="5"/>
+    <w:abstractNumId w:val="6"/>
   </w:num>
   <w:num w:numId="49" w16cid:durableId="502476322">
-    <w:abstractNumId w:val="43"/>
+    <w:abstractNumId w:val="45"/>
   </w:num>
   <w:num w:numId="50" w16cid:durableId="2023823508">
-    <w:abstractNumId w:val="31"/>
+    <w:abstractNumId w:val="32"/>
   </w:num>
   <w:num w:numId="51" w16cid:durableId="1557667054">
-    <w:abstractNumId w:val="10"/>
+    <w:abstractNumId w:val="11"/>
   </w:num>
   <w:num w:numId="52" w16cid:durableId="470904442">
-    <w:abstractNumId w:val="51"/>
+    <w:abstractNumId w:val="53"/>
   </w:num>
   <w:num w:numId="53" w16cid:durableId="1149177402">
-    <w:abstractNumId w:val="41"/>
+    <w:abstractNumId w:val="43"/>
   </w:num>
   <w:num w:numId="54" w16cid:durableId="873421225">
     <w:abstractNumId w:val="1"/>
   </w:num>
   <w:num w:numId="55" w16cid:durableId="931426499">
-    <w:abstractNumId w:val="20"/>
+    <w:abstractNumId w:val="21"/>
+  </w:num>
+  <w:num w:numId="56" w16cid:durableId="1433470803">
+    <w:abstractNumId w:val="5"/>
+  </w:num>
+  <w:num w:numId="57" w16cid:durableId="911349828">
+    <w:abstractNumId w:val="33"/>
   </w:num>
 </w:numbering>
 </file>
@@ -13535,7 +14414,7 @@
   <w:style w:type="paragraph" w:default="1" w:styleId="Normal">
     <w:name w:val="Normal"/>
     <w:qFormat/>
-    <w:rsid w:val="006C0274"/>
+    <w:rsid w:val="009B7655"/>
     <w:rPr>
       <w:sz w:val="24"/>
       <w:szCs w:val="24"/>

</xml_diff>

<commit_message>
Rochester, NBL accepted, and new conference
</commit_message>
<xml_diff>
--- a/CV_baishen_liang.docx
+++ b/CV_baishen_liang.docx
@@ -33,13 +33,56 @@
       </w:pPr>
     </w:p>
     <w:p>
-      <w:r>
-        <w:rPr>
-          <w:rFonts w:ascii="Arial" w:eastAsiaTheme="minorEastAsia" w:hAnsi="Arial" w:cs="Arial" w:hint="eastAsia"/>
-        </w:rPr>
-        <w:t>Postdoctoral associate, Department of Neurology, Duke University</w:t>
-      </w:r>
-    </w:p>
+      <w:pPr>
+        <w:rPr>
+          <w:rFonts w:ascii="Arial" w:eastAsiaTheme="minorEastAsia" w:hAnsi="Arial" w:cs="Arial"/>
+        </w:rPr>
+      </w:pPr>
+      <w:r>
+        <w:rPr>
+          <w:rFonts w:ascii="Arial" w:eastAsiaTheme="minorEastAsia" w:hAnsi="Arial" w:cs="Arial" w:hint="eastAsia"/>
+        </w:rPr>
+        <w:t xml:space="preserve">Postdoctoral </w:t>
+      </w:r>
+      <w:r>
+        <w:rPr>
+          <w:rFonts w:ascii="Arial" w:eastAsiaTheme="minorEastAsia" w:hAnsi="Arial" w:cs="Arial" w:hint="eastAsia"/>
+        </w:rPr>
+        <w:t>A</w:t>
+      </w:r>
+      <w:r>
+        <w:rPr>
+          <w:rFonts w:ascii="Arial" w:eastAsiaTheme="minorEastAsia" w:hAnsi="Arial" w:cs="Arial" w:hint="eastAsia"/>
+        </w:rPr>
+        <w:t xml:space="preserve">ssociate, </w:t>
+      </w:r>
+    </w:p>
+    <w:p>
+      <w:pPr>
+        <w:rPr>
+          <w:rFonts w:ascii="Arial" w:eastAsiaTheme="minorEastAsia" w:hAnsi="Arial" w:cs="Arial"/>
+        </w:rPr>
+      </w:pPr>
+      <w:r>
+        <w:rPr>
+          <w:rFonts w:ascii="Arial" w:eastAsiaTheme="minorEastAsia" w:hAnsi="Arial" w:cs="Arial"/>
+        </w:rPr>
+        <w:t>Department of Brain and Cognitive Sciences</w:t>
+      </w:r>
+      <w:r>
+        <w:rPr>
+          <w:rFonts w:ascii="Arial" w:eastAsiaTheme="minorEastAsia" w:hAnsi="Arial" w:cs="Arial" w:hint="eastAsia"/>
+        </w:rPr>
+        <w:t xml:space="preserve">, </w:t>
+      </w:r>
+      <w:r>
+        <w:rPr>
+          <w:rFonts w:ascii="Arial" w:eastAsiaTheme="minorEastAsia" w:hAnsi="Arial" w:cs="Arial"/>
+        </w:rPr>
+        <w:t>University of Rochester</w:t>
+      </w:r>
+    </w:p>
+    <w:p/>
     <w:p>
       <w:pPr>
         <w:rPr>
@@ -1346,7 +1389,7 @@
           <w:tab w:val="left" w:pos="8100"/>
         </w:tabs>
         <w:rPr>
-          <w:rFonts w:ascii="Arial" w:eastAsiaTheme="minorEastAsia" w:hAnsi="Arial" w:cs="Arial"/>
+          <w:rFonts w:ascii="Arial" w:eastAsiaTheme="minorEastAsia" w:hAnsi="Arial" w:cs="Arial" w:hint="eastAsia"/>
           <w:sz w:val="22"/>
           <w:szCs w:val="22"/>
         </w:rPr>
@@ -1369,47 +1412,55 @@
           <w:sz w:val="22"/>
           <w:szCs w:val="22"/>
         </w:rPr>
-        <w:t xml:space="preserve">               </w:t>
+        <w:t xml:space="preserve">                                                                                       </w:t>
+      </w:r>
+      <w:r>
+        <w:rPr>
+          <w:rFonts w:ascii="Arial" w:eastAsiaTheme="minorEastAsia" w:hAnsi="Arial" w:cs="Arial" w:hint="eastAsia"/>
+          <w:b/>
+          <w:iCs/>
+          <w:sz w:val="22"/>
+          <w:szCs w:val="22"/>
+        </w:rPr>
+        <w:t xml:space="preserve">    </w:t>
+      </w:r>
+      <w:r>
+        <w:rPr>
+          <w:rFonts w:ascii="Arial" w:eastAsiaTheme="minorEastAsia" w:hAnsi="Arial" w:cs="Arial" w:hint="eastAsia"/>
+          <w:b/>
+          <w:iCs/>
+          <w:sz w:val="22"/>
+          <w:szCs w:val="22"/>
+        </w:rPr>
+        <w:t xml:space="preserve"> July 202</w:t>
+      </w:r>
+      <w:r>
+        <w:rPr>
+          <w:rFonts w:ascii="Arial" w:eastAsiaTheme="minorEastAsia" w:hAnsi="Arial" w:cs="Arial" w:hint="eastAsia"/>
+          <w:b/>
+          <w:iCs/>
+          <w:sz w:val="22"/>
+          <w:szCs w:val="22"/>
+        </w:rPr>
+        <w:t>6</w:t>
       </w:r>
       <w:r>
         <w:rPr>
           <w:rFonts w:ascii="Arial" w:eastAsia="Arial Unicode MS" w:hAnsi="Arial" w:cs="Arial"/>
           <w:b/>
-          <w:iCs/>
-          <w:sz w:val="22"/>
-          <w:szCs w:val="22"/>
-        </w:rPr>
-        <w:t xml:space="preserve">                                                                        </w:t>
-      </w:r>
-      <w:r>
-        <w:rPr>
-          <w:rFonts w:ascii="Arial" w:eastAsiaTheme="minorEastAsia" w:hAnsi="Arial" w:cs="Arial" w:hint="eastAsia"/>
-          <w:b/>
-          <w:iCs/>
-          <w:sz w:val="22"/>
-          <w:szCs w:val="22"/>
-        </w:rPr>
-        <w:t xml:space="preserve">  </w:t>
+          <w:sz w:val="22"/>
+          <w:szCs w:val="22"/>
+        </w:rPr>
+        <w:t xml:space="preserve"> </w:t>
       </w:r>
       <w:r>
         <w:rPr>
           <w:rFonts w:ascii="Arial" w:eastAsia="Arial Unicode MS" w:hAnsi="Arial" w:cs="Arial"/>
           <w:b/>
-          <w:iCs/>
-          <w:sz w:val="22"/>
-          <w:szCs w:val="22"/>
-        </w:rPr>
-        <w:t xml:space="preserve">   </w:t>
-      </w:r>
-      <w:r>
-        <w:rPr>
-          <w:rFonts w:ascii="Arial" w:eastAsiaTheme="minorEastAsia" w:hAnsi="Arial" w:cs="Arial" w:hint="eastAsia"/>
-          <w:b/>
-          <w:iCs/>
-          <w:sz w:val="22"/>
-          <w:szCs w:val="22"/>
-        </w:rPr>
-        <w:t>July 2024</w:t>
+          <w:sz w:val="22"/>
+          <w:szCs w:val="22"/>
+        </w:rPr>
+        <w:t>–</w:t>
       </w:r>
       <w:r>
         <w:rPr>
@@ -1422,30 +1473,12 @@
       </w:r>
       <w:r>
         <w:rPr>
-          <w:rFonts w:ascii="Arial" w:eastAsia="Arial Unicode MS" w:hAnsi="Arial" w:cs="Arial"/>
-          <w:b/>
-          <w:sz w:val="22"/>
-          <w:szCs w:val="22"/>
-        </w:rPr>
-        <w:t>–</w:t>
-      </w:r>
-      <w:r>
-        <w:rPr>
-          <w:rFonts w:ascii="Arial" w:eastAsia="Arial Unicode MS" w:hAnsi="Arial" w:cs="Arial"/>
-          <w:b/>
-          <w:sz w:val="22"/>
-          <w:szCs w:val="22"/>
-        </w:rPr>
-        <w:t xml:space="preserve"> </w:t>
-      </w:r>
-      <w:r>
-        <w:rPr>
-          <w:rFonts w:ascii="Arial" w:eastAsia="Arial Unicode MS" w:hAnsi="Arial" w:cs="Arial"/>
-          <w:b/>
-          <w:sz w:val="22"/>
-          <w:szCs w:val="22"/>
-        </w:rPr>
-        <w:t>present</w:t>
+          <w:rFonts w:ascii="Arial" w:eastAsiaTheme="minorEastAsia" w:hAnsi="Arial" w:cs="Arial" w:hint="eastAsia"/>
+          <w:b/>
+          <w:sz w:val="22"/>
+          <w:szCs w:val="22"/>
+        </w:rPr>
+        <w:t>Present</w:t>
       </w:r>
     </w:p>
     <w:p>
@@ -1468,21 +1501,21 @@
       </w:pPr>
       <w:r>
         <w:rPr>
-          <w:rFonts w:ascii="Arial" w:eastAsiaTheme="minorEastAsia" w:hAnsi="Arial" w:cs="Arial" w:hint="eastAsia"/>
+          <w:rFonts w:ascii="Arial" w:eastAsiaTheme="minorEastAsia" w:hAnsi="Arial" w:cs="Arial"/>
           <w:iCs/>
           <w:sz w:val="22"/>
           <w:szCs w:val="22"/>
         </w:rPr>
-        <w:t>Department of Neurology</w:t>
-      </w:r>
-      <w:r>
-        <w:rPr>
-          <w:rFonts w:ascii="Arial" w:eastAsia="Arial Unicode MS" w:hAnsi="Arial" w:cs="Arial"/>
+        <w:t>Department of Brain and Cognitive Sciences, University of Rochester</w:t>
+      </w:r>
+      <w:r>
+        <w:rPr>
+          <w:rFonts w:ascii="Arial" w:eastAsiaTheme="minorEastAsia" w:hAnsi="Arial" w:cs="Arial" w:hint="eastAsia"/>
           <w:iCs/>
           <w:sz w:val="22"/>
           <w:szCs w:val="22"/>
         </w:rPr>
-        <w:t xml:space="preserve">, </w:t>
+        <w:t>, N</w:t>
       </w:r>
       <w:r>
         <w:rPr>
@@ -1491,7 +1524,16 @@
           <w:sz w:val="22"/>
           <w:szCs w:val="22"/>
         </w:rPr>
-        <w:t>Duke University, Durham, NC, USA</w:t>
+        <w:t>Y</w:t>
+      </w:r>
+      <w:r>
+        <w:rPr>
+          <w:rFonts w:ascii="Arial" w:eastAsiaTheme="minorEastAsia" w:hAnsi="Arial" w:cs="Arial" w:hint="eastAsia"/>
+          <w:iCs/>
+          <w:sz w:val="22"/>
+          <w:szCs w:val="22"/>
+        </w:rPr>
+        <w:t>, USA</w:t>
       </w:r>
     </w:p>
     <w:p>
@@ -1521,30 +1563,48 @@
         <w:spacing w:line="276" w:lineRule="auto"/>
         <w:jc w:val="both"/>
         <w:rPr>
-          <w:rFonts w:ascii="Arial" w:hAnsi="Arial" w:cs="Arial"/>
-          <w:sz w:val="22"/>
-          <w:szCs w:val="22"/>
-        </w:rPr>
-      </w:pPr>
-      <w:r>
-        <w:rPr>
-          <w:rFonts w:ascii="Arial" w:hAnsi="Arial" w:cs="Arial"/>
-          <w:sz w:val="22"/>
-          <w:szCs w:val="22"/>
-        </w:rPr>
-        <w:t xml:space="preserve">Lead a project to </w:t>
-      </w:r>
-      <w:r>
-        <w:rPr>
-          <w:rFonts w:ascii="Arial" w:hAnsi="Arial" w:cs="Arial" w:hint="eastAsia"/>
-          <w:sz w:val="22"/>
-          <w:szCs w:val="22"/>
-        </w:rPr>
-        <w:t>Design and establish an experiment to</w:t>
-      </w:r>
-      <w:r>
-        <w:rPr>
-          <w:rFonts w:ascii="Arial" w:hAnsi="Arial" w:cs="Arial" w:hint="eastAsia"/>
+          <w:rFonts w:ascii="Arial" w:hAnsi="Arial" w:cs="Arial" w:hint="eastAsia"/>
+          <w:sz w:val="22"/>
+          <w:szCs w:val="22"/>
+        </w:rPr>
+      </w:pPr>
+      <w:r>
+        <w:rPr>
+          <w:rFonts w:ascii="Arial" w:hAnsi="Arial" w:cs="Arial"/>
+          <w:sz w:val="22"/>
+          <w:szCs w:val="22"/>
+        </w:rPr>
+        <w:t>Lead</w:t>
+      </w:r>
+      <w:r>
+        <w:rPr>
+          <w:rFonts w:ascii="Arial" w:hAnsi="Arial" w:cs="Arial"/>
+          <w:sz w:val="22"/>
+          <w:szCs w:val="22"/>
+        </w:rPr>
+        <w:t xml:space="preserve"> a project </w:t>
+      </w:r>
+      <w:r>
+        <w:rPr>
+          <w:rFonts w:ascii="Arial" w:hAnsi="Arial" w:cs="Arial"/>
+          <w:b/>
+          <w:bCs/>
+          <w:sz w:val="22"/>
+          <w:szCs w:val="22"/>
+        </w:rPr>
+        <w:t>investigating the neural basis of spoken and gestural communication</w:t>
+      </w:r>
+      <w:r>
+        <w:rPr>
+          <w:rFonts w:ascii="Arial" w:hAnsi="Arial" w:cs="Arial" w:hint="eastAsia"/>
+          <w:sz w:val="22"/>
+          <w:szCs w:val="22"/>
+        </w:rPr>
+        <w:t>.</w:t>
+      </w:r>
+      <w:r>
+        <w:rPr>
+          <w:rFonts w:ascii="Arial" w:hAnsi="Arial" w:cs="Arial"/>
           <w:sz w:val="22"/>
           <w:szCs w:val="22"/>
         </w:rPr>
@@ -1553,6 +1613,325 @@
       <w:r>
         <w:rPr>
           <w:rFonts w:ascii="Arial" w:hAnsi="Arial" w:cs="Arial" w:hint="eastAsia"/>
+          <w:sz w:val="22"/>
+          <w:szCs w:val="22"/>
+        </w:rPr>
+        <w:t>Collect</w:t>
+      </w:r>
+      <w:r>
+        <w:rPr>
+          <w:rFonts w:ascii="Arial" w:hAnsi="Arial" w:cs="Arial"/>
+          <w:sz w:val="22"/>
+          <w:szCs w:val="22"/>
+        </w:rPr>
+        <w:t xml:space="preserve">, </w:t>
+      </w:r>
+      <w:r>
+        <w:rPr>
+          <w:rFonts w:ascii="Arial" w:hAnsi="Arial" w:cs="Arial"/>
+          <w:sz w:val="22"/>
+          <w:szCs w:val="22"/>
+        </w:rPr>
+        <w:t>analyze</w:t>
+      </w:r>
+      <w:r>
+        <w:rPr>
+          <w:rFonts w:ascii="Arial" w:hAnsi="Arial" w:cs="Arial"/>
+          <w:sz w:val="22"/>
+          <w:szCs w:val="22"/>
+        </w:rPr>
+        <w:t xml:space="preserve">, and </w:t>
+      </w:r>
+      <w:r>
+        <w:rPr>
+          <w:rFonts w:ascii="Arial" w:hAnsi="Arial" w:cs="Arial"/>
+          <w:sz w:val="22"/>
+          <w:szCs w:val="22"/>
+        </w:rPr>
+        <w:t>manage</w:t>
+      </w:r>
+      <w:r>
+        <w:rPr>
+          <w:rFonts w:ascii="Arial" w:hAnsi="Arial" w:cs="Arial"/>
+          <w:sz w:val="22"/>
+          <w:szCs w:val="22"/>
+        </w:rPr>
+        <w:t xml:space="preserve"> </w:t>
+      </w:r>
+      <w:r>
+        <w:rPr>
+          <w:rFonts w:ascii="Arial" w:hAnsi="Arial" w:cs="Arial"/>
+          <w:sz w:val="22"/>
+          <w:szCs w:val="22"/>
+        </w:rPr>
+        <w:t>intracranial electroencephalogram (</w:t>
+      </w:r>
+      <w:r>
+        <w:rPr>
+          <w:rFonts w:ascii="Arial" w:hAnsi="Arial" w:cs="Arial" w:hint="eastAsia"/>
+          <w:sz w:val="22"/>
+          <w:szCs w:val="22"/>
+        </w:rPr>
+        <w:t>i</w:t>
+      </w:r>
+      <w:r>
+        <w:rPr>
+          <w:rFonts w:ascii="Arial" w:hAnsi="Arial" w:cs="Arial"/>
+          <w:sz w:val="22"/>
+          <w:szCs w:val="22"/>
+        </w:rPr>
+        <w:t>EEG)</w:t>
+      </w:r>
+      <w:r>
+        <w:rPr>
+          <w:rFonts w:ascii="Arial" w:hAnsi="Arial" w:cs="Arial"/>
+          <w:sz w:val="22"/>
+          <w:szCs w:val="22"/>
+        </w:rPr>
+        <w:t xml:space="preserve"> data from neurosurgical patients.</w:t>
+      </w:r>
+    </w:p>
+    <w:p>
+      <w:pPr>
+        <w:tabs>
+          <w:tab w:val="left" w:pos="196"/>
+          <w:tab w:val="left" w:pos="1440"/>
+          <w:tab w:val="left" w:pos="3600"/>
+          <w:tab w:val="left" w:pos="6840"/>
+          <w:tab w:val="left" w:pos="8100"/>
+        </w:tabs>
+        <w:rPr>
+          <w:rFonts w:ascii="Arial" w:eastAsiaTheme="minorEastAsia" w:hAnsi="Arial" w:cs="Arial"/>
+          <w:b/>
+          <w:iCs/>
+          <w:sz w:val="22"/>
+          <w:szCs w:val="22"/>
+        </w:rPr>
+      </w:pPr>
+    </w:p>
+    <w:p>
+      <w:pPr>
+        <w:tabs>
+          <w:tab w:val="left" w:pos="196"/>
+          <w:tab w:val="left" w:pos="1440"/>
+          <w:tab w:val="left" w:pos="3600"/>
+          <w:tab w:val="left" w:pos="6840"/>
+          <w:tab w:val="left" w:pos="8100"/>
+        </w:tabs>
+        <w:rPr>
+          <w:rFonts w:ascii="Arial" w:eastAsiaTheme="minorEastAsia" w:hAnsi="Arial" w:cs="Arial" w:hint="eastAsia"/>
+          <w:sz w:val="22"/>
+          <w:szCs w:val="22"/>
+        </w:rPr>
+      </w:pPr>
+      <w:r>
+        <w:rPr>
+          <w:rFonts w:ascii="Arial" w:eastAsiaTheme="minorEastAsia" w:hAnsi="Arial" w:cs="Arial" w:hint="eastAsia"/>
+          <w:b/>
+          <w:iCs/>
+          <w:sz w:val="22"/>
+          <w:szCs w:val="22"/>
+        </w:rPr>
+        <w:t>Postdoctoral Associate</w:t>
+      </w:r>
+      <w:r>
+        <w:rPr>
+          <w:rFonts w:ascii="Arial" w:eastAsia="Arial Unicode MS" w:hAnsi="Arial" w:cs="Arial"/>
+          <w:b/>
+          <w:iCs/>
+          <w:sz w:val="22"/>
+          <w:szCs w:val="22"/>
+        </w:rPr>
+        <w:t xml:space="preserve">               </w:t>
+      </w:r>
+      <w:r>
+        <w:rPr>
+          <w:rFonts w:ascii="Arial" w:eastAsia="Arial Unicode MS" w:hAnsi="Arial" w:cs="Arial"/>
+          <w:b/>
+          <w:iCs/>
+          <w:sz w:val="22"/>
+          <w:szCs w:val="22"/>
+        </w:rPr>
+        <w:t xml:space="preserve">                                                                        </w:t>
+      </w:r>
+      <w:r>
+        <w:rPr>
+          <w:rFonts w:ascii="Arial" w:eastAsiaTheme="minorEastAsia" w:hAnsi="Arial" w:cs="Arial" w:hint="eastAsia"/>
+          <w:b/>
+          <w:iCs/>
+          <w:sz w:val="22"/>
+          <w:szCs w:val="22"/>
+        </w:rPr>
+        <w:t xml:space="preserve"> </w:t>
+      </w:r>
+      <w:r>
+        <w:rPr>
+          <w:rFonts w:ascii="Arial" w:eastAsiaTheme="minorEastAsia" w:hAnsi="Arial" w:cs="Arial" w:hint="eastAsia"/>
+          <w:b/>
+          <w:iCs/>
+          <w:sz w:val="22"/>
+          <w:szCs w:val="22"/>
+        </w:rPr>
+        <w:t>July 2024</w:t>
+      </w:r>
+      <w:r>
+        <w:rPr>
+          <w:rFonts w:ascii="Arial" w:eastAsia="Arial Unicode MS" w:hAnsi="Arial" w:cs="Arial"/>
+          <w:b/>
+          <w:sz w:val="22"/>
+          <w:szCs w:val="22"/>
+        </w:rPr>
+        <w:t xml:space="preserve"> </w:t>
+      </w:r>
+      <w:r>
+        <w:rPr>
+          <w:rFonts w:ascii="Arial" w:eastAsia="Arial Unicode MS" w:hAnsi="Arial" w:cs="Arial"/>
+          <w:b/>
+          <w:sz w:val="22"/>
+          <w:szCs w:val="22"/>
+        </w:rPr>
+        <w:t>–</w:t>
+      </w:r>
+      <w:r>
+        <w:rPr>
+          <w:rFonts w:ascii="Arial" w:eastAsia="Arial Unicode MS" w:hAnsi="Arial" w:cs="Arial"/>
+          <w:b/>
+          <w:sz w:val="22"/>
+          <w:szCs w:val="22"/>
+        </w:rPr>
+        <w:t xml:space="preserve"> </w:t>
+      </w:r>
+      <w:r>
+        <w:rPr>
+          <w:rFonts w:ascii="Arial" w:eastAsiaTheme="minorEastAsia" w:hAnsi="Arial" w:cs="Arial" w:hint="eastAsia"/>
+          <w:b/>
+          <w:sz w:val="22"/>
+          <w:szCs w:val="22"/>
+        </w:rPr>
+        <w:t>June 2026</w:t>
+      </w:r>
+    </w:p>
+    <w:p>
+      <w:pPr>
+        <w:tabs>
+          <w:tab w:val="left" w:pos="196"/>
+          <w:tab w:val="left" w:pos="1440"/>
+          <w:tab w:val="left" w:pos="3600"/>
+          <w:tab w:val="left" w:pos="6840"/>
+        </w:tabs>
+        <w:ind w:left="450" w:hanging="450"/>
+        <w:jc w:val="both"/>
+        <w:outlineLvl w:val="0"/>
+        <w:rPr>
+          <w:rFonts w:ascii="Arial" w:eastAsiaTheme="minorEastAsia" w:hAnsi="Arial" w:cs="Arial"/>
+          <w:iCs/>
+          <w:sz w:val="22"/>
+          <w:szCs w:val="22"/>
+        </w:rPr>
+      </w:pPr>
+      <w:r>
+        <w:rPr>
+          <w:rFonts w:ascii="Arial" w:eastAsiaTheme="minorEastAsia" w:hAnsi="Arial" w:cs="Arial" w:hint="eastAsia"/>
+          <w:iCs/>
+          <w:sz w:val="22"/>
+          <w:szCs w:val="22"/>
+        </w:rPr>
+        <w:t>Department of Neurology</w:t>
+      </w:r>
+      <w:r>
+        <w:rPr>
+          <w:rFonts w:ascii="Arial" w:eastAsia="Arial Unicode MS" w:hAnsi="Arial" w:cs="Arial"/>
+          <w:iCs/>
+          <w:sz w:val="22"/>
+          <w:szCs w:val="22"/>
+        </w:rPr>
+        <w:t xml:space="preserve">, </w:t>
+      </w:r>
+      <w:r>
+        <w:rPr>
+          <w:rFonts w:ascii="Arial" w:eastAsiaTheme="minorEastAsia" w:hAnsi="Arial" w:cs="Arial" w:hint="eastAsia"/>
+          <w:iCs/>
+          <w:sz w:val="22"/>
+          <w:szCs w:val="22"/>
+        </w:rPr>
+        <w:t>Duke University, Durham, NC, USA</w:t>
+      </w:r>
+    </w:p>
+    <w:p>
+      <w:pPr>
+        <w:tabs>
+          <w:tab w:val="left" w:pos="157"/>
+        </w:tabs>
+        <w:ind w:left="450" w:hanging="450"/>
+        <w:jc w:val="both"/>
+        <w:outlineLvl w:val="0"/>
+        <w:rPr>
+          <w:rFonts w:ascii="Arial" w:eastAsia="Arial Unicode MS" w:hAnsi="Arial" w:cs="Arial"/>
+          <w:sz w:val="22"/>
+          <w:szCs w:val="22"/>
+        </w:rPr>
+      </w:pPr>
+    </w:p>
+    <w:p>
+      <w:pPr>
+        <w:numPr>
+          <w:ilvl w:val="0"/>
+          <w:numId w:val="1"/>
+        </w:numPr>
+        <w:autoSpaceDE w:val="0"/>
+        <w:autoSpaceDN w:val="0"/>
+        <w:adjustRightInd w:val="0"/>
+        <w:spacing w:line="276" w:lineRule="auto"/>
+        <w:jc w:val="both"/>
+        <w:rPr>
+          <w:rFonts w:ascii="Arial" w:hAnsi="Arial" w:cs="Arial"/>
+          <w:sz w:val="22"/>
+          <w:szCs w:val="22"/>
+        </w:rPr>
+      </w:pPr>
+      <w:r>
+        <w:rPr>
+          <w:rFonts w:ascii="Arial" w:hAnsi="Arial" w:cs="Arial" w:hint="eastAsia"/>
+          <w:sz w:val="22"/>
+          <w:szCs w:val="22"/>
+        </w:rPr>
+        <w:t>Led</w:t>
+      </w:r>
+      <w:r>
+        <w:rPr>
+          <w:rFonts w:ascii="Arial" w:hAnsi="Arial" w:cs="Arial"/>
+          <w:sz w:val="22"/>
+          <w:szCs w:val="22"/>
+        </w:rPr>
+        <w:t xml:space="preserve"> a project to </w:t>
+      </w:r>
+      <w:r>
+        <w:rPr>
+          <w:rFonts w:ascii="Arial" w:hAnsi="Arial" w:cs="Arial" w:hint="eastAsia"/>
+          <w:sz w:val="22"/>
+          <w:szCs w:val="22"/>
+        </w:rPr>
+        <w:t>d</w:t>
+      </w:r>
+      <w:r>
+        <w:rPr>
+          <w:rFonts w:ascii="Arial" w:hAnsi="Arial" w:cs="Arial" w:hint="eastAsia"/>
+          <w:sz w:val="22"/>
+          <w:szCs w:val="22"/>
+        </w:rPr>
+        <w:t>esign and establish an experiment to</w:t>
+      </w:r>
+      <w:r>
+        <w:rPr>
+          <w:rFonts w:ascii="Arial" w:hAnsi="Arial" w:cs="Arial" w:hint="eastAsia"/>
+          <w:sz w:val="22"/>
+          <w:szCs w:val="22"/>
+        </w:rPr>
+        <w:t xml:space="preserve"> </w:t>
+      </w:r>
+      <w:r>
+        <w:rPr>
+          <w:rFonts w:ascii="Arial" w:hAnsi="Arial" w:cs="Arial" w:hint="eastAsia"/>
           <w:b/>
           <w:bCs/>
           <w:sz w:val="22"/>
@@ -1630,6 +2009,14 @@
           <w:sz w:val="22"/>
           <w:szCs w:val="22"/>
         </w:rPr>
+        <w:t>ed</w:t>
+      </w:r>
+      <w:r>
+        <w:rPr>
+          <w:rFonts w:ascii="Arial" w:hAnsi="Arial" w:cs="Arial" w:hint="eastAsia"/>
+          <w:sz w:val="22"/>
+          <w:szCs w:val="22"/>
+        </w:rPr>
         <w:t>, analy</w:t>
       </w:r>
       <w:r>
@@ -1646,6 +2033,14 @@
           <w:sz w:val="22"/>
           <w:szCs w:val="22"/>
         </w:rPr>
+        <w:t>d</w:t>
+      </w:r>
+      <w:r>
+        <w:rPr>
+          <w:rFonts w:ascii="Arial" w:hAnsi="Arial" w:cs="Arial" w:hint="eastAsia"/>
+          <w:sz w:val="22"/>
+          <w:szCs w:val="22"/>
+        </w:rPr>
         <w:t xml:space="preserve">, and </w:t>
       </w:r>
       <w:r>
@@ -1654,7 +2049,7 @@
           <w:sz w:val="22"/>
           <w:szCs w:val="22"/>
         </w:rPr>
-        <w:t>maintain</w:t>
+        <w:t>maintained</w:t>
       </w:r>
       <w:r>
         <w:rPr>
@@ -1670,33 +2065,31 @@
           <w:sz w:val="22"/>
           <w:szCs w:val="22"/>
         </w:rPr>
-        <w:t>neurosurgical patients' intracranial electroencephalogram (</w:t>
-      </w:r>
-      <w:proofErr w:type="spellStart"/>
-      <w:r>
-        <w:rPr>
-          <w:rFonts w:ascii="Arial" w:hAnsi="Arial" w:cs="Arial" w:hint="eastAsia"/>
-          <w:sz w:val="22"/>
-          <w:szCs w:val="22"/>
-        </w:rPr>
-        <w:t>i</w:t>
-      </w:r>
-      <w:r>
-        <w:rPr>
-          <w:rFonts w:ascii="Arial" w:hAnsi="Arial" w:cs="Arial"/>
-          <w:sz w:val="22"/>
-          <w:szCs w:val="22"/>
-        </w:rPr>
-        <w:t>EEG</w:t>
-      </w:r>
-      <w:proofErr w:type="spellEnd"/>
-      <w:r>
-        <w:rPr>
-          <w:rFonts w:ascii="Arial" w:hAnsi="Arial" w:cs="Arial"/>
-          <w:sz w:val="22"/>
-          <w:szCs w:val="22"/>
-        </w:rPr>
-        <w:t>) data</w:t>
+        <w:t>neurosurgical patients</w:t>
+      </w:r>
+      <w:r>
+        <w:rPr>
+          <w:rFonts w:ascii="Arial" w:hAnsi="Arial" w:cs="Arial"/>
+          <w:sz w:val="22"/>
+          <w:szCs w:val="22"/>
+        </w:rPr>
+        <w:t>’ iEEG</w:t>
+      </w:r>
+      <w:r>
+        <w:rPr>
+          <w:rFonts w:ascii="Arial" w:hAnsi="Arial" w:cs="Arial" w:hint="eastAsia"/>
+          <w:sz w:val="22"/>
+          <w:szCs w:val="22"/>
+        </w:rPr>
+        <w:t xml:space="preserve"> </w:t>
+      </w:r>
+      <w:r>
+        <w:rPr>
+          <w:rFonts w:ascii="Arial" w:hAnsi="Arial" w:cs="Arial"/>
+          <w:sz w:val="22"/>
+          <w:szCs w:val="22"/>
+        </w:rPr>
+        <w:t>data</w:t>
       </w:r>
       <w:r>
         <w:rPr>
@@ -2302,7 +2695,15 @@
           <w:sz w:val="22"/>
           <w:szCs w:val="22"/>
         </w:rPr>
-        <w:t>Lead a project to a</w:t>
+        <w:t>Led</w:t>
+      </w:r>
+      <w:r>
+        <w:rPr>
+          <w:rFonts w:ascii="Arial" w:hAnsi="Arial" w:cs="Arial" w:hint="eastAsia"/>
+          <w:sz w:val="22"/>
+          <w:szCs w:val="22"/>
+        </w:rPr>
+        <w:t xml:space="preserve"> a project to a</w:t>
       </w:r>
       <w:r>
         <w:rPr>
@@ -2366,33 +2767,15 @@
           <w:sz w:val="22"/>
           <w:szCs w:val="22"/>
         </w:rPr>
-        <w:t xml:space="preserve">a TMS </w:t>
-      </w:r>
-      <w:proofErr w:type="gramStart"/>
-      <w:r>
-        <w:rPr>
-          <w:rFonts w:ascii="Arial" w:hAnsi="Arial" w:cs="Arial" w:hint="eastAsia"/>
-          <w:sz w:val="22"/>
-          <w:szCs w:val="22"/>
-        </w:rPr>
-        <w:t xml:space="preserve">experiment, </w:t>
-      </w:r>
-      <w:r>
-        <w:rPr>
-          <w:rFonts w:ascii="Arial" w:hAnsi="Arial" w:cs="Arial"/>
-          <w:sz w:val="22"/>
-          <w:szCs w:val="22"/>
-        </w:rPr>
-        <w:t>and</w:t>
-      </w:r>
-      <w:proofErr w:type="gramEnd"/>
-      <w:r>
-        <w:rPr>
-          <w:rFonts w:ascii="Arial" w:hAnsi="Arial" w:cs="Arial"/>
-          <w:sz w:val="22"/>
-          <w:szCs w:val="22"/>
-        </w:rPr>
-        <w:t xml:space="preserve"> </w:t>
+        <w:t xml:space="preserve">a TMS experiment, </w:t>
+      </w:r>
+      <w:r>
+        <w:rPr>
+          <w:rFonts w:ascii="Arial" w:hAnsi="Arial" w:cs="Arial"/>
+          <w:sz w:val="22"/>
+          <w:szCs w:val="22"/>
+        </w:rPr>
+        <w:t xml:space="preserve">and </w:t>
       </w:r>
       <w:r>
         <w:rPr>
@@ -2532,29 +2915,7 @@
           <w:sz w:val="22"/>
           <w:szCs w:val="22"/>
         </w:rPr>
-        <w:t xml:space="preserve"> (</w:t>
-      </w:r>
-      <w:proofErr w:type="spellStart"/>
-      <w:r>
-        <w:rPr>
-          <w:rFonts w:ascii="Arial" w:eastAsiaTheme="minorEastAsia" w:hAnsi="Arial" w:cs="Arial" w:hint="eastAsia"/>
-          <w:b/>
-          <w:bCs/>
-          <w:sz w:val="22"/>
-          <w:szCs w:val="22"/>
-        </w:rPr>
-        <w:t>tACS</w:t>
-      </w:r>
-      <w:proofErr w:type="spellEnd"/>
-      <w:r>
-        <w:rPr>
-          <w:rFonts w:ascii="Arial" w:eastAsiaTheme="minorEastAsia" w:hAnsi="Arial" w:cs="Arial" w:hint="eastAsia"/>
-          <w:b/>
-          <w:bCs/>
-          <w:sz w:val="22"/>
-          <w:szCs w:val="22"/>
-        </w:rPr>
-        <w:t>)</w:t>
+        <w:t xml:space="preserve"> (tACS)</w:t>
       </w:r>
       <w:r>
         <w:rPr>
@@ -2591,6 +2952,7 @@
           <w:sz w:val="22"/>
           <w:szCs w:val="22"/>
         </w:rPr>
+        <w:lastRenderedPageBreak/>
         <w:t>Led</w:t>
       </w:r>
       <w:r>
@@ -2641,7 +3003,6 @@
         </w:rPr>
         <w:t xml:space="preserve"> dual-site </w:t>
       </w:r>
-      <w:proofErr w:type="spellStart"/>
       <w:r>
         <w:rPr>
           <w:rFonts w:ascii="Arial" w:hAnsi="Arial" w:cs="Arial" w:hint="eastAsia"/>
@@ -2650,7 +3011,6 @@
         </w:rPr>
         <w:t>tACS</w:t>
       </w:r>
-      <w:proofErr w:type="spellEnd"/>
       <w:r>
         <w:rPr>
           <w:rFonts w:ascii="Arial" w:hAnsi="Arial" w:cs="Arial" w:hint="eastAsia"/>
@@ -2862,7 +3222,6 @@
         </w:rPr>
         <w:t>comprehension</w:t>
       </w:r>
-      <w:proofErr w:type="gramStart"/>
       <w:r>
         <w:rPr>
           <w:rFonts w:ascii="Arial" w:eastAsiaTheme="minorEastAsia" w:hAnsi="Arial" w:cs="Arial" w:hint="eastAsia"/>
@@ -2870,25 +3229,1089 @@
         </w:rPr>
         <w:t>.</w:t>
       </w:r>
-      <w:proofErr w:type="gramEnd"/>
-    </w:p>
-    <w:p>
-      <w:pPr>
-        <w:rPr>
-          <w:rFonts w:ascii="Arial" w:hAnsi="Arial" w:cs="Arial"/>
-          <w:b/>
-          <w:sz w:val="22"/>
-          <w:szCs w:val="22"/>
-        </w:rPr>
-      </w:pPr>
-      <w:r>
-        <w:rPr>
-          <w:rFonts w:ascii="Arial" w:hAnsi="Arial" w:cs="Arial"/>
-          <w:b/>
-          <w:sz w:val="22"/>
-          <w:szCs w:val="22"/>
-        </w:rPr>
-        <w:br w:type="page"/>
+    </w:p>
+    <w:p>
+      <w:pPr>
+        <w:pBdr>
+          <w:bottom w:val="single" w:sz="6" w:space="1" w:color="auto"/>
+        </w:pBdr>
+        <w:rPr>
+          <w:rFonts w:ascii="Arial" w:hAnsi="Arial" w:cs="Arial"/>
+          <w:b/>
+          <w:sz w:val="22"/>
+          <w:szCs w:val="22"/>
+        </w:rPr>
+      </w:pPr>
+      <w:r>
+        <w:rPr>
+          <w:rFonts w:ascii="Arial" w:hAnsi="Arial" w:cs="Arial"/>
+          <w:b/>
+          <w:sz w:val="28"/>
+          <w:szCs w:val="28"/>
+        </w:rPr>
+        <w:t>P</w:t>
+      </w:r>
+      <w:r>
+        <w:rPr>
+          <w:rFonts w:ascii="Arial" w:hAnsi="Arial" w:cs="Arial"/>
+          <w:b/>
+          <w:sz w:val="22"/>
+          <w:szCs w:val="22"/>
+        </w:rPr>
+        <w:t xml:space="preserve">EER </w:t>
+      </w:r>
+      <w:r>
+        <w:rPr>
+          <w:rFonts w:ascii="Arial" w:hAnsi="Arial" w:cs="Arial"/>
+          <w:b/>
+          <w:sz w:val="28"/>
+          <w:szCs w:val="28"/>
+        </w:rPr>
+        <w:t>R</w:t>
+      </w:r>
+      <w:r>
+        <w:rPr>
+          <w:rFonts w:ascii="Arial" w:hAnsi="Arial" w:cs="Arial"/>
+          <w:b/>
+          <w:sz w:val="22"/>
+          <w:szCs w:val="22"/>
+        </w:rPr>
+        <w:t xml:space="preserve">EVIEWED </w:t>
+      </w:r>
+      <w:r>
+        <w:rPr>
+          <w:rFonts w:ascii="Arial" w:hAnsi="Arial" w:cs="Arial"/>
+          <w:b/>
+          <w:sz w:val="28"/>
+          <w:szCs w:val="28"/>
+        </w:rPr>
+        <w:t>P</w:t>
+      </w:r>
+      <w:r>
+        <w:rPr>
+          <w:rFonts w:ascii="Arial" w:hAnsi="Arial" w:cs="Arial"/>
+          <w:b/>
+          <w:sz w:val="22"/>
+          <w:szCs w:val="22"/>
+        </w:rPr>
+        <w:t>UBLICATIONS</w:t>
+      </w:r>
+    </w:p>
+    <w:p>
+      <w:pPr>
+        <w:pStyle w:val="ListParagraph"/>
+        <w:numPr>
+          <w:ilvl w:val="0"/>
+          <w:numId w:val="2"/>
+        </w:numPr>
+        <w:spacing w:before="120" w:after="120"/>
+        <w:contextualSpacing w:val="0"/>
+        <w:rPr>
+          <w:rFonts w:ascii="Arial" w:hAnsi="Arial" w:cs="Arial"/>
+          <w:szCs w:val="21"/>
+        </w:rPr>
+      </w:pPr>
+      <w:r>
+        <w:rPr>
+          <w:rFonts w:ascii="Arial" w:hAnsi="Arial" w:cs="Arial"/>
+          <w:szCs w:val="21"/>
+        </w:rPr>
+        <w:t>Hu</w:t>
+      </w:r>
+      <w:r>
+        <w:rPr>
+          <w:rFonts w:ascii="Arial" w:eastAsiaTheme="minorEastAsia" w:hAnsi="Arial" w:cs="Arial" w:hint="eastAsia"/>
+          <w:szCs w:val="21"/>
+          <w:lang w:eastAsia="zh-CN"/>
+        </w:rPr>
+        <w:t>, W.</w:t>
+      </w:r>
+      <w:r>
+        <w:rPr>
+          <w:rFonts w:ascii="Arial" w:hAnsi="Arial" w:cs="Arial"/>
+          <w:szCs w:val="21"/>
+          <w:vertAlign w:val="superscript"/>
+        </w:rPr>
+        <w:t>#</w:t>
+      </w:r>
+      <w:r>
+        <w:rPr>
+          <w:rFonts w:ascii="Arial" w:hAnsi="Arial" w:cs="Arial"/>
+          <w:szCs w:val="21"/>
+        </w:rPr>
+        <w:t xml:space="preserve">, </w:t>
+      </w:r>
+      <w:r>
+        <w:rPr>
+          <w:rFonts w:ascii="Arial" w:hAnsi="Arial" w:cs="Arial"/>
+          <w:b/>
+          <w:bCs/>
+          <w:szCs w:val="21"/>
+        </w:rPr>
+        <w:t>Liang</w:t>
+      </w:r>
+      <w:r>
+        <w:rPr>
+          <w:rFonts w:ascii="Arial" w:eastAsiaTheme="minorEastAsia" w:hAnsi="Arial" w:cs="Arial" w:hint="eastAsia"/>
+          <w:b/>
+          <w:bCs/>
+          <w:szCs w:val="21"/>
+          <w:lang w:eastAsia="zh-CN"/>
+        </w:rPr>
+        <w:t>, B.</w:t>
+      </w:r>
+      <w:r>
+        <w:rPr>
+          <w:rFonts w:ascii="Arial" w:hAnsi="Arial" w:cs="Arial"/>
+          <w:b/>
+          <w:bCs/>
+          <w:szCs w:val="21"/>
+          <w:vertAlign w:val="superscript"/>
+        </w:rPr>
+        <w:t>#</w:t>
+      </w:r>
+      <w:r>
+        <w:rPr>
+          <w:rFonts w:ascii="Arial" w:hAnsi="Arial" w:cs="Arial"/>
+          <w:szCs w:val="21"/>
+        </w:rPr>
+        <w:t>,</w:t>
+      </w:r>
+      <w:r>
+        <w:rPr>
+          <w:rFonts w:ascii="Arial" w:eastAsiaTheme="minorEastAsia" w:hAnsi="Arial" w:cs="Arial" w:hint="eastAsia"/>
+          <w:szCs w:val="21"/>
+          <w:lang w:eastAsia="zh-CN"/>
+        </w:rPr>
+        <w:t xml:space="preserve"> </w:t>
+      </w:r>
+      <w:r>
+        <w:rPr>
+          <w:rFonts w:ascii="Arial" w:hAnsi="Arial" w:cs="Arial"/>
+          <w:szCs w:val="21"/>
+        </w:rPr>
+        <w:t>Du</w:t>
+      </w:r>
+      <w:r>
+        <w:rPr>
+          <w:rFonts w:ascii="Arial" w:eastAsiaTheme="minorEastAsia" w:hAnsi="Arial" w:cs="Arial" w:hint="eastAsia"/>
+          <w:szCs w:val="21"/>
+          <w:lang w:eastAsia="zh-CN"/>
+        </w:rPr>
+        <w:t>, Y.</w:t>
+      </w:r>
+      <w:r>
+        <w:rPr>
+          <w:rFonts w:ascii="Arial" w:eastAsiaTheme="minorEastAsia" w:hAnsi="Arial" w:cs="Arial" w:hint="eastAsia"/>
+          <w:szCs w:val="21"/>
+          <w:lang w:eastAsia="zh-CN"/>
+        </w:rPr>
+        <w:t>*</w:t>
+      </w:r>
+      <w:r>
+        <w:rPr>
+          <w:rFonts w:ascii="Arial" w:eastAsiaTheme="minorEastAsia" w:hAnsi="Arial" w:cs="Arial" w:hint="eastAsia"/>
+          <w:szCs w:val="21"/>
+          <w:lang w:eastAsia="zh-CN"/>
+        </w:rPr>
+        <w:t xml:space="preserve"> (2026).</w:t>
+      </w:r>
+      <w:r>
+        <w:rPr>
+          <w:rFonts w:ascii="Arial" w:hAnsi="Arial" w:cs="Arial" w:hint="eastAsia"/>
+          <w:szCs w:val="21"/>
+        </w:rPr>
+        <w:t xml:space="preserve"> </w:t>
+      </w:r>
+      <w:bookmarkStart w:id="0" w:name="OLE_LINK521"/>
+      <w:bookmarkStart w:id="1" w:name="OLE_LINK520"/>
+      <w:r>
+        <w:rPr>
+          <w:rFonts w:ascii="Arial" w:hAnsi="Arial" w:cs="Arial" w:hint="eastAsia"/>
+          <w:szCs w:val="21"/>
+        </w:rPr>
+        <w:t>Singing e</w:t>
+      </w:r>
+      <w:r>
+        <w:rPr>
+          <w:rFonts w:ascii="Arial" w:hAnsi="Arial" w:cs="Arial"/>
+          <w:szCs w:val="21"/>
+        </w:rPr>
+        <w:t>nhanc</w:t>
+      </w:r>
+      <w:r>
+        <w:rPr>
+          <w:rFonts w:ascii="Arial" w:hAnsi="Arial" w:cs="Arial" w:hint="eastAsia"/>
+          <w:szCs w:val="21"/>
+        </w:rPr>
+        <w:t>es</w:t>
+      </w:r>
+      <w:r>
+        <w:rPr>
+          <w:rFonts w:ascii="Arial" w:hAnsi="Arial" w:cs="Arial"/>
+          <w:szCs w:val="21"/>
+        </w:rPr>
+        <w:t xml:space="preserve"> </w:t>
+      </w:r>
+      <w:r>
+        <w:rPr>
+          <w:rFonts w:ascii="Arial" w:hAnsi="Arial" w:cs="Arial" w:hint="eastAsia"/>
+          <w:szCs w:val="21"/>
+        </w:rPr>
+        <w:t>p</w:t>
+      </w:r>
+      <w:r>
+        <w:rPr>
+          <w:rFonts w:ascii="Arial" w:hAnsi="Arial" w:cs="Arial"/>
+          <w:szCs w:val="21"/>
+        </w:rPr>
+        <w:t xml:space="preserve">oetry </w:t>
+      </w:r>
+      <w:r>
+        <w:rPr>
+          <w:rFonts w:ascii="Arial" w:hAnsi="Arial" w:cs="Arial" w:hint="eastAsia"/>
+          <w:szCs w:val="21"/>
+        </w:rPr>
+        <w:t>learning and m</w:t>
+      </w:r>
+      <w:r>
+        <w:rPr>
+          <w:rFonts w:ascii="Arial" w:hAnsi="Arial" w:cs="Arial"/>
+          <w:szCs w:val="21"/>
+        </w:rPr>
+        <w:t>emor</w:t>
+      </w:r>
+      <w:r>
+        <w:rPr>
+          <w:rFonts w:ascii="Arial" w:hAnsi="Arial" w:cs="Arial" w:hint="eastAsia"/>
+          <w:szCs w:val="21"/>
+        </w:rPr>
+        <w:t>ization</w:t>
+      </w:r>
+      <w:r>
+        <w:rPr>
+          <w:rFonts w:ascii="Arial" w:hAnsi="Arial" w:cs="Arial"/>
+          <w:szCs w:val="21"/>
+        </w:rPr>
+        <w:t xml:space="preserve"> in </w:t>
+      </w:r>
+      <w:r>
+        <w:rPr>
+          <w:rFonts w:ascii="Arial" w:hAnsi="Arial" w:cs="Arial" w:hint="eastAsia"/>
+          <w:szCs w:val="21"/>
+        </w:rPr>
+        <w:t>preschool</w:t>
+      </w:r>
+      <w:r>
+        <w:rPr>
+          <w:rFonts w:ascii="Arial" w:hAnsi="Arial" w:cs="Arial"/>
+          <w:szCs w:val="21"/>
+        </w:rPr>
+        <w:t xml:space="preserve"> </w:t>
+      </w:r>
+      <w:r>
+        <w:rPr>
+          <w:rFonts w:ascii="Arial" w:hAnsi="Arial" w:cs="Arial" w:hint="eastAsia"/>
+          <w:szCs w:val="21"/>
+        </w:rPr>
+        <w:t>c</w:t>
+      </w:r>
+      <w:r>
+        <w:rPr>
+          <w:rFonts w:ascii="Arial" w:hAnsi="Arial" w:cs="Arial"/>
+          <w:szCs w:val="21"/>
+        </w:rPr>
+        <w:t>hildren</w:t>
+      </w:r>
+      <w:bookmarkEnd w:id="0"/>
+      <w:bookmarkEnd w:id="1"/>
+      <w:r>
+        <w:rPr>
+          <w:rFonts w:ascii="Arial" w:eastAsiaTheme="minorEastAsia" w:hAnsi="Arial" w:cs="Arial" w:hint="eastAsia"/>
+          <w:szCs w:val="21"/>
+          <w:lang w:eastAsia="zh-CN"/>
+        </w:rPr>
+        <w:t xml:space="preserve">. </w:t>
+      </w:r>
+      <w:bookmarkStart w:id="2" w:name="_Hlk211158962"/>
+      <w:r>
+        <w:rPr>
+          <w:rFonts w:ascii="Arial" w:eastAsiaTheme="minorEastAsia" w:hAnsi="Arial" w:cs="Arial"/>
+          <w:b/>
+          <w:bCs/>
+          <w:i/>
+          <w:iCs/>
+          <w:szCs w:val="21"/>
+          <w:lang w:eastAsia="zh-CN"/>
+        </w:rPr>
+        <w:t>Annals of the New York Academy of Sciences</w:t>
+      </w:r>
+      <w:r>
+        <w:rPr>
+          <w:rFonts w:ascii="Arial" w:eastAsiaTheme="minorEastAsia" w:hAnsi="Arial" w:cs="Arial" w:hint="eastAsia"/>
+          <w:szCs w:val="21"/>
+          <w:lang w:eastAsia="zh-CN"/>
+        </w:rPr>
+        <w:t xml:space="preserve"> </w:t>
+      </w:r>
+      <w:r>
+        <w:rPr>
+          <w:rFonts w:ascii="Arial" w:eastAsiaTheme="minorEastAsia" w:hAnsi="Arial" w:cs="Arial" w:hint="eastAsia"/>
+          <w:szCs w:val="21"/>
+          <w:lang w:eastAsia="zh-CN"/>
+        </w:rPr>
+        <w:t>(</w:t>
+      </w:r>
+      <w:bookmarkEnd w:id="2"/>
+      <w:r>
+        <w:rPr>
+          <w:rFonts w:ascii="Arial" w:eastAsiaTheme="minorEastAsia" w:hAnsi="Arial" w:cs="Arial"/>
+          <w:szCs w:val="21"/>
+          <w:lang w:eastAsia="zh-CN"/>
+        </w:rPr>
+        <w:t>In Press</w:t>
+      </w:r>
+      <w:r>
+        <w:rPr>
+          <w:rFonts w:ascii="Arial" w:eastAsiaTheme="minorEastAsia" w:hAnsi="Arial" w:cs="Arial" w:hint="eastAsia"/>
+          <w:szCs w:val="21"/>
+          <w:lang w:eastAsia="zh-CN"/>
+        </w:rPr>
+        <w:t>)</w:t>
+      </w:r>
+      <w:r>
+        <w:rPr>
+          <w:rFonts w:ascii="Arial" w:eastAsiaTheme="minorEastAsia" w:hAnsi="Arial" w:cs="Arial" w:hint="eastAsia"/>
+          <w:szCs w:val="21"/>
+          <w:lang w:eastAsia="zh-CN"/>
+        </w:rPr>
+        <w:t xml:space="preserve">. </w:t>
+      </w:r>
+      <w:r>
+        <w:rPr>
+          <w:rFonts w:ascii="Arial" w:eastAsiaTheme="minorEastAsia" w:hAnsi="Arial" w:cs="Arial" w:hint="eastAsia"/>
+          <w:szCs w:val="21"/>
+          <w:lang w:eastAsia="zh-CN"/>
+        </w:rPr>
+        <w:t>[Co-first author]</w:t>
+      </w:r>
+    </w:p>
+    <w:p>
+      <w:pPr>
+        <w:pStyle w:val="ListParagraph"/>
+        <w:numPr>
+          <w:ilvl w:val="0"/>
+          <w:numId w:val="2"/>
+        </w:numPr>
+        <w:spacing w:before="120" w:after="120"/>
+        <w:contextualSpacing w:val="0"/>
+        <w:rPr>
+          <w:rFonts w:ascii="Arial" w:hAnsi="Arial" w:cs="Arial"/>
+          <w:szCs w:val="21"/>
+        </w:rPr>
+      </w:pPr>
+      <w:r>
+        <w:rPr>
+          <w:rFonts w:ascii="Arial" w:hAnsi="Arial" w:cs="Arial"/>
+          <w:szCs w:val="21"/>
+        </w:rPr>
+        <w:t>Wang, Y.</w:t>
+      </w:r>
+      <w:r>
+        <w:rPr>
+          <w:rFonts w:ascii="Arial" w:hAnsi="Arial" w:cs="Arial"/>
+          <w:szCs w:val="21"/>
+          <w:vertAlign w:val="superscript"/>
+        </w:rPr>
+        <w:t>#</w:t>
+      </w:r>
+      <w:r>
+        <w:rPr>
+          <w:rFonts w:ascii="Arial" w:hAnsi="Arial" w:cs="Arial"/>
+          <w:szCs w:val="21"/>
+        </w:rPr>
+        <w:t>, Yu, K.</w:t>
+      </w:r>
+      <w:r>
+        <w:rPr>
+          <w:rFonts w:ascii="Arial" w:hAnsi="Arial" w:cs="Arial"/>
+          <w:szCs w:val="21"/>
+          <w:vertAlign w:val="superscript"/>
+        </w:rPr>
+        <w:t>#</w:t>
+      </w:r>
+      <w:r>
+        <w:rPr>
+          <w:rFonts w:ascii="Arial" w:hAnsi="Arial" w:cs="Arial"/>
+          <w:szCs w:val="21"/>
+        </w:rPr>
+        <w:t xml:space="preserve">, Yin, S., </w:t>
+      </w:r>
+      <w:r>
+        <w:rPr>
+          <w:rFonts w:ascii="Arial" w:hAnsi="Arial" w:cs="Arial"/>
+          <w:b/>
+          <w:bCs/>
+          <w:szCs w:val="21"/>
+        </w:rPr>
+        <w:t>Liang, B.</w:t>
+      </w:r>
+      <w:r>
+        <w:rPr>
+          <w:rFonts w:ascii="Arial" w:hAnsi="Arial" w:cs="Arial"/>
+          <w:szCs w:val="21"/>
+        </w:rPr>
+        <w:t xml:space="preserve">*, Wang, R.* (2026). Theta and gamma transcranial alternating current stimulation (tACS) modulate Mandarin consonant and lexical tone perception. </w:t>
+      </w:r>
+      <w:r>
+        <w:rPr>
+          <w:rFonts w:ascii="Arial" w:hAnsi="Arial" w:cs="Arial"/>
+          <w:b/>
+          <w:bCs/>
+          <w:i/>
+          <w:iCs/>
+          <w:szCs w:val="21"/>
+        </w:rPr>
+        <w:t>Neurobiology of Language</w:t>
+      </w:r>
+      <w:r>
+        <w:rPr>
+          <w:rFonts w:ascii="Arial" w:hAnsi="Arial" w:cs="Arial"/>
+          <w:szCs w:val="21"/>
+        </w:rPr>
+        <w:t>. (</w:t>
+      </w:r>
+      <w:r>
+        <w:rPr>
+          <w:rFonts w:ascii="Arial" w:hAnsi="Arial" w:cs="Arial"/>
+          <w:szCs w:val="21"/>
+        </w:rPr>
+        <w:t>In Press</w:t>
+      </w:r>
+      <w:r>
+        <w:rPr>
+          <w:rFonts w:ascii="Arial" w:hAnsi="Arial" w:cs="Arial"/>
+          <w:szCs w:val="21"/>
+        </w:rPr>
+        <w:t>). (Preprint available on bioRxiv: 2025, 679546). [Co-corresponding author]</w:t>
+      </w:r>
+    </w:p>
+    <w:p>
+      <w:pPr>
+        <w:pStyle w:val="ListParagraph"/>
+        <w:numPr>
+          <w:ilvl w:val="0"/>
+          <w:numId w:val="2"/>
+        </w:numPr>
+        <w:spacing w:before="120" w:after="120"/>
+        <w:contextualSpacing w:val="0"/>
+        <w:rPr>
+          <w:rFonts w:ascii="Arial" w:hAnsi="Arial" w:cs="Arial"/>
+          <w:szCs w:val="21"/>
+        </w:rPr>
+      </w:pPr>
+      <w:r>
+        <w:rPr>
+          <w:rFonts w:ascii="Arial" w:hAnsi="Arial" w:cs="Arial"/>
+          <w:szCs w:val="21"/>
+        </w:rPr>
+        <w:t>Zhao, W.</w:t>
+      </w:r>
+      <w:r>
+        <w:rPr>
+          <w:rFonts w:ascii="Arial" w:hAnsi="Arial" w:cs="Arial"/>
+          <w:szCs w:val="21"/>
+          <w:vertAlign w:val="superscript"/>
+        </w:rPr>
+        <w:t>#</w:t>
+      </w:r>
+      <w:r>
+        <w:rPr>
+          <w:rFonts w:ascii="Arial" w:hAnsi="Arial" w:cs="Arial"/>
+          <w:szCs w:val="21"/>
+        </w:rPr>
+        <w:t>, Shi, W.</w:t>
+      </w:r>
+      <w:r>
+        <w:rPr>
+          <w:rFonts w:ascii="Arial" w:hAnsi="Arial" w:cs="Arial"/>
+          <w:szCs w:val="21"/>
+          <w:vertAlign w:val="superscript"/>
+        </w:rPr>
+        <w:t>#</w:t>
+      </w:r>
+      <w:r>
+        <w:rPr>
+          <w:rFonts w:ascii="Arial" w:hAnsi="Arial" w:cs="Arial"/>
+          <w:szCs w:val="21"/>
+        </w:rPr>
+        <w:t xml:space="preserve">, </w:t>
+      </w:r>
+      <w:r>
+        <w:rPr>
+          <w:rFonts w:ascii="Arial" w:hAnsi="Arial" w:cs="Arial"/>
+          <w:b/>
+          <w:bCs/>
+          <w:szCs w:val="21"/>
+        </w:rPr>
+        <w:t>Liang, B.</w:t>
+      </w:r>
+      <w:r>
+        <w:rPr>
+          <w:rFonts w:ascii="Arial" w:hAnsi="Arial" w:cs="Arial"/>
+          <w:szCs w:val="21"/>
+        </w:rPr>
+        <w:t>, Ma, L., Zhang, G., Lin, N.*</w:t>
+      </w:r>
+      <w:r>
+        <w:rPr>
+          <w:rFonts w:ascii="Arial" w:eastAsiaTheme="minorEastAsia" w:hAnsi="Arial" w:cs="Arial" w:hint="eastAsia"/>
+          <w:szCs w:val="21"/>
+          <w:lang w:eastAsia="zh-CN"/>
+        </w:rPr>
+        <w:t xml:space="preserve"> </w:t>
+      </w:r>
+      <w:r>
+        <w:rPr>
+          <w:rFonts w:ascii="Arial" w:eastAsiaTheme="minorEastAsia" w:hAnsi="Arial" w:cs="Arial"/>
+          <w:szCs w:val="21"/>
+          <w:lang w:eastAsia="zh-CN"/>
+        </w:rPr>
+        <w:t>(2026).</w:t>
+      </w:r>
+      <w:r>
+        <w:rPr>
+          <w:rFonts w:ascii="Arial" w:eastAsiaTheme="minorEastAsia" w:hAnsi="Arial" w:cs="Arial" w:hint="eastAsia"/>
+          <w:szCs w:val="21"/>
+          <w:lang w:eastAsia="zh-CN"/>
+        </w:rPr>
+        <w:t xml:space="preserve"> </w:t>
+      </w:r>
+      <w:r>
+        <w:rPr>
+          <w:rFonts w:ascii="Arial" w:eastAsiaTheme="minorEastAsia" w:hAnsi="Arial" w:cs="Arial"/>
+          <w:szCs w:val="21"/>
+          <w:lang w:eastAsia="zh-CN"/>
+        </w:rPr>
+        <w:t>TMS</w:t>
+      </w:r>
+      <w:r>
+        <w:rPr>
+          <w:rFonts w:ascii="Arial" w:eastAsiaTheme="minorEastAsia" w:hAnsi="Arial" w:cs="Arial"/>
+          <w:szCs w:val="21"/>
+          <w:lang w:eastAsia="zh-CN"/>
+        </w:rPr>
+        <w:t xml:space="preserve"> reveals hybrid neural functions underlying the sentence superiority effect</w:t>
+      </w:r>
+      <w:r>
+        <w:rPr>
+          <w:rFonts w:ascii="Arial" w:eastAsiaTheme="minorEastAsia" w:hAnsi="Arial" w:cs="Arial" w:hint="eastAsia"/>
+          <w:szCs w:val="21"/>
+          <w:lang w:eastAsia="zh-CN"/>
+        </w:rPr>
+        <w:t xml:space="preserve">. </w:t>
+      </w:r>
+      <w:r>
+        <w:rPr>
+          <w:rFonts w:ascii="Arial" w:hAnsi="Arial" w:cs="Arial"/>
+          <w:b/>
+          <w:bCs/>
+          <w:i/>
+          <w:iCs/>
+          <w:szCs w:val="21"/>
+        </w:rPr>
+        <w:t>Neurobiology of Language</w:t>
+      </w:r>
+      <w:r>
+        <w:rPr>
+          <w:rFonts w:ascii="Arial" w:hAnsi="Arial" w:cs="Arial"/>
+          <w:szCs w:val="21"/>
+        </w:rPr>
+        <w:t>. (Provisionally Accepted).</w:t>
+      </w:r>
+    </w:p>
+    <w:p>
+      <w:pPr>
+        <w:pStyle w:val="ListParagraph"/>
+        <w:numPr>
+          <w:ilvl w:val="0"/>
+          <w:numId w:val="2"/>
+        </w:numPr>
+        <w:ind w:left="714" w:hanging="357"/>
+        <w:contextualSpacing w:val="0"/>
+        <w:rPr>
+          <w:rFonts w:ascii="Arial" w:hAnsi="Arial" w:cs="Arial"/>
+          <w:szCs w:val="21"/>
+        </w:rPr>
+      </w:pPr>
+      <w:r>
+        <w:rPr>
+          <w:rFonts w:ascii="Arial" w:hAnsi="Arial" w:cs="Arial"/>
+          <w:b/>
+          <w:bCs/>
+          <w:szCs w:val="21"/>
+        </w:rPr>
+        <w:t>Liang,</w:t>
+      </w:r>
+      <w:r>
+        <w:rPr>
+          <w:rFonts w:ascii="Arial" w:eastAsiaTheme="minorEastAsia" w:hAnsi="Arial" w:cs="Arial" w:hint="eastAsia"/>
+          <w:b/>
+          <w:bCs/>
+          <w:szCs w:val="21"/>
+          <w:lang w:eastAsia="zh-CN"/>
+        </w:rPr>
+        <w:t xml:space="preserve"> B., </w:t>
+      </w:r>
+      <w:r>
+        <w:rPr>
+          <w:rFonts w:ascii="Arial" w:hAnsi="Arial" w:cs="Arial"/>
+          <w:szCs w:val="21"/>
+        </w:rPr>
+        <w:t>Li,</w:t>
+      </w:r>
+      <w:r>
+        <w:rPr>
+          <w:rFonts w:ascii="Arial" w:eastAsiaTheme="minorEastAsia" w:hAnsi="Arial" w:cs="Arial" w:hint="eastAsia"/>
+          <w:szCs w:val="21"/>
+          <w:lang w:eastAsia="zh-CN"/>
+        </w:rPr>
+        <w:t xml:space="preserve"> Y.,</w:t>
+      </w:r>
+      <w:r>
+        <w:rPr>
+          <w:rFonts w:ascii="Arial" w:hAnsi="Arial" w:cs="Arial"/>
+          <w:szCs w:val="21"/>
+        </w:rPr>
+        <w:t xml:space="preserve"> Zhao,</w:t>
+      </w:r>
+      <w:r>
+        <w:rPr>
+          <w:rFonts w:ascii="Arial" w:eastAsiaTheme="minorEastAsia" w:hAnsi="Arial" w:cs="Arial" w:hint="eastAsia"/>
+          <w:szCs w:val="21"/>
+          <w:lang w:eastAsia="zh-CN"/>
+        </w:rPr>
+        <w:t xml:space="preserve"> W., </w:t>
+      </w:r>
+      <w:r>
+        <w:rPr>
+          <w:rFonts w:ascii="Arial" w:hAnsi="Arial" w:cs="Arial"/>
+          <w:bCs/>
+          <w:szCs w:val="21"/>
+        </w:rPr>
+        <w:t>Du</w:t>
+      </w:r>
+      <w:r>
+        <w:rPr>
+          <w:rFonts w:ascii="Arial" w:eastAsiaTheme="minorEastAsia" w:hAnsi="Arial" w:cs="Arial" w:hint="eastAsia"/>
+          <w:bCs/>
+          <w:szCs w:val="21"/>
+          <w:lang w:eastAsia="zh-CN"/>
+        </w:rPr>
+        <w:t>, Y.</w:t>
+      </w:r>
+      <w:r>
+        <w:rPr>
+          <w:rFonts w:ascii="Arial" w:hAnsi="Arial" w:cs="Arial"/>
+          <w:bCs/>
+          <w:szCs w:val="21"/>
+        </w:rPr>
+        <w:t>*</w:t>
+      </w:r>
+      <w:r>
+        <w:rPr>
+          <w:rFonts w:ascii="Arial" w:eastAsiaTheme="minorEastAsia" w:hAnsi="Arial" w:cs="Arial" w:hint="eastAsia"/>
+          <w:bCs/>
+          <w:szCs w:val="21"/>
+          <w:lang w:eastAsia="zh-CN"/>
+        </w:rPr>
+        <w:t xml:space="preserve"> (2023).</w:t>
+      </w:r>
+      <w:r>
+        <w:rPr>
+          <w:rFonts w:ascii="Arial" w:hAnsi="Arial" w:cs="Arial"/>
+          <w:szCs w:val="21"/>
+        </w:rPr>
+        <w:t xml:space="preserve"> </w:t>
+      </w:r>
+      <w:r>
+        <w:rPr>
+          <w:rFonts w:ascii="Arial" w:hAnsi="Arial" w:cs="Arial"/>
+        </w:rPr>
+        <w:t xml:space="preserve">Bilateral human laryngeal motor cortex in perceptual decision of lexical tone and voicing of consonant. </w:t>
+      </w:r>
+      <w:r>
+        <w:rPr>
+          <w:rFonts w:ascii="Arial" w:hAnsi="Arial" w:cs="Arial"/>
+          <w:b/>
+          <w:bCs/>
+          <w:i/>
+          <w:iCs/>
+        </w:rPr>
+        <w:t>Nature Communications</w:t>
+      </w:r>
+      <w:r>
+        <w:rPr>
+          <w:rFonts w:ascii="Arial" w:hAnsi="Arial" w:cs="Arial"/>
+        </w:rPr>
+        <w:t>,</w:t>
+      </w:r>
+      <w:r>
+        <w:rPr>
+          <w:rFonts w:ascii="Arial" w:eastAsiaTheme="minorEastAsia" w:hAnsi="Arial" w:cs="Arial" w:hint="eastAsia"/>
+          <w:lang w:eastAsia="zh-CN"/>
+        </w:rPr>
+        <w:t xml:space="preserve"> </w:t>
+      </w:r>
+      <w:r>
+        <w:rPr>
+          <w:rFonts w:ascii="Arial" w:hAnsi="Arial" w:cs="Arial"/>
+        </w:rPr>
+        <w:t xml:space="preserve">14, 4710. </w:t>
+      </w:r>
+      <w:r>
+        <w:rPr>
+          <w:rFonts w:ascii="Arial" w:eastAsiaTheme="minorEastAsia" w:hAnsi="Arial" w:cs="Arial" w:hint="eastAsia"/>
+          <w:szCs w:val="21"/>
+          <w:lang w:eastAsia="zh-CN"/>
+        </w:rPr>
+        <w:t>[</w:t>
+      </w:r>
+      <w:r>
+        <w:rPr>
+          <w:rFonts w:ascii="Arial" w:hAnsi="Arial" w:cs="Arial"/>
+          <w:szCs w:val="21"/>
+        </w:rPr>
+        <w:t>First author</w:t>
+      </w:r>
+      <w:r>
+        <w:rPr>
+          <w:rFonts w:ascii="Arial" w:eastAsiaTheme="minorEastAsia" w:hAnsi="Arial" w:cs="Arial" w:hint="eastAsia"/>
+          <w:szCs w:val="21"/>
+          <w:lang w:eastAsia="zh-CN"/>
+        </w:rPr>
+        <w:t>]</w:t>
+      </w:r>
+    </w:p>
+    <w:p>
+      <w:pPr>
+        <w:pStyle w:val="ListParagraph"/>
+        <w:numPr>
+          <w:ilvl w:val="0"/>
+          <w:numId w:val="2"/>
+        </w:numPr>
+        <w:ind w:left="714" w:hanging="357"/>
+        <w:contextualSpacing w:val="0"/>
+        <w:rPr>
+          <w:rFonts w:ascii="Arial" w:hAnsi="Arial" w:cs="Arial"/>
+          <w:szCs w:val="21"/>
+        </w:rPr>
+      </w:pPr>
+      <w:r>
+        <w:rPr>
+          <w:rFonts w:ascii="Arial" w:hAnsi="Arial" w:cs="Arial"/>
+          <w:b/>
+          <w:bCs/>
+          <w:szCs w:val="21"/>
+        </w:rPr>
+        <w:t>Liang</w:t>
+      </w:r>
+      <w:r>
+        <w:rPr>
+          <w:rFonts w:ascii="Arial" w:eastAsiaTheme="minorEastAsia" w:hAnsi="Arial" w:cs="Arial" w:hint="eastAsia"/>
+          <w:b/>
+          <w:bCs/>
+          <w:szCs w:val="21"/>
+          <w:lang w:eastAsia="zh-CN"/>
+        </w:rPr>
+        <w:t>, B.</w:t>
+      </w:r>
+      <w:r>
+        <w:rPr>
+          <w:rFonts w:ascii="Arial" w:hAnsi="Arial" w:cs="Arial"/>
+          <w:b/>
+          <w:bCs/>
+          <w:szCs w:val="21"/>
+        </w:rPr>
+        <w:t xml:space="preserve"> </w:t>
+      </w:r>
+      <w:r>
+        <w:rPr>
+          <w:rFonts w:ascii="Arial" w:hAnsi="Arial" w:cs="Arial"/>
+          <w:szCs w:val="21"/>
+        </w:rPr>
+        <w:t>&amp;</w:t>
+      </w:r>
+      <w:r>
+        <w:rPr>
+          <w:rFonts w:ascii="Arial" w:hAnsi="Arial" w:cs="Arial"/>
+          <w:b/>
+          <w:bCs/>
+          <w:szCs w:val="21"/>
+        </w:rPr>
+        <w:t xml:space="preserve"> </w:t>
+      </w:r>
+      <w:r>
+        <w:rPr>
+          <w:rFonts w:ascii="Arial" w:hAnsi="Arial" w:cs="Arial"/>
+          <w:bCs/>
+          <w:szCs w:val="21"/>
+        </w:rPr>
+        <w:t>Du</w:t>
+      </w:r>
+      <w:r>
+        <w:rPr>
+          <w:rFonts w:ascii="Arial" w:eastAsiaTheme="minorEastAsia" w:hAnsi="Arial" w:cs="Arial" w:hint="eastAsia"/>
+          <w:bCs/>
+          <w:szCs w:val="21"/>
+          <w:lang w:eastAsia="zh-CN"/>
+        </w:rPr>
+        <w:t>, Y.</w:t>
+      </w:r>
+      <w:r>
+        <w:rPr>
+          <w:rFonts w:ascii="Arial" w:hAnsi="Arial" w:cs="Arial"/>
+          <w:bCs/>
+          <w:szCs w:val="21"/>
+        </w:rPr>
+        <w:t>*</w:t>
+      </w:r>
+      <w:r>
+        <w:rPr>
+          <w:rFonts w:ascii="Arial" w:eastAsiaTheme="minorEastAsia" w:hAnsi="Arial" w:cs="Arial" w:hint="eastAsia"/>
+          <w:bCs/>
+          <w:szCs w:val="21"/>
+          <w:lang w:eastAsia="zh-CN"/>
+        </w:rPr>
+        <w:t xml:space="preserve"> (2018).</w:t>
+      </w:r>
+      <w:r>
+        <w:rPr>
+          <w:rFonts w:ascii="Arial" w:hAnsi="Arial" w:cs="Arial"/>
+          <w:szCs w:val="21"/>
+        </w:rPr>
+        <w:t xml:space="preserve"> The functional neuroanatomy of lexical tone perception: an activation likelihood estimation meta-analysis. </w:t>
+      </w:r>
+      <w:r>
+        <w:rPr>
+          <w:rFonts w:ascii="Arial" w:hAnsi="Arial" w:cs="Arial"/>
+          <w:b/>
+          <w:bCs/>
+          <w:i/>
+          <w:iCs/>
+          <w:szCs w:val="21"/>
+        </w:rPr>
+        <w:t>Frontiers in Neuroscience</w:t>
+      </w:r>
+      <w:r>
+        <w:rPr>
+          <w:rFonts w:ascii="Arial" w:hAnsi="Arial" w:cs="Arial"/>
+          <w:szCs w:val="21"/>
+        </w:rPr>
+        <w:t xml:space="preserve">, 12, 495. </w:t>
+      </w:r>
+      <w:r>
+        <w:rPr>
+          <w:rFonts w:ascii="Arial" w:eastAsiaTheme="minorEastAsia" w:hAnsi="Arial" w:cs="Arial" w:hint="eastAsia"/>
+          <w:szCs w:val="21"/>
+          <w:lang w:eastAsia="zh-CN"/>
+        </w:rPr>
+        <w:t>[</w:t>
+      </w:r>
+      <w:r>
+        <w:rPr>
+          <w:rFonts w:ascii="Arial" w:hAnsi="Arial" w:cs="Arial"/>
+          <w:szCs w:val="21"/>
+        </w:rPr>
+        <w:t>First author</w:t>
+      </w:r>
+      <w:r>
+        <w:rPr>
+          <w:rFonts w:ascii="Arial" w:eastAsiaTheme="minorEastAsia" w:hAnsi="Arial" w:cs="Arial" w:hint="eastAsia"/>
+          <w:szCs w:val="21"/>
+          <w:lang w:eastAsia="zh-CN"/>
+        </w:rPr>
+        <w:t>]</w:t>
+      </w:r>
+    </w:p>
+    <w:p>
+      <w:pPr>
+        <w:pStyle w:val="ListParagraph"/>
+        <w:numPr>
+          <w:ilvl w:val="0"/>
+          <w:numId w:val="2"/>
+        </w:numPr>
+        <w:ind w:left="714" w:hanging="357"/>
+        <w:contextualSpacing w:val="0"/>
+        <w:rPr>
+          <w:rFonts w:eastAsia="KaiTi"/>
+          <w:szCs w:val="21"/>
+        </w:rPr>
+      </w:pPr>
+      <w:r>
+        <w:rPr>
+          <w:rFonts w:ascii="Arial" w:eastAsia="KaiTi" w:hAnsi="Arial" w:cs="Arial"/>
+          <w:b/>
+          <w:bCs/>
+          <w:szCs w:val="21"/>
+        </w:rPr>
+        <w:t>Liang</w:t>
+      </w:r>
+      <w:r>
+        <w:rPr>
+          <w:rFonts w:ascii="Arial" w:eastAsia="KaiTi" w:hAnsi="Arial" w:cs="Arial" w:hint="eastAsia"/>
+          <w:b/>
+          <w:bCs/>
+          <w:szCs w:val="21"/>
+          <w:lang w:eastAsia="zh-CN"/>
+        </w:rPr>
+        <w:t>, B.</w:t>
+      </w:r>
+      <w:r>
+        <w:rPr>
+          <w:rFonts w:ascii="Arial" w:eastAsia="KaiTi" w:hAnsi="Arial" w:cs="Arial"/>
+          <w:b/>
+          <w:bCs/>
+          <w:szCs w:val="21"/>
+        </w:rPr>
+        <w:t xml:space="preserve"> </w:t>
+      </w:r>
+      <w:r>
+        <w:rPr>
+          <w:rFonts w:ascii="Arial" w:eastAsia="KaiTi" w:hAnsi="Arial" w:cs="Arial"/>
+          <w:szCs w:val="21"/>
+        </w:rPr>
+        <w:t>&amp;</w:t>
+      </w:r>
+      <w:r>
+        <w:rPr>
+          <w:rFonts w:ascii="Arial" w:eastAsia="KaiTi" w:hAnsi="Arial" w:cs="Arial"/>
+          <w:b/>
+          <w:bCs/>
+          <w:szCs w:val="21"/>
+        </w:rPr>
+        <w:t xml:space="preserve"> </w:t>
+      </w:r>
+      <w:r>
+        <w:rPr>
+          <w:rFonts w:ascii="Arial" w:eastAsia="KaiTi" w:hAnsi="Arial" w:cs="Arial"/>
+          <w:bCs/>
+          <w:szCs w:val="21"/>
+        </w:rPr>
+        <w:t>Du</w:t>
+      </w:r>
+      <w:r>
+        <w:rPr>
+          <w:rFonts w:ascii="Arial" w:eastAsia="KaiTi" w:hAnsi="Arial" w:cs="Arial" w:hint="eastAsia"/>
+          <w:bCs/>
+          <w:szCs w:val="21"/>
+          <w:lang w:eastAsia="zh-CN"/>
+        </w:rPr>
+        <w:t>, Y.</w:t>
+      </w:r>
+      <w:r>
+        <w:rPr>
+          <w:rFonts w:ascii="Arial" w:eastAsia="KaiTi" w:hAnsi="Arial" w:cs="Arial"/>
+          <w:bCs/>
+          <w:szCs w:val="21"/>
+        </w:rPr>
+        <w:t>*</w:t>
+      </w:r>
+      <w:r>
+        <w:rPr>
+          <w:rFonts w:ascii="Arial" w:eastAsia="KaiTi" w:hAnsi="Arial" w:cs="Arial" w:hint="eastAsia"/>
+          <w:bCs/>
+          <w:szCs w:val="21"/>
+          <w:lang w:eastAsia="zh-CN"/>
+        </w:rPr>
+        <w:t xml:space="preserve"> (2017).</w:t>
+      </w:r>
+      <w:r>
+        <w:rPr>
+          <w:rFonts w:ascii="Arial" w:eastAsia="KaiTi" w:hAnsi="Arial" w:cs="Arial"/>
+          <w:szCs w:val="21"/>
+        </w:rPr>
+        <w:t xml:space="preserve"> Mechanisms of sensorimotor integration in speech perception [</w:t>
+      </w:r>
+      <w:r>
+        <w:rPr>
+          <w:rFonts w:ascii="Arial" w:eastAsia="KaiTi" w:hAnsi="Arial" w:cs="Arial"/>
+          <w:szCs w:val="21"/>
+        </w:rPr>
+        <w:t>言语知觉中的感觉运动整合机制</w:t>
+      </w:r>
+      <w:r>
+        <w:rPr>
+          <w:rFonts w:ascii="Arial" w:eastAsia="KaiTi" w:hAnsi="Arial" w:cs="Arial"/>
+          <w:szCs w:val="21"/>
+        </w:rPr>
+        <w:t xml:space="preserve">]. </w:t>
+      </w:r>
+      <w:r>
+        <w:rPr>
+          <w:rFonts w:ascii="Arial" w:eastAsia="KaiTi" w:hAnsi="Arial" w:cs="Arial"/>
+          <w:b/>
+          <w:bCs/>
+          <w:i/>
+          <w:szCs w:val="21"/>
+        </w:rPr>
+        <w:t>Science &amp; Technology Review</w:t>
+      </w:r>
+      <w:r>
+        <w:rPr>
+          <w:rFonts w:ascii="Arial" w:eastAsia="KaiTi" w:hAnsi="Arial" w:cs="Arial"/>
+          <w:i/>
+          <w:szCs w:val="21"/>
+        </w:rPr>
+        <w:t xml:space="preserve"> [</w:t>
+      </w:r>
+      <w:r>
+        <w:rPr>
+          <w:rFonts w:ascii="Arial" w:eastAsia="KaiTi" w:hAnsi="Arial" w:cs="Arial"/>
+          <w:i/>
+          <w:iCs/>
+          <w:szCs w:val="21"/>
+        </w:rPr>
+        <w:t>科技导报</w:t>
+      </w:r>
+      <w:r>
+        <w:rPr>
+          <w:rFonts w:ascii="Arial" w:eastAsia="KaiTi" w:hAnsi="Arial" w:cs="Arial"/>
+          <w:i/>
+          <w:iCs/>
+          <w:szCs w:val="21"/>
+        </w:rPr>
+        <w:t>]</w:t>
+      </w:r>
+      <w:r>
+        <w:rPr>
+          <w:rFonts w:ascii="Arial" w:eastAsia="KaiTi" w:hAnsi="Arial" w:cs="Arial"/>
+          <w:szCs w:val="21"/>
+        </w:rPr>
+        <w:t xml:space="preserve">, 35(19):21-28. </w:t>
+      </w:r>
+      <w:r>
+        <w:rPr>
+          <w:rFonts w:ascii="Arial" w:eastAsiaTheme="minorEastAsia" w:hAnsi="Arial" w:cs="Arial" w:hint="eastAsia"/>
+          <w:szCs w:val="21"/>
+          <w:lang w:eastAsia="zh-CN"/>
+        </w:rPr>
+        <w:t>[</w:t>
+      </w:r>
+      <w:r>
+        <w:rPr>
+          <w:rFonts w:ascii="Arial" w:hAnsi="Arial" w:cs="Arial"/>
+          <w:szCs w:val="21"/>
+        </w:rPr>
+        <w:t>First author</w:t>
+      </w:r>
+      <w:r>
+        <w:rPr>
+          <w:rFonts w:ascii="Arial" w:eastAsiaTheme="minorEastAsia" w:hAnsi="Arial" w:cs="Arial" w:hint="eastAsia"/>
+          <w:szCs w:val="21"/>
+          <w:lang w:eastAsia="zh-CN"/>
+        </w:rPr>
+        <w:t>]</w:t>
       </w:r>
     </w:p>
     <w:p>
@@ -2914,17 +4337,25 @@
           <w:sz w:val="28"/>
           <w:szCs w:val="28"/>
         </w:rPr>
-        <w:lastRenderedPageBreak/>
-        <w:t>P</w:t>
-      </w:r>
-      <w:r>
-        <w:rPr>
-          <w:rFonts w:ascii="Arial" w:hAnsi="Arial" w:cs="Arial"/>
-          <w:b/>
-          <w:sz w:val="22"/>
-          <w:szCs w:val="22"/>
-        </w:rPr>
-        <w:t xml:space="preserve">EER </w:t>
+        <w:t>M</w:t>
+      </w:r>
+      <w:r>
+        <w:rPr>
+          <w:rFonts w:ascii="Arial" w:hAnsi="Arial" w:cs="Arial"/>
+          <w:b/>
+          <w:sz w:val="22"/>
+          <w:szCs w:val="22"/>
+        </w:rPr>
+        <w:t xml:space="preserve">ANUSCRIPTS </w:t>
+      </w:r>
+      <w:r>
+        <w:rPr>
+          <w:rFonts w:ascii="Arial" w:hAnsi="Arial" w:cs="Arial"/>
+          <w:b/>
+          <w:sz w:val="22"/>
+          <w:szCs w:val="22"/>
+        </w:rPr>
+        <w:t xml:space="preserve">UNDER </w:t>
       </w:r>
       <w:r>
         <w:rPr>
@@ -2942,47 +4373,15 @@
           <w:sz w:val="22"/>
           <w:szCs w:val="22"/>
         </w:rPr>
-        <w:t xml:space="preserve">EVIEWED </w:t>
-      </w:r>
-      <w:r>
-        <w:rPr>
-          <w:rFonts w:ascii="Arial" w:hAnsi="Arial" w:cs="Arial"/>
-          <w:b/>
-          <w:sz w:val="28"/>
-          <w:szCs w:val="28"/>
-        </w:rPr>
-        <w:t>P</w:t>
-      </w:r>
-      <w:r>
-        <w:rPr>
-          <w:rFonts w:ascii="Arial" w:hAnsi="Arial" w:cs="Arial"/>
-          <w:b/>
-          <w:sz w:val="22"/>
-          <w:szCs w:val="22"/>
-        </w:rPr>
-        <w:t xml:space="preserve">UBLICATIONS </w:t>
-      </w:r>
-    </w:p>
-    <w:p>
-      <w:pPr>
-        <w:tabs>
-          <w:tab w:val="left" w:pos="0"/>
-        </w:tabs>
-        <w:jc w:val="both"/>
-        <w:rPr>
-          <w:rFonts w:ascii="Arial" w:hAnsi="Arial" w:cs="Arial"/>
-          <w:b/>
-          <w:sz w:val="22"/>
-          <w:szCs w:val="22"/>
-        </w:rPr>
-      </w:pPr>
+        <w:t>EVIEW</w:t>
+      </w:r>
     </w:p>
     <w:p>
       <w:pPr>
         <w:pStyle w:val="ListParagraph"/>
         <w:numPr>
           <w:ilvl w:val="0"/>
-          <w:numId w:val="2"/>
+          <w:numId w:val="7"/>
         </w:numPr>
         <w:spacing w:before="120" w:after="120"/>
         <w:contextualSpacing w:val="0"/>
@@ -2996,24 +4395,15 @@
           <w:rFonts w:ascii="Arial" w:hAnsi="Arial" w:cs="Arial"/>
           <w:szCs w:val="21"/>
         </w:rPr>
-        <w:t>Hu</w:t>
-      </w:r>
-      <w:r>
-        <w:rPr>
-          <w:rFonts w:ascii="Arial" w:eastAsiaTheme="minorEastAsia" w:hAnsi="Arial" w:cs="Arial" w:hint="eastAsia"/>
-          <w:szCs w:val="21"/>
-          <w:lang w:eastAsia="zh-CN"/>
-        </w:rPr>
-        <w:t xml:space="preserve">, </w:t>
-      </w:r>
-      <w:proofErr w:type="gramStart"/>
-      <w:r>
-        <w:rPr>
-          <w:rFonts w:ascii="Arial" w:eastAsiaTheme="minorEastAsia" w:hAnsi="Arial" w:cs="Arial" w:hint="eastAsia"/>
-          <w:szCs w:val="21"/>
-          <w:lang w:eastAsia="zh-CN"/>
-        </w:rPr>
-        <w:t>W.</w:t>
+        <w:t>Liu</w:t>
+      </w:r>
+      <w:r>
+        <w:rPr>
+          <w:rFonts w:ascii="Arial" w:eastAsiaTheme="minorEastAsia" w:hAnsi="Arial" w:cs="Arial" w:hint="eastAsia"/>
+          <w:szCs w:val="21"/>
+          <w:lang w:eastAsia="zh-CN"/>
+        </w:rPr>
+        <w:t>, J.</w:t>
       </w:r>
       <w:r>
         <w:rPr>
@@ -3023,13 +4413,111 @@
         </w:rPr>
         <w:t>#</w:t>
       </w:r>
-      <w:proofErr w:type="gramEnd"/>
-      <w:r>
-        <w:rPr>
-          <w:rFonts w:ascii="Arial" w:hAnsi="Arial" w:cs="Arial"/>
-          <w:szCs w:val="21"/>
-        </w:rPr>
-        <w:t xml:space="preserve">, </w:t>
+      <w:r>
+        <w:rPr>
+          <w:rFonts w:ascii="Arial" w:hAnsi="Arial" w:cs="Arial"/>
+          <w:szCs w:val="21"/>
+        </w:rPr>
+        <w:t>, Wang</w:t>
+      </w:r>
+      <w:r>
+        <w:rPr>
+          <w:rFonts w:ascii="Arial" w:eastAsiaTheme="minorEastAsia" w:hAnsi="Arial" w:cs="Arial" w:hint="eastAsia"/>
+          <w:szCs w:val="21"/>
+          <w:lang w:eastAsia="zh-CN"/>
+        </w:rPr>
+        <w:t>, Y.</w:t>
+      </w:r>
+      <w:r>
+        <w:rPr>
+          <w:rFonts w:ascii="Arial" w:hAnsi="Arial" w:cs="Arial"/>
+          <w:szCs w:val="21"/>
+          <w:vertAlign w:val="superscript"/>
+        </w:rPr>
+        <w:t>#</w:t>
+      </w:r>
+      <w:r>
+        <w:rPr>
+          <w:rFonts w:ascii="Arial" w:hAnsi="Arial" w:cs="Arial"/>
+          <w:szCs w:val="21"/>
+        </w:rPr>
+        <w:t>, Feng</w:t>
+      </w:r>
+      <w:r>
+        <w:rPr>
+          <w:rFonts w:ascii="Arial" w:eastAsiaTheme="minorEastAsia" w:hAnsi="Arial" w:cs="Arial" w:hint="eastAsia"/>
+          <w:szCs w:val="21"/>
+          <w:lang w:eastAsia="zh-CN"/>
+        </w:rPr>
+        <w:t>, J.</w:t>
+      </w:r>
+      <w:r>
+        <w:rPr>
+          <w:rFonts w:ascii="Arial" w:hAnsi="Arial" w:cs="Arial"/>
+          <w:szCs w:val="21"/>
+          <w:vertAlign w:val="superscript"/>
+        </w:rPr>
+        <w:t>#</w:t>
+      </w:r>
+      <w:r>
+        <w:rPr>
+          <w:rFonts w:ascii="Arial" w:hAnsi="Arial" w:cs="Arial"/>
+          <w:szCs w:val="21"/>
+        </w:rPr>
+        <w:t>, Zhao</w:t>
+      </w:r>
+      <w:r>
+        <w:rPr>
+          <w:rFonts w:ascii="Arial" w:eastAsiaTheme="minorEastAsia" w:hAnsi="Arial" w:cs="Arial" w:hint="eastAsia"/>
+          <w:szCs w:val="21"/>
+          <w:lang w:eastAsia="zh-CN"/>
+        </w:rPr>
+        <w:t>, H.</w:t>
+      </w:r>
+      <w:r>
+        <w:rPr>
+          <w:rFonts w:ascii="Arial" w:hAnsi="Arial" w:cs="Arial"/>
+          <w:szCs w:val="21"/>
+        </w:rPr>
+        <w:t>, He</w:t>
+      </w:r>
+      <w:r>
+        <w:rPr>
+          <w:rFonts w:ascii="Arial" w:eastAsiaTheme="minorEastAsia" w:hAnsi="Arial" w:cs="Arial" w:hint="eastAsia"/>
+          <w:szCs w:val="21"/>
+          <w:lang w:eastAsia="zh-CN"/>
+        </w:rPr>
+        <w:t>, Q.</w:t>
+      </w:r>
+      <w:r>
+        <w:rPr>
+          <w:rFonts w:asciiTheme="minorEastAsia" w:eastAsiaTheme="minorEastAsia" w:hAnsiTheme="minorEastAsia" w:cs="MS Gothic" w:hint="eastAsia"/>
+          <w:szCs w:val="21"/>
+          <w:lang w:eastAsia="zh-CN"/>
+        </w:rPr>
+        <w:t>,</w:t>
+      </w:r>
+      <w:r>
+        <w:rPr>
+          <w:rFonts w:ascii="Arial" w:hAnsi="Arial" w:cs="Arial"/>
+          <w:szCs w:val="21"/>
+        </w:rPr>
+        <w:t xml:space="preserve"> Yang</w:t>
+      </w:r>
+      <w:r>
+        <w:rPr>
+          <w:rFonts w:ascii="Arial" w:eastAsiaTheme="minorEastAsia" w:hAnsi="Arial" w:cs="Arial" w:hint="eastAsia"/>
+          <w:szCs w:val="21"/>
+          <w:lang w:eastAsia="zh-CN"/>
+        </w:rPr>
+        <w:t>, X.</w:t>
+      </w:r>
+      <w:r>
+        <w:rPr>
+          <w:rFonts w:ascii="Arial" w:hAnsi="Arial" w:cs="Arial"/>
+          <w:szCs w:val="21"/>
+        </w:rPr>
+        <w:t xml:space="preserve">*, </w:t>
       </w:r>
       <w:r>
         <w:rPr>
@@ -3048,36 +4536,46 @@
           <w:szCs w:val="21"/>
           <w:lang w:eastAsia="zh-CN"/>
         </w:rPr>
-        <w:t xml:space="preserve">, </w:t>
-      </w:r>
-      <w:proofErr w:type="gramStart"/>
-      <w:r>
-        <w:rPr>
-          <w:rFonts w:ascii="Arial" w:eastAsiaTheme="minorEastAsia" w:hAnsi="Arial" w:cs="Arial" w:hint="eastAsia"/>
-          <w:b/>
-          <w:bCs/>
-          <w:szCs w:val="21"/>
-          <w:lang w:eastAsia="zh-CN"/>
-        </w:rPr>
-        <w:t>B.</w:t>
-      </w:r>
-      <w:r>
-        <w:rPr>
-          <w:rFonts w:ascii="Arial" w:hAnsi="Arial" w:cs="Arial"/>
-          <w:b/>
-          <w:bCs/>
-          <w:szCs w:val="21"/>
-          <w:vertAlign w:val="superscript"/>
-        </w:rPr>
-        <w:t>#</w:t>
-      </w:r>
-      <w:proofErr w:type="gramEnd"/>
-      <w:r>
-        <w:rPr>
-          <w:rFonts w:ascii="Arial" w:hAnsi="Arial" w:cs="Arial"/>
-          <w:szCs w:val="21"/>
-        </w:rPr>
-        <w:t>,</w:t>
+        <w:t>, B.</w:t>
+      </w:r>
+      <w:r>
+        <w:rPr>
+          <w:rFonts w:ascii="Arial" w:hAnsi="Arial" w:cs="Arial"/>
+          <w:b/>
+          <w:bCs/>
+          <w:szCs w:val="21"/>
+        </w:rPr>
+        <w:t>*</w:t>
+      </w:r>
+      <w:r>
+        <w:rPr>
+          <w:rFonts w:ascii="Arial" w:eastAsiaTheme="minorEastAsia" w:hAnsi="Arial" w:cs="Arial" w:hint="eastAsia"/>
+          <w:b/>
+          <w:bCs/>
+          <w:szCs w:val="21"/>
+          <w:lang w:eastAsia="zh-CN"/>
+        </w:rPr>
+        <w:t xml:space="preserve"> (</w:t>
+      </w:r>
+      <w:r>
+        <w:rPr>
+          <w:rFonts w:ascii="Arial" w:eastAsiaTheme="minorEastAsia" w:hAnsi="Arial" w:cs="Arial" w:hint="eastAsia"/>
+          <w:b/>
+          <w:bCs/>
+          <w:szCs w:val="21"/>
+          <w:lang w:eastAsia="zh-CN"/>
+        </w:rPr>
+        <w:t>Under review</w:t>
+      </w:r>
+      <w:r>
+        <w:rPr>
+          <w:rFonts w:ascii="Arial" w:eastAsiaTheme="minorEastAsia" w:hAnsi="Arial" w:cs="Arial" w:hint="eastAsia"/>
+          <w:b/>
+          <w:bCs/>
+          <w:szCs w:val="21"/>
+          <w:lang w:eastAsia="zh-CN"/>
+        </w:rPr>
+        <w:t>)</w:t>
       </w:r>
       <w:r>
         <w:rPr>
@@ -3089,144 +4587,12 @@
       </w:r>
       <w:r>
         <w:rPr>
-          <w:rFonts w:ascii="Arial" w:hAnsi="Arial" w:cs="Arial"/>
-          <w:szCs w:val="21"/>
-        </w:rPr>
-        <w:t>Du</w:t>
-      </w:r>
-      <w:r>
-        <w:rPr>
-          <w:rFonts w:ascii="Arial" w:eastAsiaTheme="minorEastAsia" w:hAnsi="Arial" w:cs="Arial" w:hint="eastAsia"/>
-          <w:szCs w:val="21"/>
-          <w:lang w:eastAsia="zh-CN"/>
-        </w:rPr>
-        <w:t>, Y.</w:t>
-      </w:r>
-      <w:r>
-        <w:rPr>
-          <w:rFonts w:ascii="Arial" w:eastAsiaTheme="minorEastAsia" w:hAnsi="Arial" w:cs="Arial" w:hint="eastAsia"/>
-          <w:szCs w:val="21"/>
-          <w:lang w:eastAsia="zh-CN"/>
-        </w:rPr>
-        <w:t>*</w:t>
-      </w:r>
-      <w:r>
-        <w:rPr>
-          <w:rFonts w:ascii="Arial" w:eastAsiaTheme="minorEastAsia" w:hAnsi="Arial" w:cs="Arial" w:hint="eastAsia"/>
-          <w:szCs w:val="21"/>
-          <w:lang w:eastAsia="zh-CN"/>
-        </w:rPr>
-        <w:t xml:space="preserve"> (2026).</w:t>
-      </w:r>
-      <w:r>
-        <w:rPr>
-          <w:rFonts w:ascii="Arial" w:hAnsi="Arial" w:cs="Arial" w:hint="eastAsia"/>
-          <w:szCs w:val="21"/>
-        </w:rPr>
-        <w:t xml:space="preserve"> </w:t>
-      </w:r>
-      <w:bookmarkStart w:id="0" w:name="OLE_LINK521"/>
-      <w:bookmarkStart w:id="1" w:name="OLE_LINK520"/>
-      <w:r>
-        <w:rPr>
-          <w:rFonts w:ascii="Arial" w:hAnsi="Arial" w:cs="Arial" w:hint="eastAsia"/>
-          <w:szCs w:val="21"/>
-        </w:rPr>
-        <w:t>Singing e</w:t>
-      </w:r>
-      <w:r>
-        <w:rPr>
-          <w:rFonts w:ascii="Arial" w:hAnsi="Arial" w:cs="Arial"/>
-          <w:szCs w:val="21"/>
-        </w:rPr>
-        <w:t>nhanc</w:t>
-      </w:r>
-      <w:r>
-        <w:rPr>
-          <w:rFonts w:ascii="Arial" w:hAnsi="Arial" w:cs="Arial" w:hint="eastAsia"/>
-          <w:szCs w:val="21"/>
-        </w:rPr>
-        <w:t>es</w:t>
-      </w:r>
-      <w:r>
-        <w:rPr>
-          <w:rFonts w:ascii="Arial" w:hAnsi="Arial" w:cs="Arial"/>
-          <w:szCs w:val="21"/>
-        </w:rPr>
-        <w:t xml:space="preserve"> </w:t>
-      </w:r>
-      <w:r>
-        <w:rPr>
-          <w:rFonts w:ascii="Arial" w:hAnsi="Arial" w:cs="Arial" w:hint="eastAsia"/>
-          <w:szCs w:val="21"/>
-        </w:rPr>
-        <w:t>p</w:t>
-      </w:r>
-      <w:r>
-        <w:rPr>
-          <w:rFonts w:ascii="Arial" w:hAnsi="Arial" w:cs="Arial"/>
-          <w:szCs w:val="21"/>
-        </w:rPr>
-        <w:t xml:space="preserve">oetry </w:t>
-      </w:r>
-      <w:r>
-        <w:rPr>
-          <w:rFonts w:ascii="Arial" w:hAnsi="Arial" w:cs="Arial" w:hint="eastAsia"/>
-          <w:szCs w:val="21"/>
-        </w:rPr>
-        <w:t>learning and m</w:t>
-      </w:r>
-      <w:r>
-        <w:rPr>
-          <w:rFonts w:ascii="Arial" w:hAnsi="Arial" w:cs="Arial"/>
-          <w:szCs w:val="21"/>
-        </w:rPr>
-        <w:t>emor</w:t>
-      </w:r>
-      <w:r>
-        <w:rPr>
-          <w:rFonts w:ascii="Arial" w:hAnsi="Arial" w:cs="Arial" w:hint="eastAsia"/>
-          <w:szCs w:val="21"/>
-        </w:rPr>
-        <w:t>ization</w:t>
-      </w:r>
-      <w:r>
-        <w:rPr>
-          <w:rFonts w:ascii="Arial" w:hAnsi="Arial" w:cs="Arial"/>
-          <w:szCs w:val="21"/>
-        </w:rPr>
-        <w:t xml:space="preserve"> in </w:t>
-      </w:r>
-      <w:r>
-        <w:rPr>
-          <w:rFonts w:ascii="Arial" w:hAnsi="Arial" w:cs="Arial" w:hint="eastAsia"/>
-          <w:szCs w:val="21"/>
-        </w:rPr>
-        <w:t>preschool</w:t>
-      </w:r>
-      <w:r>
-        <w:rPr>
-          <w:rFonts w:ascii="Arial" w:hAnsi="Arial" w:cs="Arial"/>
-          <w:szCs w:val="21"/>
-        </w:rPr>
-        <w:t xml:space="preserve"> </w:t>
-      </w:r>
-      <w:r>
-        <w:rPr>
-          <w:rFonts w:ascii="Arial" w:hAnsi="Arial" w:cs="Arial" w:hint="eastAsia"/>
-          <w:szCs w:val="21"/>
-        </w:rPr>
-        <w:t>c</w:t>
-      </w:r>
-      <w:r>
-        <w:rPr>
-          <w:rFonts w:ascii="Arial" w:hAnsi="Arial" w:cs="Arial"/>
-          <w:szCs w:val="21"/>
-        </w:rPr>
-        <w:t>hildren</w:t>
-      </w:r>
-      <w:bookmarkEnd w:id="0"/>
-      <w:bookmarkEnd w:id="1"/>
+          <w:rFonts w:ascii="Arial" w:eastAsiaTheme="minorEastAsia" w:hAnsi="Arial" w:cs="Arial"/>
+          <w:szCs w:val="21"/>
+          <w:lang w:eastAsia="zh-CN"/>
+        </w:rPr>
+        <w:t>Successor representation supports structural learning of syllable sequences</w:t>
+      </w:r>
       <w:r>
         <w:rPr>
           <w:rFonts w:ascii="Arial" w:eastAsiaTheme="minorEastAsia" w:hAnsi="Arial" w:cs="Arial" w:hint="eastAsia"/>
@@ -3235,324 +4601,6 @@
         </w:rPr>
         <w:t xml:space="preserve">. </w:t>
       </w:r>
-      <w:bookmarkStart w:id="2" w:name="_Hlk211158962"/>
-      <w:r>
-        <w:rPr>
-          <w:rFonts w:ascii="Arial" w:eastAsiaTheme="minorEastAsia" w:hAnsi="Arial" w:cs="Arial"/>
-          <w:b/>
-          <w:bCs/>
-          <w:i/>
-          <w:iCs/>
-          <w:szCs w:val="21"/>
-          <w:lang w:eastAsia="zh-CN"/>
-        </w:rPr>
-        <w:t>Annals of the New York Academy of Sciences</w:t>
-      </w:r>
-      <w:r>
-        <w:rPr>
-          <w:rFonts w:ascii="Arial" w:eastAsiaTheme="minorEastAsia" w:hAnsi="Arial" w:cs="Arial" w:hint="eastAsia"/>
-          <w:szCs w:val="21"/>
-          <w:lang w:eastAsia="zh-CN"/>
-        </w:rPr>
-        <w:t xml:space="preserve"> </w:t>
-      </w:r>
-      <w:r>
-        <w:rPr>
-          <w:rFonts w:ascii="Arial" w:eastAsiaTheme="minorEastAsia" w:hAnsi="Arial" w:cs="Arial" w:hint="eastAsia"/>
-          <w:szCs w:val="21"/>
-          <w:lang w:eastAsia="zh-CN"/>
-        </w:rPr>
-        <w:t>(</w:t>
-      </w:r>
-      <w:bookmarkEnd w:id="2"/>
-      <w:r>
-        <w:rPr>
-          <w:rFonts w:ascii="Arial" w:eastAsiaTheme="minorEastAsia" w:hAnsi="Arial" w:cs="Arial"/>
-          <w:szCs w:val="21"/>
-          <w:lang w:eastAsia="zh-CN"/>
-        </w:rPr>
-        <w:t>In Press</w:t>
-      </w:r>
-      <w:r>
-        <w:rPr>
-          <w:rFonts w:ascii="Arial" w:eastAsiaTheme="minorEastAsia" w:hAnsi="Arial" w:cs="Arial" w:hint="eastAsia"/>
-          <w:szCs w:val="21"/>
-          <w:lang w:eastAsia="zh-CN"/>
-        </w:rPr>
-        <w:t>)</w:t>
-      </w:r>
-      <w:r>
-        <w:rPr>
-          <w:rFonts w:ascii="Arial" w:eastAsiaTheme="minorEastAsia" w:hAnsi="Arial" w:cs="Arial" w:hint="eastAsia"/>
-          <w:szCs w:val="21"/>
-          <w:lang w:eastAsia="zh-CN"/>
-        </w:rPr>
-        <w:t xml:space="preserve">. </w:t>
-      </w:r>
-      <w:r>
-        <w:rPr>
-          <w:rFonts w:ascii="Arial" w:eastAsiaTheme="minorEastAsia" w:hAnsi="Arial" w:cs="Arial" w:hint="eastAsia"/>
-          <w:szCs w:val="21"/>
-          <w:lang w:eastAsia="zh-CN"/>
-        </w:rPr>
-        <w:t>[Co-first author]</w:t>
-      </w:r>
-    </w:p>
-    <w:p>
-      <w:pPr>
-        <w:pStyle w:val="ListParagraph"/>
-        <w:numPr>
-          <w:ilvl w:val="0"/>
-          <w:numId w:val="2"/>
-        </w:numPr>
-        <w:spacing w:before="120" w:after="120"/>
-        <w:contextualSpacing w:val="0"/>
-        <w:rPr>
-          <w:rFonts w:ascii="Arial" w:hAnsi="Arial" w:cs="Arial"/>
-          <w:szCs w:val="21"/>
-        </w:rPr>
-      </w:pPr>
-      <w:r>
-        <w:rPr>
-          <w:rFonts w:ascii="Arial" w:hAnsi="Arial" w:cs="Arial"/>
-          <w:szCs w:val="21"/>
-        </w:rPr>
-        <w:t>Wang, Y.</w:t>
-      </w:r>
-      <w:r>
-        <w:rPr>
-          <w:rFonts w:ascii="Arial" w:hAnsi="Arial" w:cs="Arial"/>
-          <w:szCs w:val="21"/>
-          <w:vertAlign w:val="superscript"/>
-        </w:rPr>
-        <w:t>#</w:t>
-      </w:r>
-      <w:r>
-        <w:rPr>
-          <w:rFonts w:ascii="Arial" w:hAnsi="Arial" w:cs="Arial"/>
-          <w:szCs w:val="21"/>
-        </w:rPr>
-        <w:t>, Yu, K.</w:t>
-      </w:r>
-      <w:r>
-        <w:rPr>
-          <w:rFonts w:ascii="Arial" w:hAnsi="Arial" w:cs="Arial"/>
-          <w:szCs w:val="21"/>
-          <w:vertAlign w:val="superscript"/>
-        </w:rPr>
-        <w:t>#</w:t>
-      </w:r>
-      <w:r>
-        <w:rPr>
-          <w:rFonts w:ascii="Arial" w:hAnsi="Arial" w:cs="Arial"/>
-          <w:szCs w:val="21"/>
-        </w:rPr>
-        <w:t xml:space="preserve">, Yin, S., </w:t>
-      </w:r>
-      <w:r>
-        <w:rPr>
-          <w:rFonts w:ascii="Arial" w:hAnsi="Arial" w:cs="Arial"/>
-          <w:b/>
-          <w:bCs/>
-          <w:szCs w:val="21"/>
-        </w:rPr>
-        <w:t>Liang, B.</w:t>
-      </w:r>
-      <w:r>
-        <w:rPr>
-          <w:rFonts w:ascii="Arial" w:hAnsi="Arial" w:cs="Arial"/>
-          <w:szCs w:val="21"/>
-        </w:rPr>
-        <w:t>*, Wang, R.* (2026). Theta and gamma transcranial alternating current stimulation (</w:t>
-      </w:r>
-      <w:proofErr w:type="spellStart"/>
-      <w:r>
-        <w:rPr>
-          <w:rFonts w:ascii="Arial" w:hAnsi="Arial" w:cs="Arial"/>
-          <w:szCs w:val="21"/>
-        </w:rPr>
-        <w:t>tACS</w:t>
-      </w:r>
-      <w:proofErr w:type="spellEnd"/>
-      <w:r>
-        <w:rPr>
-          <w:rFonts w:ascii="Arial" w:hAnsi="Arial" w:cs="Arial"/>
-          <w:szCs w:val="21"/>
-        </w:rPr>
-        <w:t xml:space="preserve">) modulate Mandarin consonant and lexical tone perception. </w:t>
-      </w:r>
-      <w:r>
-        <w:rPr>
-          <w:rFonts w:ascii="Arial" w:hAnsi="Arial" w:cs="Arial"/>
-          <w:b/>
-          <w:bCs/>
-          <w:i/>
-          <w:iCs/>
-          <w:szCs w:val="21"/>
-        </w:rPr>
-        <w:t>Neurobiology of Language</w:t>
-      </w:r>
-      <w:r>
-        <w:rPr>
-          <w:rFonts w:ascii="Arial" w:hAnsi="Arial" w:cs="Arial"/>
-          <w:szCs w:val="21"/>
-        </w:rPr>
-        <w:t>. (Provisionally Accepted). (Preprint available on bioRxiv: 2025, 679546). [Co-corresponding author]</w:t>
-      </w:r>
-    </w:p>
-    <w:p>
-      <w:pPr>
-        <w:pStyle w:val="ListParagraph"/>
-        <w:numPr>
-          <w:ilvl w:val="0"/>
-          <w:numId w:val="2"/>
-        </w:numPr>
-        <w:ind w:left="714" w:hanging="357"/>
-        <w:contextualSpacing w:val="0"/>
-        <w:rPr>
-          <w:rFonts w:ascii="Arial" w:hAnsi="Arial" w:cs="Arial"/>
-          <w:szCs w:val="21"/>
-        </w:rPr>
-      </w:pPr>
-      <w:r>
-        <w:rPr>
-          <w:rFonts w:ascii="Arial" w:hAnsi="Arial" w:cs="Arial"/>
-          <w:b/>
-          <w:bCs/>
-          <w:szCs w:val="21"/>
-        </w:rPr>
-        <w:t>Liang,</w:t>
-      </w:r>
-      <w:r>
-        <w:rPr>
-          <w:rFonts w:ascii="Arial" w:eastAsiaTheme="minorEastAsia" w:hAnsi="Arial" w:cs="Arial" w:hint="eastAsia"/>
-          <w:b/>
-          <w:bCs/>
-          <w:szCs w:val="21"/>
-          <w:lang w:eastAsia="zh-CN"/>
-        </w:rPr>
-        <w:t xml:space="preserve"> B., </w:t>
-      </w:r>
-      <w:r>
-        <w:rPr>
-          <w:rFonts w:ascii="Arial" w:hAnsi="Arial" w:cs="Arial"/>
-          <w:szCs w:val="21"/>
-        </w:rPr>
-        <w:t>Li,</w:t>
-      </w:r>
-      <w:r>
-        <w:rPr>
-          <w:rFonts w:ascii="Arial" w:eastAsiaTheme="minorEastAsia" w:hAnsi="Arial" w:cs="Arial" w:hint="eastAsia"/>
-          <w:szCs w:val="21"/>
-          <w:lang w:eastAsia="zh-CN"/>
-        </w:rPr>
-        <w:t xml:space="preserve"> Y.,</w:t>
-      </w:r>
-      <w:r>
-        <w:rPr>
-          <w:rFonts w:ascii="Arial" w:hAnsi="Arial" w:cs="Arial"/>
-          <w:szCs w:val="21"/>
-        </w:rPr>
-        <w:t xml:space="preserve"> Zhao,</w:t>
-      </w:r>
-      <w:r>
-        <w:rPr>
-          <w:rFonts w:ascii="Arial" w:eastAsiaTheme="minorEastAsia" w:hAnsi="Arial" w:cs="Arial" w:hint="eastAsia"/>
-          <w:szCs w:val="21"/>
-          <w:lang w:eastAsia="zh-CN"/>
-        </w:rPr>
-        <w:t xml:space="preserve"> W., </w:t>
-      </w:r>
-      <w:r>
-        <w:rPr>
-          <w:rFonts w:ascii="Arial" w:hAnsi="Arial" w:cs="Arial"/>
-          <w:bCs/>
-          <w:szCs w:val="21"/>
-        </w:rPr>
-        <w:t>Du</w:t>
-      </w:r>
-      <w:r>
-        <w:rPr>
-          <w:rFonts w:ascii="Arial" w:eastAsiaTheme="minorEastAsia" w:hAnsi="Arial" w:cs="Arial" w:hint="eastAsia"/>
-          <w:bCs/>
-          <w:szCs w:val="21"/>
-          <w:lang w:eastAsia="zh-CN"/>
-        </w:rPr>
-        <w:t>, Y.</w:t>
-      </w:r>
-      <w:r>
-        <w:rPr>
-          <w:rFonts w:ascii="Arial" w:hAnsi="Arial" w:cs="Arial"/>
-          <w:bCs/>
-          <w:szCs w:val="21"/>
-        </w:rPr>
-        <w:t>*</w:t>
-      </w:r>
-      <w:r>
-        <w:rPr>
-          <w:rFonts w:ascii="Arial" w:eastAsiaTheme="minorEastAsia" w:hAnsi="Arial" w:cs="Arial" w:hint="eastAsia"/>
-          <w:bCs/>
-          <w:szCs w:val="21"/>
-          <w:lang w:eastAsia="zh-CN"/>
-        </w:rPr>
-        <w:t xml:space="preserve"> (2023).</w:t>
-      </w:r>
-      <w:r>
-        <w:rPr>
-          <w:rFonts w:ascii="Arial" w:hAnsi="Arial" w:cs="Arial"/>
-          <w:szCs w:val="21"/>
-        </w:rPr>
-        <w:t xml:space="preserve"> </w:t>
-      </w:r>
-      <w:r>
-        <w:rPr>
-          <w:rFonts w:ascii="Arial" w:hAnsi="Arial" w:cs="Arial"/>
-        </w:rPr>
-        <w:t xml:space="preserve">Bilateral human laryngeal motor cortex in perceptual decision of lexical tone and voicing of </w:t>
-      </w:r>
-      <w:proofErr w:type="gramStart"/>
-      <w:r>
-        <w:rPr>
-          <w:rFonts w:ascii="Arial" w:hAnsi="Arial" w:cs="Arial"/>
-        </w:rPr>
-        <w:t>consonant</w:t>
-      </w:r>
-      <w:proofErr w:type="gramEnd"/>
-      <w:r>
-        <w:rPr>
-          <w:rFonts w:ascii="Arial" w:hAnsi="Arial" w:cs="Arial"/>
-        </w:rPr>
-        <w:t xml:space="preserve">. </w:t>
-      </w:r>
-      <w:r>
-        <w:rPr>
-          <w:rFonts w:ascii="Arial" w:hAnsi="Arial" w:cs="Arial"/>
-          <w:b/>
-          <w:bCs/>
-          <w:i/>
-          <w:iCs/>
-        </w:rPr>
-        <w:t>Nature Communications</w:t>
-      </w:r>
-      <w:r>
-        <w:rPr>
-          <w:rFonts w:ascii="Arial" w:hAnsi="Arial" w:cs="Arial"/>
-        </w:rPr>
-        <w:t>,</w:t>
-      </w:r>
-      <w:r>
-        <w:rPr>
-          <w:rFonts w:ascii="Arial" w:eastAsiaTheme="minorEastAsia" w:hAnsi="Arial" w:cs="Arial" w:hint="eastAsia"/>
-          <w:lang w:eastAsia="zh-CN"/>
-        </w:rPr>
-        <w:t xml:space="preserve"> </w:t>
-      </w:r>
-      <w:r>
-        <w:rPr>
-          <w:rFonts w:ascii="Arial" w:hAnsi="Arial" w:cs="Arial"/>
-        </w:rPr>
-        <w:t xml:space="preserve">14, 4710. </w:t>
-      </w:r>
       <w:r>
         <w:rPr>
           <w:rFonts w:ascii="Arial" w:eastAsiaTheme="minorEastAsia" w:hAnsi="Arial" w:cs="Arial" w:hint="eastAsia"/>
@@ -3563,335 +4611,11 @@
       </w:r>
       <w:r>
         <w:rPr>
-          <w:rFonts w:ascii="Arial" w:hAnsi="Arial" w:cs="Arial"/>
-          <w:szCs w:val="21"/>
-        </w:rPr>
-        <w:t>First author</w:t>
-      </w:r>
-      <w:r>
-        <w:rPr>
-          <w:rFonts w:ascii="Arial" w:eastAsiaTheme="minorEastAsia" w:hAnsi="Arial" w:cs="Arial" w:hint="eastAsia"/>
-          <w:szCs w:val="21"/>
-          <w:lang w:eastAsia="zh-CN"/>
-        </w:rPr>
-        <w:t>]</w:t>
-      </w:r>
-    </w:p>
-    <w:p>
-      <w:pPr>
-        <w:pStyle w:val="ListParagraph"/>
-        <w:numPr>
-          <w:ilvl w:val="0"/>
-          <w:numId w:val="2"/>
-        </w:numPr>
-        <w:ind w:left="714" w:hanging="357"/>
-        <w:contextualSpacing w:val="0"/>
-        <w:rPr>
-          <w:rFonts w:ascii="Arial" w:hAnsi="Arial" w:cs="Arial"/>
-          <w:szCs w:val="21"/>
-        </w:rPr>
-      </w:pPr>
-      <w:r>
-        <w:rPr>
-          <w:rFonts w:ascii="Arial" w:hAnsi="Arial" w:cs="Arial"/>
-          <w:b/>
-          <w:bCs/>
-          <w:szCs w:val="21"/>
-        </w:rPr>
-        <w:t>Liang</w:t>
-      </w:r>
-      <w:r>
-        <w:rPr>
-          <w:rFonts w:ascii="Arial" w:eastAsiaTheme="minorEastAsia" w:hAnsi="Arial" w:cs="Arial" w:hint="eastAsia"/>
-          <w:b/>
-          <w:bCs/>
-          <w:szCs w:val="21"/>
-          <w:lang w:eastAsia="zh-CN"/>
-        </w:rPr>
-        <w:t>, B.</w:t>
-      </w:r>
-      <w:r>
-        <w:rPr>
-          <w:rFonts w:ascii="Arial" w:hAnsi="Arial" w:cs="Arial"/>
-          <w:b/>
-          <w:bCs/>
-          <w:szCs w:val="21"/>
-        </w:rPr>
-        <w:t xml:space="preserve"> </w:t>
-      </w:r>
-      <w:r>
-        <w:rPr>
-          <w:rFonts w:ascii="Arial" w:hAnsi="Arial" w:cs="Arial"/>
-          <w:szCs w:val="21"/>
-        </w:rPr>
-        <w:t>&amp;</w:t>
-      </w:r>
-      <w:r>
-        <w:rPr>
-          <w:rFonts w:ascii="Arial" w:hAnsi="Arial" w:cs="Arial"/>
-          <w:b/>
-          <w:bCs/>
-          <w:szCs w:val="21"/>
-        </w:rPr>
-        <w:t xml:space="preserve"> </w:t>
-      </w:r>
-      <w:r>
-        <w:rPr>
-          <w:rFonts w:ascii="Arial" w:hAnsi="Arial" w:cs="Arial"/>
-          <w:bCs/>
-          <w:szCs w:val="21"/>
-        </w:rPr>
-        <w:t>Du</w:t>
-      </w:r>
-      <w:r>
-        <w:rPr>
-          <w:rFonts w:ascii="Arial" w:eastAsiaTheme="minorEastAsia" w:hAnsi="Arial" w:cs="Arial" w:hint="eastAsia"/>
-          <w:bCs/>
-          <w:szCs w:val="21"/>
-          <w:lang w:eastAsia="zh-CN"/>
-        </w:rPr>
-        <w:t>, Y.</w:t>
-      </w:r>
-      <w:r>
-        <w:rPr>
-          <w:rFonts w:ascii="Arial" w:hAnsi="Arial" w:cs="Arial"/>
-          <w:bCs/>
-          <w:szCs w:val="21"/>
-        </w:rPr>
-        <w:t>*</w:t>
-      </w:r>
-      <w:r>
-        <w:rPr>
-          <w:rFonts w:ascii="Arial" w:eastAsiaTheme="minorEastAsia" w:hAnsi="Arial" w:cs="Arial" w:hint="eastAsia"/>
-          <w:bCs/>
-          <w:szCs w:val="21"/>
-          <w:lang w:eastAsia="zh-CN"/>
-        </w:rPr>
-        <w:t xml:space="preserve"> (2018).</w:t>
-      </w:r>
-      <w:r>
-        <w:rPr>
-          <w:rFonts w:ascii="Arial" w:hAnsi="Arial" w:cs="Arial"/>
-          <w:szCs w:val="21"/>
-        </w:rPr>
-        <w:t xml:space="preserve"> The functional neuroanatomy of lexical tone perception: an activation likelihood estimation meta-analysis. </w:t>
-      </w:r>
-      <w:r>
-        <w:rPr>
-          <w:rFonts w:ascii="Arial" w:hAnsi="Arial" w:cs="Arial"/>
-          <w:b/>
-          <w:bCs/>
-          <w:i/>
-          <w:iCs/>
-          <w:szCs w:val="21"/>
-        </w:rPr>
-        <w:t>Frontiers in Neuroscience</w:t>
-      </w:r>
-      <w:r>
-        <w:rPr>
-          <w:rFonts w:ascii="Arial" w:hAnsi="Arial" w:cs="Arial"/>
-          <w:szCs w:val="21"/>
-        </w:rPr>
-        <w:t xml:space="preserve">, 12, 495. </w:t>
-      </w:r>
-      <w:r>
-        <w:rPr>
-          <w:rFonts w:ascii="Arial" w:eastAsiaTheme="minorEastAsia" w:hAnsi="Arial" w:cs="Arial" w:hint="eastAsia"/>
-          <w:szCs w:val="21"/>
-          <w:lang w:eastAsia="zh-CN"/>
-        </w:rPr>
-        <w:t>[</w:t>
-      </w:r>
-      <w:r>
-        <w:rPr>
-          <w:rFonts w:ascii="Arial" w:hAnsi="Arial" w:cs="Arial"/>
-          <w:szCs w:val="21"/>
-        </w:rPr>
-        <w:t>First author</w:t>
-      </w:r>
-      <w:r>
-        <w:rPr>
-          <w:rFonts w:ascii="Arial" w:eastAsiaTheme="minorEastAsia" w:hAnsi="Arial" w:cs="Arial" w:hint="eastAsia"/>
-          <w:szCs w:val="21"/>
-          <w:lang w:eastAsia="zh-CN"/>
-        </w:rPr>
-        <w:t>]</w:t>
-      </w:r>
-    </w:p>
-    <w:p>
-      <w:pPr>
-        <w:pStyle w:val="ListParagraph"/>
-        <w:numPr>
-          <w:ilvl w:val="0"/>
-          <w:numId w:val="2"/>
-        </w:numPr>
-        <w:ind w:left="714" w:hanging="357"/>
-        <w:contextualSpacing w:val="0"/>
-        <w:rPr>
-          <w:rFonts w:eastAsia="KaiTi"/>
-          <w:szCs w:val="21"/>
-        </w:rPr>
-      </w:pPr>
-      <w:r>
-        <w:rPr>
-          <w:rFonts w:ascii="Arial" w:eastAsia="KaiTi" w:hAnsi="Arial" w:cs="Arial"/>
-          <w:b/>
-          <w:bCs/>
-          <w:szCs w:val="21"/>
-        </w:rPr>
-        <w:t>Liang</w:t>
-      </w:r>
-      <w:r>
-        <w:rPr>
-          <w:rFonts w:ascii="Arial" w:eastAsia="KaiTi" w:hAnsi="Arial" w:cs="Arial" w:hint="eastAsia"/>
-          <w:b/>
-          <w:bCs/>
-          <w:szCs w:val="21"/>
-          <w:lang w:eastAsia="zh-CN"/>
-        </w:rPr>
-        <w:t>, B.</w:t>
-      </w:r>
-      <w:r>
-        <w:rPr>
-          <w:rFonts w:ascii="Arial" w:eastAsia="KaiTi" w:hAnsi="Arial" w:cs="Arial"/>
-          <w:b/>
-          <w:bCs/>
-          <w:szCs w:val="21"/>
-        </w:rPr>
-        <w:t xml:space="preserve"> </w:t>
-      </w:r>
-      <w:r>
-        <w:rPr>
-          <w:rFonts w:ascii="Arial" w:eastAsia="KaiTi" w:hAnsi="Arial" w:cs="Arial"/>
-          <w:szCs w:val="21"/>
-        </w:rPr>
-        <w:t>&amp;</w:t>
-      </w:r>
-      <w:r>
-        <w:rPr>
-          <w:rFonts w:ascii="Arial" w:eastAsia="KaiTi" w:hAnsi="Arial" w:cs="Arial"/>
-          <w:b/>
-          <w:bCs/>
-          <w:szCs w:val="21"/>
-        </w:rPr>
-        <w:t xml:space="preserve"> </w:t>
-      </w:r>
-      <w:r>
-        <w:rPr>
-          <w:rFonts w:ascii="Arial" w:eastAsia="KaiTi" w:hAnsi="Arial" w:cs="Arial"/>
-          <w:bCs/>
-          <w:szCs w:val="21"/>
-        </w:rPr>
-        <w:t>Du</w:t>
-      </w:r>
-      <w:r>
-        <w:rPr>
-          <w:rFonts w:ascii="Arial" w:eastAsia="KaiTi" w:hAnsi="Arial" w:cs="Arial" w:hint="eastAsia"/>
-          <w:bCs/>
-          <w:szCs w:val="21"/>
-          <w:lang w:eastAsia="zh-CN"/>
-        </w:rPr>
-        <w:t>, Y.</w:t>
-      </w:r>
-      <w:r>
-        <w:rPr>
-          <w:rFonts w:ascii="Arial" w:eastAsia="KaiTi" w:hAnsi="Arial" w:cs="Arial"/>
-          <w:bCs/>
-          <w:szCs w:val="21"/>
-        </w:rPr>
-        <w:t>*</w:t>
-      </w:r>
-      <w:r>
-        <w:rPr>
-          <w:rFonts w:ascii="Arial" w:eastAsia="KaiTi" w:hAnsi="Arial" w:cs="Arial" w:hint="eastAsia"/>
-          <w:bCs/>
-          <w:szCs w:val="21"/>
-          <w:lang w:eastAsia="zh-CN"/>
-        </w:rPr>
-        <w:t xml:space="preserve"> (2017).</w:t>
-      </w:r>
-      <w:r>
-        <w:rPr>
-          <w:rFonts w:ascii="Arial" w:eastAsia="KaiTi" w:hAnsi="Arial" w:cs="Arial"/>
-          <w:szCs w:val="21"/>
-        </w:rPr>
-        <w:t xml:space="preserve"> Mechanisms of sensorimotor integration in speech perception [</w:t>
-      </w:r>
-      <w:proofErr w:type="spellStart"/>
-      <w:r>
-        <w:rPr>
-          <w:rFonts w:ascii="Arial" w:eastAsia="KaiTi" w:hAnsi="Arial" w:cs="Arial"/>
-          <w:szCs w:val="21"/>
-        </w:rPr>
-        <w:t>言语知觉中的感觉运动整合机制</w:t>
-      </w:r>
-      <w:proofErr w:type="spellEnd"/>
-      <w:r>
-        <w:rPr>
-          <w:rFonts w:ascii="Arial" w:eastAsia="KaiTi" w:hAnsi="Arial" w:cs="Arial"/>
-          <w:szCs w:val="21"/>
-        </w:rPr>
-        <w:t xml:space="preserve">]. </w:t>
-      </w:r>
-      <w:r>
-        <w:rPr>
-          <w:rFonts w:ascii="Arial" w:eastAsia="KaiTi" w:hAnsi="Arial" w:cs="Arial"/>
-          <w:b/>
-          <w:bCs/>
-          <w:i/>
-          <w:szCs w:val="21"/>
-        </w:rPr>
-        <w:t>Science &amp; Technology Review</w:t>
-      </w:r>
-      <w:r>
-        <w:rPr>
-          <w:rFonts w:ascii="Arial" w:eastAsia="KaiTi" w:hAnsi="Arial" w:cs="Arial"/>
-          <w:i/>
-          <w:szCs w:val="21"/>
-        </w:rPr>
-        <w:t xml:space="preserve"> [</w:t>
-      </w:r>
-      <w:proofErr w:type="spellStart"/>
-      <w:r>
-        <w:rPr>
-          <w:rFonts w:ascii="Arial" w:eastAsia="KaiTi" w:hAnsi="Arial" w:cs="Arial"/>
-          <w:i/>
-          <w:iCs/>
-          <w:szCs w:val="21"/>
-        </w:rPr>
-        <w:t>科技导报</w:t>
-      </w:r>
-      <w:proofErr w:type="spellEnd"/>
-      <w:r>
-        <w:rPr>
-          <w:rFonts w:ascii="Arial" w:eastAsia="KaiTi" w:hAnsi="Arial" w:cs="Arial"/>
-          <w:i/>
-          <w:iCs/>
-          <w:szCs w:val="21"/>
-        </w:rPr>
-        <w:t>]</w:t>
-      </w:r>
-      <w:r>
-        <w:rPr>
-          <w:rFonts w:ascii="Arial" w:eastAsia="KaiTi" w:hAnsi="Arial" w:cs="Arial"/>
-          <w:szCs w:val="21"/>
-        </w:rPr>
-        <w:t xml:space="preserve">, 35(19):21-28. </w:t>
-      </w:r>
-      <w:r>
-        <w:rPr>
-          <w:rFonts w:ascii="Arial" w:eastAsiaTheme="minorEastAsia" w:hAnsi="Arial" w:cs="Arial" w:hint="eastAsia"/>
-          <w:szCs w:val="21"/>
-          <w:lang w:eastAsia="zh-CN"/>
-        </w:rPr>
-        <w:t>[</w:t>
-      </w:r>
-      <w:r>
-        <w:rPr>
-          <w:rFonts w:ascii="Arial" w:hAnsi="Arial" w:cs="Arial"/>
-          <w:szCs w:val="21"/>
-        </w:rPr>
-        <w:t>First author</w:t>
+          <w:rFonts w:ascii="Arial" w:eastAsiaTheme="minorEastAsia" w:hAnsi="Arial" w:cs="Arial" w:hint="eastAsia"/>
+          <w:szCs w:val="21"/>
+          <w:lang w:eastAsia="zh-CN"/>
+        </w:rPr>
+        <w:t>Co-corresponding author</w:t>
       </w:r>
       <w:r>
         <w:rPr>
@@ -3943,318 +4667,6 @@
           <w:sz w:val="22"/>
           <w:szCs w:val="22"/>
         </w:rPr>
-        <w:t xml:space="preserve">UNDER </w:t>
-      </w:r>
-      <w:r>
-        <w:rPr>
-          <w:rFonts w:ascii="Arial" w:hAnsi="Arial" w:cs="Arial"/>
-          <w:b/>
-          <w:sz w:val="28"/>
-          <w:szCs w:val="28"/>
-        </w:rPr>
-        <w:t>R</w:t>
-      </w:r>
-      <w:r>
-        <w:rPr>
-          <w:rFonts w:ascii="Arial" w:hAnsi="Arial" w:cs="Arial"/>
-          <w:b/>
-          <w:sz w:val="22"/>
-          <w:szCs w:val="22"/>
-        </w:rPr>
-        <w:t>EVIEW</w:t>
-      </w:r>
-    </w:p>
-    <w:p>
-      <w:pPr>
-        <w:pStyle w:val="ListParagraph"/>
-        <w:numPr>
-          <w:ilvl w:val="0"/>
-          <w:numId w:val="7"/>
-        </w:numPr>
-        <w:spacing w:before="120" w:after="120"/>
-        <w:contextualSpacing w:val="0"/>
-        <w:rPr>
-          <w:rFonts w:ascii="Arial" w:hAnsi="Arial" w:cs="Arial"/>
-          <w:szCs w:val="21"/>
-        </w:rPr>
-      </w:pPr>
-      <w:r>
-        <w:rPr>
-          <w:rFonts w:ascii="Arial" w:hAnsi="Arial" w:cs="Arial"/>
-          <w:szCs w:val="21"/>
-        </w:rPr>
-        <w:t>Liu</w:t>
-      </w:r>
-      <w:r>
-        <w:rPr>
-          <w:rFonts w:ascii="Arial" w:eastAsiaTheme="minorEastAsia" w:hAnsi="Arial" w:cs="Arial" w:hint="eastAsia"/>
-          <w:szCs w:val="21"/>
-          <w:lang w:eastAsia="zh-CN"/>
-        </w:rPr>
-        <w:t>, J.</w:t>
-      </w:r>
-      <w:r>
-        <w:rPr>
-          <w:rFonts w:ascii="Arial" w:hAnsi="Arial" w:cs="Arial"/>
-          <w:szCs w:val="21"/>
-          <w:vertAlign w:val="superscript"/>
-        </w:rPr>
-        <w:t>#</w:t>
-      </w:r>
-      <w:r>
-        <w:rPr>
-          <w:rFonts w:ascii="Arial" w:hAnsi="Arial" w:cs="Arial"/>
-          <w:szCs w:val="21"/>
-        </w:rPr>
-        <w:t>, Wang</w:t>
-      </w:r>
-      <w:r>
-        <w:rPr>
-          <w:rFonts w:ascii="Arial" w:eastAsiaTheme="minorEastAsia" w:hAnsi="Arial" w:cs="Arial" w:hint="eastAsia"/>
-          <w:szCs w:val="21"/>
-          <w:lang w:eastAsia="zh-CN"/>
-        </w:rPr>
-        <w:t>, Y.</w:t>
-      </w:r>
-      <w:r>
-        <w:rPr>
-          <w:rFonts w:ascii="Arial" w:hAnsi="Arial" w:cs="Arial"/>
-          <w:szCs w:val="21"/>
-          <w:vertAlign w:val="superscript"/>
-        </w:rPr>
-        <w:t>#</w:t>
-      </w:r>
-      <w:r>
-        <w:rPr>
-          <w:rFonts w:ascii="Arial" w:hAnsi="Arial" w:cs="Arial"/>
-          <w:szCs w:val="21"/>
-        </w:rPr>
-        <w:t>, Feng</w:t>
-      </w:r>
-      <w:r>
-        <w:rPr>
-          <w:rFonts w:ascii="Arial" w:eastAsiaTheme="minorEastAsia" w:hAnsi="Arial" w:cs="Arial" w:hint="eastAsia"/>
-          <w:szCs w:val="21"/>
-          <w:lang w:eastAsia="zh-CN"/>
-        </w:rPr>
-        <w:t>, J.</w:t>
-      </w:r>
-      <w:r>
-        <w:rPr>
-          <w:rFonts w:ascii="Arial" w:hAnsi="Arial" w:cs="Arial"/>
-          <w:szCs w:val="21"/>
-          <w:vertAlign w:val="superscript"/>
-        </w:rPr>
-        <w:t>#</w:t>
-      </w:r>
-      <w:r>
-        <w:rPr>
-          <w:rFonts w:ascii="Arial" w:hAnsi="Arial" w:cs="Arial"/>
-          <w:szCs w:val="21"/>
-        </w:rPr>
-        <w:t>, Zhao</w:t>
-      </w:r>
-      <w:r>
-        <w:rPr>
-          <w:rFonts w:ascii="Arial" w:eastAsiaTheme="minorEastAsia" w:hAnsi="Arial" w:cs="Arial" w:hint="eastAsia"/>
-          <w:szCs w:val="21"/>
-          <w:lang w:eastAsia="zh-CN"/>
-        </w:rPr>
-        <w:t>, H.</w:t>
-      </w:r>
-      <w:r>
-        <w:rPr>
-          <w:rFonts w:ascii="Arial" w:hAnsi="Arial" w:cs="Arial"/>
-          <w:szCs w:val="21"/>
-        </w:rPr>
-        <w:t>, He</w:t>
-      </w:r>
-      <w:r>
-        <w:rPr>
-          <w:rFonts w:ascii="Arial" w:eastAsiaTheme="minorEastAsia" w:hAnsi="Arial" w:cs="Arial" w:hint="eastAsia"/>
-          <w:szCs w:val="21"/>
-          <w:lang w:eastAsia="zh-CN"/>
-        </w:rPr>
-        <w:t>, Q.</w:t>
-      </w:r>
-      <w:r>
-        <w:rPr>
-          <w:rFonts w:asciiTheme="minorEastAsia" w:eastAsiaTheme="minorEastAsia" w:hAnsiTheme="minorEastAsia" w:cs="MS Gothic" w:hint="eastAsia"/>
-          <w:szCs w:val="21"/>
-          <w:lang w:eastAsia="zh-CN"/>
-        </w:rPr>
-        <w:t>,</w:t>
-      </w:r>
-      <w:r>
-        <w:rPr>
-          <w:rFonts w:ascii="Arial" w:hAnsi="Arial" w:cs="Arial"/>
-          <w:szCs w:val="21"/>
-        </w:rPr>
-        <w:t xml:space="preserve"> Yang</w:t>
-      </w:r>
-      <w:r>
-        <w:rPr>
-          <w:rFonts w:ascii="Arial" w:eastAsiaTheme="minorEastAsia" w:hAnsi="Arial" w:cs="Arial" w:hint="eastAsia"/>
-          <w:szCs w:val="21"/>
-          <w:lang w:eastAsia="zh-CN"/>
-        </w:rPr>
-        <w:t>, X.</w:t>
-      </w:r>
-      <w:r>
-        <w:rPr>
-          <w:rFonts w:ascii="Arial" w:hAnsi="Arial" w:cs="Arial"/>
-          <w:szCs w:val="21"/>
-        </w:rPr>
-        <w:t xml:space="preserve">*, </w:t>
-      </w:r>
-      <w:r>
-        <w:rPr>
-          <w:rFonts w:ascii="Arial" w:hAnsi="Arial" w:cs="Arial"/>
-          <w:b/>
-          <w:bCs/>
-          <w:szCs w:val="21"/>
-        </w:rPr>
-        <w:t>Liang</w:t>
-      </w:r>
-      <w:r>
-        <w:rPr>
-          <w:rFonts w:ascii="Arial" w:eastAsiaTheme="minorEastAsia" w:hAnsi="Arial" w:cs="Arial" w:hint="eastAsia"/>
-          <w:b/>
-          <w:bCs/>
-          <w:szCs w:val="21"/>
-          <w:lang w:eastAsia="zh-CN"/>
-        </w:rPr>
-        <w:t>, B.</w:t>
-      </w:r>
-      <w:r>
-        <w:rPr>
-          <w:rFonts w:ascii="Arial" w:hAnsi="Arial" w:cs="Arial"/>
-          <w:b/>
-          <w:bCs/>
-          <w:szCs w:val="21"/>
-        </w:rPr>
-        <w:t>*</w:t>
-      </w:r>
-      <w:r>
-        <w:rPr>
-          <w:rFonts w:ascii="Arial" w:eastAsiaTheme="minorEastAsia" w:hAnsi="Arial" w:cs="Arial" w:hint="eastAsia"/>
-          <w:b/>
-          <w:bCs/>
-          <w:szCs w:val="21"/>
-          <w:lang w:eastAsia="zh-CN"/>
-        </w:rPr>
-        <w:t xml:space="preserve"> (</w:t>
-      </w:r>
-      <w:r>
-        <w:rPr>
-          <w:rFonts w:ascii="Arial" w:eastAsiaTheme="minorEastAsia" w:hAnsi="Arial" w:cs="Arial" w:hint="eastAsia"/>
-          <w:b/>
-          <w:bCs/>
-          <w:szCs w:val="21"/>
-          <w:lang w:eastAsia="zh-CN"/>
-        </w:rPr>
-        <w:t>Under review</w:t>
-      </w:r>
-      <w:r>
-        <w:rPr>
-          <w:rFonts w:ascii="Arial" w:eastAsiaTheme="minorEastAsia" w:hAnsi="Arial" w:cs="Arial" w:hint="eastAsia"/>
-          <w:b/>
-          <w:bCs/>
-          <w:szCs w:val="21"/>
-          <w:lang w:eastAsia="zh-CN"/>
-        </w:rPr>
-        <w:t>)</w:t>
-      </w:r>
-      <w:r>
-        <w:rPr>
-          <w:rFonts w:ascii="Arial" w:eastAsiaTheme="minorEastAsia" w:hAnsi="Arial" w:cs="Arial" w:hint="eastAsia"/>
-          <w:szCs w:val="21"/>
-          <w:lang w:eastAsia="zh-CN"/>
-        </w:rPr>
-        <w:t xml:space="preserve"> </w:t>
-      </w:r>
-      <w:r>
-        <w:rPr>
-          <w:rFonts w:ascii="Arial" w:eastAsiaTheme="minorEastAsia" w:hAnsi="Arial" w:cs="Arial"/>
-          <w:szCs w:val="21"/>
-          <w:lang w:eastAsia="zh-CN"/>
-        </w:rPr>
-        <w:t>Successor representation supports structural learning of syllable sequences</w:t>
-      </w:r>
-      <w:r>
-        <w:rPr>
-          <w:rFonts w:ascii="Arial" w:eastAsiaTheme="minorEastAsia" w:hAnsi="Arial" w:cs="Arial" w:hint="eastAsia"/>
-          <w:szCs w:val="21"/>
-          <w:lang w:eastAsia="zh-CN"/>
-        </w:rPr>
-        <w:t xml:space="preserve">. </w:t>
-      </w:r>
-      <w:r>
-        <w:rPr>
-          <w:rFonts w:ascii="Arial" w:eastAsiaTheme="minorEastAsia" w:hAnsi="Arial" w:cs="Arial" w:hint="eastAsia"/>
-          <w:szCs w:val="21"/>
-          <w:lang w:eastAsia="zh-CN"/>
-        </w:rPr>
-        <w:t>[</w:t>
-      </w:r>
-      <w:r>
-        <w:rPr>
-          <w:rFonts w:ascii="Arial" w:eastAsiaTheme="minorEastAsia" w:hAnsi="Arial" w:cs="Arial" w:hint="eastAsia"/>
-          <w:szCs w:val="21"/>
-          <w:lang w:eastAsia="zh-CN"/>
-        </w:rPr>
-        <w:t>Co-corresponding author</w:t>
-      </w:r>
-      <w:r>
-        <w:rPr>
-          <w:rFonts w:ascii="Arial" w:eastAsiaTheme="minorEastAsia" w:hAnsi="Arial" w:cs="Arial" w:hint="eastAsia"/>
-          <w:szCs w:val="21"/>
-          <w:lang w:eastAsia="zh-CN"/>
-        </w:rPr>
-        <w:t>]</w:t>
-      </w:r>
-    </w:p>
-    <w:p>
-      <w:pPr>
-        <w:pBdr>
-          <w:bottom w:val="single" w:sz="12" w:space="1" w:color="auto"/>
-        </w:pBdr>
-        <w:tabs>
-          <w:tab w:val="left" w:pos="0"/>
-        </w:tabs>
-        <w:jc w:val="both"/>
-        <w:rPr>
-          <w:rFonts w:ascii="Arial" w:hAnsi="Arial" w:cs="Arial"/>
-          <w:b/>
-          <w:sz w:val="22"/>
-          <w:szCs w:val="22"/>
-        </w:rPr>
-      </w:pPr>
-      <w:r>
-        <w:rPr>
-          <w:rFonts w:ascii="Arial" w:hAnsi="Arial" w:cs="Arial"/>
-          <w:b/>
-          <w:sz w:val="28"/>
-          <w:szCs w:val="28"/>
-        </w:rPr>
-        <w:t>M</w:t>
-      </w:r>
-      <w:r>
-        <w:rPr>
-          <w:rFonts w:ascii="Arial" w:hAnsi="Arial" w:cs="Arial"/>
-          <w:b/>
-          <w:sz w:val="22"/>
-          <w:szCs w:val="22"/>
-        </w:rPr>
-        <w:t xml:space="preserve">ANUSCRIPTS </w:t>
-      </w:r>
-      <w:r>
-        <w:rPr>
-          <w:rFonts w:ascii="Arial" w:hAnsi="Arial" w:cs="Arial"/>
-          <w:b/>
-          <w:sz w:val="22"/>
-          <w:szCs w:val="22"/>
-        </w:rPr>
         <w:t xml:space="preserve">IN </w:t>
       </w:r>
       <w:r>
@@ -4302,21 +4714,7 @@
         <w:rPr>
           <w:rFonts w:ascii="Arial" w:hAnsi="Arial" w:cs="Arial"/>
         </w:rPr>
-        <w:t xml:space="preserve">Earle-Richardson, A. M., Grant, G., Zafar, M., </w:t>
-      </w:r>
-      <w:proofErr w:type="spellStart"/>
-      <w:r>
-        <w:rPr>
-          <w:rFonts w:ascii="Arial" w:hAnsi="Arial" w:cs="Arial"/>
-        </w:rPr>
-        <w:t>Frauscher</w:t>
-      </w:r>
-      <w:proofErr w:type="spellEnd"/>
-      <w:r>
-        <w:rPr>
-          <w:rFonts w:ascii="Arial" w:hAnsi="Arial" w:cs="Arial"/>
-        </w:rPr>
-        <w:t>, B., Southwell, D., Hickok, G.</w:t>
+        <w:t>Earle-Richardson, A. M., Grant, G., Zafar, M., Frauscher, B., Southwell, D., Hickok, G.</w:t>
       </w:r>
       <w:r>
         <w:rPr>
@@ -4560,25 +4958,7 @@
           <w:b/>
           <w:bCs/>
         </w:rPr>
-        <w:t xml:space="preserve">he 4th </w:t>
-      </w:r>
-      <w:proofErr w:type="spellStart"/>
-      <w:r>
-        <w:rPr>
-          <w:rFonts w:ascii="Arial" w:hAnsi="Arial" w:cs="Arial"/>
-          <w:b/>
-          <w:bCs/>
-        </w:rPr>
-        <w:t>lEEE</w:t>
-      </w:r>
-      <w:proofErr w:type="spellEnd"/>
-      <w:r>
-        <w:rPr>
-          <w:rFonts w:ascii="Arial" w:hAnsi="Arial" w:cs="Arial"/>
-          <w:b/>
-          <w:bCs/>
-        </w:rPr>
-        <w:t xml:space="preserve"> EMBS International Summer School of Neural Engineering</w:t>
+        <w:t>he 4th lEEE EMBS International Summer School of Neural Engineering</w:t>
       </w:r>
       <w:r>
         <w:rPr>
@@ -4692,15 +5072,16 @@
         <w:contextualSpacing w:val="0"/>
         <w:jc w:val="both"/>
         <w:rPr>
-          <w:rFonts w:ascii="Arial" w:hAnsi="Arial" w:cs="Arial"/>
-        </w:rPr>
-      </w:pPr>
-      <w:r>
-        <w:rPr>
-          <w:rFonts w:ascii="Arial" w:eastAsiaTheme="minorEastAsia" w:hAnsi="Arial" w:cs="Arial" w:hint="eastAsia"/>
-          <w:b/>
-          <w:lang w:eastAsia="zh-CN"/>
-        </w:rPr>
+          <w:rFonts w:ascii="Arial" w:hAnsi="Arial" w:cs="Arial" w:hint="eastAsia"/>
+        </w:rPr>
+      </w:pPr>
+      <w:r>
+        <w:rPr>
+          <w:rFonts w:ascii="Arial" w:eastAsiaTheme="minorEastAsia" w:hAnsi="Arial" w:cs="Arial" w:hint="eastAsia"/>
+          <w:b/>
+          <w:lang w:eastAsia="zh-CN"/>
+        </w:rPr>
+        <w:lastRenderedPageBreak/>
         <w:t>National Scholarship (</w:t>
       </w:r>
       <w:r>
@@ -4778,7 +5159,7 @@
         <w:contextualSpacing/>
         <w:jc w:val="both"/>
         <w:rPr>
-          <w:rFonts w:ascii="Arial" w:hAnsi="Arial" w:cs="Arial"/>
+          <w:rFonts w:ascii="Arial" w:hAnsi="Arial" w:cs="Arial" w:hint="eastAsia"/>
           <w:sz w:val="22"/>
           <w:szCs w:val="22"/>
         </w:rPr>
@@ -4874,6 +5255,174 @@
       <w:r>
         <w:rPr>
           <w:rFonts w:ascii="Arial" w:hAnsi="Arial" w:cs="Arial"/>
+          <w:sz w:val="22"/>
+          <w:szCs w:val="22"/>
+        </w:rPr>
+        <w:t>Wang, Y.</w:t>
+      </w:r>
+      <w:r>
+        <w:rPr>
+          <w:rFonts w:ascii="Arial" w:hAnsi="Arial" w:cs="Arial"/>
+          <w:sz w:val="22"/>
+          <w:szCs w:val="22"/>
+          <w:vertAlign w:val="superscript"/>
+        </w:rPr>
+        <w:t>#</w:t>
+      </w:r>
+      <w:r>
+        <w:rPr>
+          <w:rFonts w:ascii="Arial" w:hAnsi="Arial" w:cs="Arial"/>
+          <w:sz w:val="22"/>
+          <w:szCs w:val="22"/>
+        </w:rPr>
+        <w:t>, Yu, K.</w:t>
+      </w:r>
+      <w:r>
+        <w:rPr>
+          <w:rFonts w:ascii="Arial" w:hAnsi="Arial" w:cs="Arial"/>
+          <w:sz w:val="22"/>
+          <w:szCs w:val="22"/>
+          <w:vertAlign w:val="superscript"/>
+        </w:rPr>
+        <w:t>#</w:t>
+      </w:r>
+      <w:r>
+        <w:rPr>
+          <w:rFonts w:ascii="Arial" w:hAnsi="Arial" w:cs="Arial"/>
+          <w:sz w:val="22"/>
+          <w:szCs w:val="22"/>
+        </w:rPr>
+        <w:t xml:space="preserve">, Yin, S., </w:t>
+      </w:r>
+      <w:r>
+        <w:rPr>
+          <w:rFonts w:ascii="Arial" w:hAnsi="Arial" w:cs="Arial"/>
+          <w:b/>
+          <w:bCs/>
+          <w:sz w:val="22"/>
+          <w:szCs w:val="22"/>
+        </w:rPr>
+        <w:t>Liang, B.</w:t>
+      </w:r>
+      <w:r>
+        <w:rPr>
+          <w:rFonts w:ascii="Arial" w:hAnsi="Arial" w:cs="Arial"/>
+          <w:sz w:val="22"/>
+          <w:szCs w:val="22"/>
+        </w:rPr>
+        <w:t>*, Wang, R.* (2026). Theta and gamma transcranial alternating current stimulation (tACS) modulate Mandarin consonant and lexical tone perception</w:t>
+      </w:r>
+      <w:r>
+        <w:rPr>
+          <w:rFonts w:ascii="Arial" w:hAnsi="Arial" w:cs="Arial" w:hint="eastAsia"/>
+          <w:sz w:val="22"/>
+          <w:szCs w:val="22"/>
+        </w:rPr>
+        <w:t xml:space="preserve"> (poster)</w:t>
+      </w:r>
+      <w:r>
+        <w:rPr>
+          <w:rFonts w:ascii="Arial" w:hAnsi="Arial" w:cs="Arial"/>
+          <w:sz w:val="22"/>
+          <w:szCs w:val="22"/>
+        </w:rPr>
+        <w:t xml:space="preserve">. </w:t>
+      </w:r>
+      <w:r>
+        <w:rPr>
+          <w:rFonts w:ascii="Arial" w:hAnsi="Arial" w:cs="Arial"/>
+          <w:i/>
+          <w:iCs/>
+          <w:sz w:val="22"/>
+          <w:szCs w:val="22"/>
+        </w:rPr>
+        <w:t>Society for the Neurobiology of Language Annual Meeting 202</w:t>
+      </w:r>
+      <w:r>
+        <w:rPr>
+          <w:rFonts w:ascii="Arial" w:hAnsi="Arial" w:cs="Arial" w:hint="eastAsia"/>
+          <w:i/>
+          <w:iCs/>
+          <w:sz w:val="22"/>
+          <w:szCs w:val="22"/>
+        </w:rPr>
+        <w:t>6</w:t>
+      </w:r>
+      <w:r>
+        <w:rPr>
+          <w:rFonts w:ascii="Arial" w:hAnsi="Arial" w:cs="Arial" w:hint="eastAsia"/>
+          <w:sz w:val="22"/>
+          <w:szCs w:val="22"/>
+        </w:rPr>
+        <w:t xml:space="preserve">. </w:t>
+      </w:r>
+      <w:r>
+        <w:rPr>
+          <w:rFonts w:ascii="Arial" w:hAnsi="Arial" w:cs="Arial"/>
+          <w:sz w:val="22"/>
+          <w:szCs w:val="22"/>
+        </w:rPr>
+        <w:t>Geneva, Switzerland</w:t>
+      </w:r>
+      <w:r>
+        <w:rPr>
+          <w:rFonts w:ascii="Arial" w:hAnsi="Arial" w:cs="Arial" w:hint="eastAsia"/>
+          <w:sz w:val="22"/>
+          <w:szCs w:val="22"/>
+        </w:rPr>
+        <w:t xml:space="preserve">, </w:t>
+      </w:r>
+      <w:r>
+        <w:rPr>
+          <w:rFonts w:ascii="Arial" w:hAnsi="Arial" w:cs="Arial"/>
+          <w:sz w:val="22"/>
+          <w:szCs w:val="22"/>
+        </w:rPr>
+        <w:t xml:space="preserve">September </w:t>
+      </w:r>
+      <w:r>
+        <w:rPr>
+          <w:rFonts w:ascii="Arial" w:hAnsi="Arial" w:cs="Arial" w:hint="eastAsia"/>
+          <w:sz w:val="22"/>
+          <w:szCs w:val="22"/>
+        </w:rPr>
+        <w:t>202</w:t>
+      </w:r>
+      <w:r>
+        <w:rPr>
+          <w:rFonts w:ascii="Arial" w:hAnsi="Arial" w:cs="Arial" w:hint="eastAsia"/>
+          <w:sz w:val="22"/>
+          <w:szCs w:val="22"/>
+        </w:rPr>
+        <w:t>6</w:t>
+      </w:r>
+      <w:r>
+        <w:rPr>
+          <w:rFonts w:ascii="Arial" w:hAnsi="Arial" w:cs="Arial" w:hint="eastAsia"/>
+          <w:sz w:val="22"/>
+          <w:szCs w:val="22"/>
+        </w:rPr>
+        <w:t>.</w:t>
+      </w:r>
+    </w:p>
+    <w:p>
+      <w:pPr>
+        <w:numPr>
+          <w:ilvl w:val="0"/>
+          <w:numId w:val="3"/>
+        </w:numPr>
+        <w:spacing w:before="120" w:after="120" w:line="276" w:lineRule="auto"/>
+        <w:ind w:left="357" w:hanging="357"/>
+        <w:jc w:val="both"/>
+        <w:rPr>
+          <w:rFonts w:ascii="Arial" w:hAnsi="Arial" w:cs="Arial"/>
+          <w:sz w:val="22"/>
+          <w:szCs w:val="22"/>
+        </w:rPr>
+      </w:pPr>
+      <w:r>
+        <w:rPr>
+          <w:rFonts w:ascii="Arial" w:hAnsi="Arial" w:cs="Arial"/>
           <w:b/>
           <w:bCs/>
           <w:sz w:val="22"/>
@@ -4887,25 +5436,7 @@
           <w:sz w:val="22"/>
           <w:szCs w:val="22"/>
         </w:rPr>
-        <w:t xml:space="preserve">Earle-Richardson, A. M., Grant, G., Zafar, M., </w:t>
-      </w:r>
-      <w:proofErr w:type="spellStart"/>
-      <w:r>
-        <w:rPr>
-          <w:rFonts w:ascii="Arial" w:hAnsi="Arial" w:cs="Arial"/>
-          <w:sz w:val="22"/>
-          <w:szCs w:val="22"/>
-        </w:rPr>
-        <w:t>Frauscher</w:t>
-      </w:r>
-      <w:proofErr w:type="spellEnd"/>
-      <w:r>
-        <w:rPr>
-          <w:rFonts w:ascii="Arial" w:hAnsi="Arial" w:cs="Arial"/>
-          <w:sz w:val="22"/>
-          <w:szCs w:val="22"/>
-        </w:rPr>
-        <w:t>, B., Southwell, D., Hickok, G.</w:t>
+        <w:t>Earle-Richardson, A. M., Grant, G., Zafar, M., Frauscher, B., Southwell, D., Hickok, G.</w:t>
       </w:r>
       <w:r>
         <w:rPr>
@@ -5082,7 +5613,6 @@
           <w:i/>
           <w:iCs/>
         </w:rPr>
-        <w:lastRenderedPageBreak/>
         <w:t>Advances and Perspectives in Auditory Neuroscience</w:t>
       </w:r>
       <w:r>
@@ -5674,16 +6204,7 @@
           <w:sz w:val="22"/>
           <w:szCs w:val="22"/>
         </w:rPr>
-        <w:t xml:space="preserve">ausal involvement of auditory-motor low-frequency oscillation coupling in sentence perception under noisy conditions: a </w:t>
-      </w:r>
-      <w:proofErr w:type="spellStart"/>
-      <w:r>
-        <w:rPr>
-          <w:rFonts w:ascii="Arial" w:hAnsi="Arial" w:cs="Arial"/>
-          <w:sz w:val="22"/>
-          <w:szCs w:val="22"/>
-        </w:rPr>
-        <w:t>t</w:t>
+        <w:t>ausal involvement of auditory-motor low-frequency oscillation coupling in sentence perception under noisy conditions: a t</w:t>
       </w:r>
       <w:r>
         <w:rPr>
@@ -5693,7 +6214,6 @@
         </w:rPr>
         <w:t>ACS</w:t>
       </w:r>
-      <w:proofErr w:type="spellEnd"/>
       <w:r>
         <w:rPr>
           <w:rFonts w:ascii="Arial" w:hAnsi="Arial" w:cs="Arial"/>
@@ -6221,33 +6741,7 @@
           <w:sz w:val="22"/>
           <w:szCs w:val="22"/>
         </w:rPr>
-        <w:t xml:space="preserve">Acta </w:t>
-      </w:r>
-      <w:proofErr w:type="spellStart"/>
-      <w:r>
-        <w:rPr>
-          <w:rFonts w:ascii="Arial" w:hAnsi="Arial" w:cs="Arial"/>
-          <w:b/>
-          <w:bCs/>
-          <w:i/>
-          <w:iCs/>
-          <w:sz w:val="22"/>
-          <w:szCs w:val="22"/>
-        </w:rPr>
-        <w:t>Psychologica</w:t>
-      </w:r>
-      <w:proofErr w:type="spellEnd"/>
-      <w:r>
-        <w:rPr>
-          <w:rFonts w:ascii="Arial" w:hAnsi="Arial" w:cs="Arial"/>
-          <w:b/>
-          <w:bCs/>
-          <w:i/>
-          <w:iCs/>
-          <w:sz w:val="22"/>
-          <w:szCs w:val="22"/>
-        </w:rPr>
-        <w:t xml:space="preserve"> Sinica</w:t>
+        <w:t>Acta Psychologica Sinica</w:t>
       </w:r>
       <w:r>
         <w:rPr>
@@ -6296,6 +6790,26 @@
         <w:jc w:val="both"/>
         <w:rPr>
           <w:rFonts w:ascii="Arial" w:eastAsia="KaiTi" w:hAnsi="Arial" w:cs="Arial"/>
+          <w:szCs w:val="21"/>
+        </w:rPr>
+      </w:pPr>
+    </w:p>
+    <w:p>
+      <w:pPr>
+        <w:spacing w:before="120" w:after="120" w:line="276" w:lineRule="auto"/>
+        <w:jc w:val="both"/>
+        <w:rPr>
+          <w:rFonts w:ascii="Arial" w:eastAsia="KaiTi" w:hAnsi="Arial" w:cs="Arial"/>
+          <w:szCs w:val="21"/>
+        </w:rPr>
+      </w:pPr>
+    </w:p>
+    <w:p>
+      <w:pPr>
+        <w:spacing w:before="120" w:after="120" w:line="276" w:lineRule="auto"/>
+        <w:jc w:val="both"/>
+        <w:rPr>
+          <w:rFonts w:ascii="Arial" w:eastAsia="KaiTi" w:hAnsi="Arial" w:cs="Arial" w:hint="eastAsia"/>
           <w:szCs w:val="21"/>
         </w:rPr>
       </w:pPr>
@@ -6323,6 +6837,7 @@
           <w:sz w:val="28"/>
           <w:szCs w:val="28"/>
         </w:rPr>
+        <w:lastRenderedPageBreak/>
         <w:t>T</w:t>
       </w:r>
       <w:r>
@@ -6390,21 +6905,12 @@
           <w:rFonts w:ascii="Arial" w:eastAsia="SimSun" w:hAnsi="Arial" w:cs="Arial"/>
         </w:rPr>
       </w:pPr>
-      <w:proofErr w:type="spellStart"/>
       <w:r>
         <w:rPr>
           <w:rFonts w:ascii="Arial" w:eastAsia="SimSun" w:hAnsi="Arial" w:cs="Arial" w:hint="eastAsia"/>
           <w:lang w:eastAsia="zh-CN"/>
         </w:rPr>
-        <w:t>Matlab</w:t>
-      </w:r>
-      <w:proofErr w:type="spellEnd"/>
-      <w:r>
-        <w:rPr>
-          <w:rFonts w:ascii="Arial" w:eastAsia="SimSun" w:hAnsi="Arial" w:cs="Arial" w:hint="eastAsia"/>
-          <w:lang w:eastAsia="zh-CN"/>
-        </w:rPr>
-        <w:t xml:space="preserve">, Python, R, </w:t>
+        <w:t xml:space="preserve">Matlab, Python, R, </w:t>
       </w:r>
       <w:r>
         <w:rPr>
@@ -6557,33 +7063,8 @@
           <w:rFonts w:ascii="Arial" w:eastAsia="SimSun" w:hAnsi="Arial" w:cs="Arial" w:hint="eastAsia"/>
           <w:lang w:eastAsia="zh-CN"/>
         </w:rPr>
-        <w:t xml:space="preserve">Acoustic processing and feature extractions by </w:t>
-      </w:r>
-      <w:proofErr w:type="spellStart"/>
-      <w:r>
-        <w:rPr>
-          <w:rFonts w:ascii="Arial" w:eastAsia="SimSun" w:hAnsi="Arial" w:cs="Arial" w:hint="eastAsia"/>
-          <w:lang w:eastAsia="zh-CN"/>
-        </w:rPr>
-        <w:t>Praat</w:t>
-      </w:r>
-      <w:proofErr w:type="spellEnd"/>
-      <w:r>
-        <w:rPr>
-          <w:rFonts w:ascii="Arial" w:eastAsia="SimSun" w:hAnsi="Arial" w:cs="Arial" w:hint="eastAsia"/>
-          <w:lang w:eastAsia="zh-CN"/>
-        </w:rPr>
-        <w:t>/</w:t>
-      </w:r>
-      <w:proofErr w:type="spellStart"/>
-      <w:r>
-        <w:rPr>
-          <w:rFonts w:ascii="Arial" w:eastAsia="SimSun" w:hAnsi="Arial" w:cs="Arial" w:hint="eastAsia"/>
-          <w:lang w:eastAsia="zh-CN"/>
-        </w:rPr>
-        <w:t>Matlab</w:t>
-      </w:r>
-      <w:proofErr w:type="spellEnd"/>
+        <w:t>Acoustic processing and feature extractions by Praat/Matlab</w:t>
+      </w:r>
       <w:r>
         <w:rPr>
           <w:rFonts w:ascii="Arial" w:eastAsia="SimSun" w:hAnsi="Arial" w:cs="Arial" w:hint="eastAsia"/>
@@ -6689,7 +7170,6 @@
         <w:rPr>
           <w:rFonts w:ascii="Arial" w:hAnsi="Arial" w:cs="Arial"/>
         </w:rPr>
-        <w:lastRenderedPageBreak/>
         <w:t xml:space="preserve">Transcranial </w:t>
       </w:r>
       <w:r>
@@ -6731,23 +7211,7 @@
           <w:rFonts w:ascii="Arial" w:eastAsiaTheme="minorEastAsia" w:hAnsi="Arial" w:cs="Arial" w:hint="eastAsia"/>
           <w:lang w:eastAsia="zh-CN"/>
         </w:rPr>
-        <w:t xml:space="preserve"> (</w:t>
-      </w:r>
-      <w:proofErr w:type="spellStart"/>
-      <w:r>
-        <w:rPr>
-          <w:rFonts w:ascii="Arial" w:eastAsiaTheme="minorEastAsia" w:hAnsi="Arial" w:cs="Arial" w:hint="eastAsia"/>
-          <w:lang w:eastAsia="zh-CN"/>
-        </w:rPr>
-        <w:t>tES</w:t>
-      </w:r>
-      <w:proofErr w:type="spellEnd"/>
-      <w:r>
-        <w:rPr>
-          <w:rFonts w:ascii="Arial" w:eastAsiaTheme="minorEastAsia" w:hAnsi="Arial" w:cs="Arial" w:hint="eastAsia"/>
-          <w:lang w:eastAsia="zh-CN"/>
-        </w:rPr>
-        <w:t xml:space="preserve">) </w:t>
+        <w:t xml:space="preserve"> (tES) </w:t>
       </w:r>
       <w:r>
         <w:rPr>
@@ -8309,6 +8773,7 @@
   <w:style w:type="character" w:default="1" w:styleId="DefaultParagraphFont">
     <w:name w:val="Default Paragraph Font"/>
     <w:uiPriority w:val="1"/>
+    <w:semiHidden/>
     <w:unhideWhenUsed/>
   </w:style>
   <w:style w:type="table" w:default="1" w:styleId="TableNormal">

</xml_diff>